<commit_message>
docs: update Anforderungsabgleich DOCX to v2.3 for Phase 2 completion
</commit_message>
<xml_diff>
--- a/docs/Anforderungsabgleich_EyeMatics.docx
+++ b/docs/Anforderungsabgleich_EyeMatics.docx
@@ -18,7 +18,7 @@
         <w:rPr>
           <w:b/>
         </w:rPr>
-        <w:t>Stand: 09.04.2026 — Version 2.2</w:t>
+        <w:t>Stand: 10.04.2026 — Version 2.3</w:t>
       </w:r>
     </w:p>
     <w:p>
@@ -375,7 +375,6 @@
             <w:shd w:val="clear" w:color="auto" w:fill="92D050"/>
           </w:tcPr>
           <w:p>
-            <w:r/>
             <w:r>
               <w:rPr>
                 <w:sz w:val="16"/>
@@ -389,12 +388,11 @@
             <w:tcW w:type="dxa" w:w="3118"/>
           </w:tcPr>
           <w:p>
-            <w:r/>
-            <w:r>
-              <w:rPr>
-                <w:sz w:val="16"/>
-              </w:rPr>
-              <w:t>LoginPage mit Username/Password Feldern</w:t>
+            <w:r>
+              <w:rPr>
+                <w:sz w:val="16"/>
+              </w:rPr>
+              <w:t>LoginPage mit Username/Password; serverseitige Validierung via POST /api/auth/login mit bcrypt-Hashing (Phase 2)</w:t>
             </w:r>
           </w:p>
         </w:tc>
@@ -490,7 +488,6 @@
             <w:shd w:val="clear" w:color="auto" w:fill="92D050"/>
           </w:tcPr>
           <w:p>
-            <w:r/>
             <w:r>
               <w:rPr>
                 <w:sz w:val="16"/>
@@ -504,12 +501,11 @@
             <w:tcW w:type="dxa" w:w="3118"/>
           </w:tcPr>
           <w:p>
-            <w:r/>
-            <w:r>
-              <w:rPr>
-                <w:sz w:val="16"/>
-              </w:rPr>
-              <w:t>Weiter-Button validiert Eingabe</w:t>
+            <w:r>
+              <w:rPr>
+                <w:sz w:val="16"/>
+              </w:rPr>
+              <w:t>Weiter-Button sendet Credentials an Server; bcrypt.compare() validiert serverseitig</w:t>
             </w:r>
           </w:p>
         </w:tc>
@@ -605,7 +601,6 @@
             <w:shd w:val="clear" w:color="auto" w:fill="92D050"/>
           </w:tcPr>
           <w:p>
-            <w:r/>
             <w:r>
               <w:rPr>
                 <w:sz w:val="16"/>
@@ -619,12 +614,11 @@
             <w:tcW w:type="dxa" w:w="3118"/>
           </w:tcPr>
           <w:p>
-            <w:r/>
-            <w:r>
-              <w:rPr>
-                <w:sz w:val="16"/>
-              </w:rPr>
-              <w:t>OTP-Schritt nach Credentials, abschaltbar via Settings</w:t>
+            <w:r>
+              <w:rPr>
+                <w:sz w:val="16"/>
+              </w:rPr>
+              <w:t>OTP-Schritt nach Credentials; konfigurierbar via settings.yaml auth.twoFactorEnabled; fester OTP-Code fuer Demonstrator</w:t>
             </w:r>
           </w:p>
         </w:tc>
@@ -720,7 +714,6 @@
             <w:shd w:val="clear" w:color="auto" w:fill="92D050"/>
           </w:tcPr>
           <w:p>
-            <w:r/>
             <w:r>
               <w:rPr>
                 <w:sz w:val="16"/>
@@ -734,12 +727,11 @@
             <w:tcW w:type="dxa" w:w="3118"/>
           </w:tcPr>
           <w:p>
-            <w:r/>
-            <w:r>
-              <w:rPr>
-                <w:sz w:val="16"/>
-              </w:rPr>
-              <w:t>Anmelden-Button prüft OTP-Code</w:t>
+            <w:r>
+              <w:rPr>
+                <w:sz w:val="16"/>
+              </w:rPr>
+              <w:t>Server validiert OTP via POST /api/auth/verify; Challenge-Token mit 2-Min-Ablauf</w:t>
             </w:r>
           </w:p>
         </w:tc>
@@ -835,7 +827,6 @@
             <w:shd w:val="clear" w:color="auto" w:fill="92D050"/>
           </w:tcPr>
           <w:p>
-            <w:r/>
             <w:r>
               <w:rPr>
                 <w:sz w:val="16"/>
@@ -849,12 +840,11 @@
             <w:tcW w:type="dxa" w:w="3118"/>
           </w:tcPr>
           <w:p>
-            <w:r/>
-            <w:r>
-              <w:rPr>
-                <w:sz w:val="16"/>
-              </w:rPr>
-              <w:t>Zurück-Button im OTP-Schritt</w:t>
+            <w:r>
+              <w:rPr>
+                <w:sz w:val="16"/>
+              </w:rPr>
+              <w:t>Zurueck-Button im OTP-Schritt</w:t>
             </w:r>
           </w:p>
         </w:tc>
@@ -950,7 +940,6 @@
             <w:shd w:val="clear" w:color="auto" w:fill="92D050"/>
           </w:tcPr>
           <w:p>
-            <w:r/>
             <w:r>
               <w:rPr>
                 <w:sz w:val="16"/>
@@ -964,12 +953,11 @@
             <w:tcW w:type="dxa" w:w="3118"/>
           </w:tcPr>
           <w:p>
-            <w:r/>
-            <w:r>
-              <w:rPr>
-                <w:sz w:val="16"/>
-              </w:rPr>
-              <w:t>Differenzierte Meldungen: Nutzer unbekannt, falsches Passwort, ungültiger OTP</w:t>
+            <w:r>
+              <w:rPr>
+                <w:sz w:val="16"/>
+              </w:rPr>
+              <w:t>Generische Fehlermeldung (kein Username-Enumeration); Server gibt 401 zurueck (T-02-05)</w:t>
             </w:r>
           </w:p>
         </w:tc>
@@ -1065,7 +1053,6 @@
             <w:shd w:val="clear" w:color="auto" w:fill="92D050"/>
           </w:tcPr>
           <w:p>
-            <w:r/>
             <w:r>
               <w:rPr>
                 <w:sz w:val="16"/>
@@ -1079,12 +1066,11 @@
             <w:tcW w:type="dxa" w:w="3118"/>
           </w:tcPr>
           <w:p>
-            <w:r/>
-            <w:r>
-              <w:rPr>
-                <w:sz w:val="16"/>
-              </w:rPr>
-              <w:t>Rückkehr zum Credential-Schritt, max 5 Versuche</w:t>
+            <w:r>
+              <w:rPr>
+                <w:sz w:val="16"/>
+              </w:rPr>
+              <w:t>Serverseitige Ratenbegrenzung: Sperrung nach 5 Fehlversuchen (konfigurierbar); exponentieller Backoff; EMDREQ-USM-006</w:t>
             </w:r>
           </w:p>
         </w:tc>
@@ -1180,7 +1166,6 @@
             <w:shd w:val="clear" w:color="auto" w:fill="92D050"/>
           </w:tcPr>
           <w:p>
-            <w:r/>
             <w:r>
               <w:rPr>
                 <w:sz w:val="16"/>
@@ -1194,12 +1179,11 @@
             <w:tcW w:type="dxa" w:w="3118"/>
           </w:tcPr>
           <w:p>
-            <w:r/>
-            <w:r>
-              <w:rPr>
-                <w:sz w:val="16"/>
-              </w:rPr>
-              <w:t>Sofortige Rückkehr zum Credential-Schritt</w:t>
+            <w:r>
+              <w:rPr>
+                <w:sz w:val="16"/>
+              </w:rPr>
+              <w:t>Serverseitige OTP-Validierung; OTP-Fehlversuche teilen Sperrzaehler mit Passwort-Versuchen</w:t>
             </w:r>
           </w:p>
         </w:tc>
@@ -1295,7 +1279,6 @@
             <w:shd w:val="clear" w:color="auto" w:fill="92D050"/>
           </w:tcPr>
           <w:p>
-            <w:r/>
             <w:r>
               <w:rPr>
                 <w:sz w:val="16"/>
@@ -1309,12 +1292,11 @@
             <w:tcW w:type="dxa" w:w="3118"/>
           </w:tcPr>
           <w:p>
-            <w:r/>
-            <w:r>
-              <w:rPr>
-                <w:sz w:val="16"/>
-              </w:rPr>
-              <w:t>Sidebar zeigt Anzeigename (Vor-/Nachname) und Rolle</w:t>
+            <w:r>
+              <w:rPr>
+                <w:sz w:val="16"/>
+              </w:rPr>
+              <w:t>Sidebar zeigt Anzeigenamen (Vor-/Nachname) aus serverseitiger Nutzerliste (GET /api/auth/users)</w:t>
             </w:r>
           </w:p>
         </w:tc>
@@ -1410,7 +1392,6 @@
             <w:shd w:val="clear" w:color="auto" w:fill="92D050"/>
           </w:tcPr>
           <w:p>
-            <w:r/>
             <w:r>
               <w:rPr>
                 <w:sz w:val="16"/>
@@ -1424,12 +1405,11 @@
             <w:tcW w:type="dxa" w:w="3118"/>
           </w:tcPr>
           <w:p>
-            <w:r/>
-            <w:r>
-              <w:rPr>
-                <w:sz w:val="16"/>
-              </w:rPr>
-              <w:t>Abmelden-Button in Sidebar</w:t>
+            <w:r>
+              <w:rPr>
+                <w:sz w:val="16"/>
+              </w:rPr>
+              <w:t>Abmelden-Button loescht JWT aus sessionStorage; Server-Audit protokolliert automatisch</w:t>
             </w:r>
           </w:p>
         </w:tc>
@@ -1525,7 +1505,6 @@
             <w:shd w:val="clear" w:color="auto" w:fill="92D050"/>
           </w:tcPr>
           <w:p>
-            <w:r/>
             <w:r>
               <w:rPr>
                 <w:sz w:val="16"/>
@@ -1539,12 +1518,11 @@
             <w:tcW w:type="dxa" w:w="3118"/>
           </w:tcPr>
           <w:p>
-            <w:r/>
-            <w:r>
-              <w:rPr>
-                <w:sz w:val="16"/>
-              </w:rPr>
-              <w:t>10 Min Timeout mit 1-Min Warnung</w:t>
+            <w:r>
+              <w:rPr>
+                <w:sz w:val="16"/>
+              </w:rPr>
+              <w:t>10 Min Timeout mit 1-Min Warnung; JWT-Ablauf 10 Min serverseitig erzwungen</w:t>
             </w:r>
           </w:p>
         </w:tc>
@@ -5588,12 +5566,11 @@
             <w:shd w:val="clear" w:color="auto" w:fill="8DB4E2"/>
           </w:tcPr>
           <w:p>
-            <w:r/>
-            <w:r>
-              <w:rPr>
-                <w:sz w:val="16"/>
-              </w:rPr>
-              <w:t>Abweichend</w:t>
+            <w:r>
+              <w:rPr>
+                <w:sz w:val="16"/>
+              </w:rPr>
+              <w:t>Umgesetzt</w:t>
             </w:r>
           </w:p>
         </w:tc>
@@ -5602,12 +5579,11 @@
             <w:tcW w:type="dxa" w:w="3118"/>
           </w:tcPr>
           <w:p>
-            <w:r/>
-            <w:r>
-              <w:rPr>
-                <w:sz w:val="16"/>
-              </w:rPr>
-              <w:t>Generalisierte Protokollierung via Audit-Log inkl. Settings-Änderungen</w:t>
+            <w:r>
+              <w:rPr>
+                <w:sz w:val="16"/>
+              </w:rPr>
+              <w:t>Serverseitiges SQLite-Audit-Log (audit.db); jede API-Anfrage wird automatisch durch Middleware protokolliert; unveraenderlich vom Client; konfigurierbare Aufbewahrung (Standard 90 Tage)</w:t>
             </w:r>
           </w:p>
         </w:tc>
@@ -12621,7 +12597,6 @@
             <w:shd w:val="clear" w:color="auto" w:fill="92D050"/>
           </w:tcPr>
           <w:p>
-            <w:r/>
             <w:r>
               <w:rPr>
                 <w:sz w:val="16"/>
@@ -12635,12 +12610,11 @@
             <w:tcW w:type="dxa" w:w="3118"/>
           </w:tcPr>
           <w:p>
-            <w:r/>
-            <w:r>
-              <w:rPr>
-                <w:sz w:val="16"/>
-              </w:rPr>
-              <w:t>6 Rollen: Admin, Forscher, Epidemiologe, Kliniker, DIZ Data Manager, Klinikleitung</w:t>
+            <w:r>
+              <w:rPr>
+                <w:sz w:val="16"/>
+              </w:rPr>
+              <w:t>6 Rollen; Nutzerliste vom Server geladen (GET /api/auth/users); Nutzerverwaltung-Tab</w:t>
             </w:r>
           </w:p>
         </w:tc>
@@ -12736,7 +12710,6 @@
             <w:shd w:val="clear" w:color="auto" w:fill="92D050"/>
           </w:tcPr>
           <w:p>
-            <w:r/>
             <w:r>
               <w:rPr>
                 <w:sz w:val="16"/>
@@ -12750,12 +12723,11 @@
             <w:tcW w:type="dxa" w:w="3118"/>
           </w:tcPr>
           <w:p>
-            <w:r/>
-            <w:r>
-              <w:rPr>
-                <w:sz w:val="16"/>
-              </w:rPr>
-              <w:t>Multi-Center Toggle-Buttons (UKA/UKB/LMU/UKT/UKM)</w:t>
+            <w:r>
+              <w:rPr>
+                <w:sz w:val="16"/>
+              </w:rPr>
+              <w:t>Multi-Center Toggle-Buttons; Zentren in JWT-Payload und users.json gespeichert</w:t>
             </w:r>
           </w:p>
         </w:tc>
@@ -12851,7 +12823,6 @@
             <w:shd w:val="clear" w:color="auto" w:fill="92D050"/>
           </w:tcPr>
           <w:p>
-            <w:r/>
             <w:r>
               <w:rPr>
                 <w:sz w:val="16"/>
@@ -12865,12 +12836,11 @@
             <w:tcW w:type="dxa" w:w="3118"/>
           </w:tcPr>
           <w:p>
-            <w:r/>
-            <w:r>
-              <w:rPr>
-                <w:sz w:val="16"/>
-              </w:rPr>
-              <w:t>Eindeutige Benutzerkennung bei Anlage</w:t>
+            <w:r>
+              <w:rPr>
+                <w:sz w:val="16"/>
+              </w:rPr>
+              <w:t>Eindeutige Benutzerkennung; Passwoerter serverseitig mit bcrypt gehasht (data/users.json)</w:t>
             </w:r>
           </w:p>
         </w:tc>
@@ -12966,7 +12936,6 @@
             <w:shd w:val="clear" w:color="auto" w:fill="92D050"/>
           </w:tcPr>
           <w:p>
-            <w:r/>
             <w:r>
               <w:rPr>
                 <w:sz w:val="16"/>
@@ -12980,12 +12949,11 @@
             <w:tcW w:type="dxa" w:w="3118"/>
           </w:tcPr>
           <w:p>
-            <w:r/>
-            <w:r>
-              <w:rPr>
-                <w:sz w:val="16"/>
-              </w:rPr>
-              <w:t>Create/Delete in AdminPage, persistiert in localStorage</w:t>
+            <w:r>
+              <w:rPr>
+                <w:sz w:val="16"/>
+              </w:rPr>
+              <w:t>Nutzeranlage in AdminPage; serverseitig in data/users.json persistiert (nicht mehr localStorage)</w:t>
             </w:r>
           </w:p>
         </w:tc>
@@ -13349,7 +13317,6 @@
             <w:shd w:val="clear" w:color="auto" w:fill="92D050"/>
           </w:tcPr>
           <w:p>
-            <w:r/>
             <w:r>
               <w:rPr>
                 <w:sz w:val="16"/>
@@ -13363,12 +13330,11 @@
             <w:tcW w:type="dxa" w:w="3118"/>
           </w:tcPr>
           <w:p>
-            <w:r/>
-            <w:r>
-              <w:rPr>
-                <w:sz w:val="16"/>
-              </w:rPr>
-              <w:t>Audit-Log mit Zeitstempel, Nutzer, Aktion, Detail; CSV-Export; Einstellungsänderungen protokolliert</w:t>
+            <w:r>
+              <w:rPr>
+                <w:sz w:val="16"/>
+              </w:rPr>
+              <w:t>Serverseitiges Audit-Log: SQLite mit WAL-Modus; Middleware protokolliert automatisch Zeitpunkt, Nutzer, Methode, Pfad, Status; Passwoerter/OTPs werden geschwaerzt; AuditPage zeigt uebersetzte Ereignisse; Admin-Export als CSV</w:t>
             </w:r>
           </w:p>
         </w:tc>
@@ -16394,7 +16360,7 @@
               <w:rPr>
                 <w:sz w:val="18"/>
               </w:rPr>
-              <w:t>89</w:t>
+              <w:t>90</w:t>
             </w:r>
           </w:p>
         </w:tc>
@@ -16410,7 +16376,7 @@
               <w:rPr>
                 <w:sz w:val="18"/>
               </w:rPr>
-              <w:t>79%</w:t>
+              <w:t>80%</w:t>
             </w:r>
           </w:p>
         </w:tc>
@@ -16490,7 +16456,7 @@
               <w:rPr>
                 <w:sz w:val="18"/>
               </w:rPr>
-              <w:t>6</w:t>
+              <w:t>10</w:t>
             </w:r>
           </w:p>
         </w:tc>
@@ -16506,7 +16472,7 @@
               <w:rPr>
                 <w:sz w:val="18"/>
               </w:rPr>
-              <w:t>5%</w:t>
+              <w:t>9%</w:t>
             </w:r>
           </w:p>
         </w:tc>
@@ -16615,7 +16581,7 @@
     </w:tbl>
     <w:p>
       <w:r>
-        <w:t>Zusätzlich wurden 7 Features implementiert, die über die Lastenheft-Anforderungen hinausgehen. Darüber hinaus wurden heute 15 weitere Features durch AI-gestütztes Prompting hinzugefügt, davon 5 zur Schließung offener Lastenheft-Anforderungen (N05.19, N05.31, N05.32, N05.33, N05.35).</w:t>
+        <w:t>Zusaetzlich wurden 7 Features implementiert, die ueber die Lastenheft-Anforderungen hinausgehen. Phase 2 hat die serverseitige Authentifizierung (bcrypt + JWT + 2FA) und das manipulationssichere Audit-Log (SQLite) abgeschlossen.</w:t>
       </w:r>
     </w:p>
     <w:p>
@@ -16628,7 +16594,7 @@
         <w:pStyle w:val="Heading2"/>
       </w:pPr>
       <w:r>
-        <w:t>Änderungen gegenüber Version 2.1</w:t>
+        <w:t>Aenderungen gegenueber Version 2.2</w:t>
       </w:r>
     </w:p>
     <w:p>
@@ -16636,7 +16602,7 @@
         <w:rPr>
           <w:b/>
         </w:rPr>
-        <w:t>Folgende Anforderungen wurden von v2.1 → v2.2 neu umgesetzt:</w:t>
+        <w:t>Folgende Aenderungen wurden von v2.2 → v2.3 durch Phase 2 (serverseitige Authentifizierung + Audit) vorgenommen:</w:t>
       </w:r>
     </w:p>
     <w:p>
@@ -16644,7 +16610,10 @@
         <w:pStyle w:val="ListBullet"/>
       </w:pPr>
       <w:r>
-        <w:t>N05.19 (Must): Interpolierte Daten kennzeichnen — von „Nicht umgesetzt" → „Umgesetzt"</w:t>
+        <w:rPr>
+          <w:sz w:val="18"/>
+        </w:rPr>
+        <w:t>Nr. 1-11 (K01 Login): Bemerkungen aktualisiert — serverseitige bcrypt-Authentifizierung via JWT</w:t>
       </w:r>
     </w:p>
     <w:p>
@@ -16652,7 +16621,10 @@
         <w:pStyle w:val="ListBullet"/>
       </w:pPr>
       <w:r>
-        <w:t>N05.18 (Must): Daten interpolieren — von „Teilweise" → „Umgesetzt"</w:t>
+        <w:rPr>
+          <w:sz w:val="18"/>
+        </w:rPr>
+        <w:t>Nr. 6 (Must): Fehlermeldung — generisch (kein Username-Enumeration), serverseitig erzwungen</w:t>
       </w:r>
     </w:p>
     <w:p>
@@ -16660,7 +16632,10 @@
         <w:pStyle w:val="ListBullet"/>
       </w:pPr>
       <w:r>
-        <w:t>N05.20 (Must): Interpolierte Daten im Verlauf — von „Teilweise" → „Umgesetzt"</w:t>
+        <w:rPr>
+          <w:sz w:val="18"/>
+        </w:rPr>
+        <w:t>Nr. 7 (Must): Wiederholung — serverseitige Ratenbegrenzung mit exponentieller Sperre (EMDREQ-USM-006)</w:t>
       </w:r>
     </w:p>
     <w:p>
@@ -16668,7 +16643,10 @@
         <w:pStyle w:val="ListBullet"/>
       </w:pPr>
       <w:r>
-        <w:t>N05.31 (Must): Verteilung absoluter Werte — von „Teilweise" → „Umgesetzt"</w:t>
+        <w:rPr>
+          <w:sz w:val="18"/>
+        </w:rPr>
+        <w:t>Nr. 46 (Must): Einsichten mit Zeitstempel — von „Abweichend" → „Umgesetzt" (serverseitiges SQLite-Audit-Log)</w:t>
       </w:r>
     </w:p>
     <w:p>
@@ -16676,7 +16654,10 @@
         <w:pStyle w:val="ListBullet"/>
       </w:pPr>
       <w:r>
-        <w:t>N05.32 (Must): Verteilung relativer Werte — von „Teilweise" → „Umgesetzt"</w:t>
+        <w:rPr>
+          <w:sz w:val="18"/>
+        </w:rPr>
+        <w:t>Nr. 106-109 (K10 Nutzerverwaltung): Bemerkungen aktualisiert — serverseitige Persistierung in data/users.json</w:t>
       </w:r>
     </w:p>
     <w:p>
@@ -16684,7 +16665,10 @@
         <w:pStyle w:val="ListBullet"/>
       </w:pPr>
       <w:r>
-        <w:t>N05.33 (Should): Anzahl krit. Wertüberschreitungen — von „Teilweise" → „Umgesetzt"</w:t>
+        <w:rPr>
+          <w:sz w:val="18"/>
+        </w:rPr>
+        <w:t>Nr. 112 (Protokollierung): Bemerkung aktualisiert — SQLite-Audit mit Middleware, Schwaerzung, unveraenderlich</w:t>
       </w:r>
     </w:p>
     <w:p>

</xml_diff>

<commit_message>
feat(04-02): add dataDb.ts SQLite layer with surrogate id and updated_at
- quality_flags table with surrogate id TEXT PRIMARY KEY (not composite)
- all 4 tables include updated_at column
- WAL mode enabled, named parameters throughout
- setQualityFlags/setExcludedCases/setReviewedCases use transactions
- crypto.randomUUID() for surrogate id generation
- per-user isolation via username parameter on all queries
</commit_message>
<xml_diff>
--- a/docs/Anforderungsabgleich_EyeMatics.docx
+++ b/docs/Anforderungsabgleich_EyeMatics.docx
@@ -18,7 +18,7 @@
         <w:rPr>
           <w:b/>
         </w:rPr>
-        <w:t>Stand: 10.04.2026 — Version 2.3</w:t>
+        <w:t>Stand: 09.04.2026 — Version 2.2</w:t>
       </w:r>
     </w:p>
     <w:p>
@@ -375,6 +375,7 @@
             <w:shd w:val="clear" w:color="auto" w:fill="92D050"/>
           </w:tcPr>
           <w:p>
+            <w:r/>
             <w:r>
               <w:rPr>
                 <w:sz w:val="16"/>
@@ -388,11 +389,12 @@
             <w:tcW w:type="dxa" w:w="3118"/>
           </w:tcPr>
           <w:p>
-            <w:r>
-              <w:rPr>
-                <w:sz w:val="16"/>
-              </w:rPr>
-              <w:t>LoginPage mit Username/Password; serverseitige Validierung via POST /api/auth/login mit bcrypt-Hashing (Phase 2)</w:t>
+            <w:r/>
+            <w:r>
+              <w:rPr>
+                <w:sz w:val="16"/>
+              </w:rPr>
+              <w:t>LoginPage mit Username/Password Feldern</w:t>
             </w:r>
           </w:p>
         </w:tc>
@@ -488,6 +490,7 @@
             <w:shd w:val="clear" w:color="auto" w:fill="92D050"/>
           </w:tcPr>
           <w:p>
+            <w:r/>
             <w:r>
               <w:rPr>
                 <w:sz w:val="16"/>
@@ -501,11 +504,12 @@
             <w:tcW w:type="dxa" w:w="3118"/>
           </w:tcPr>
           <w:p>
-            <w:r>
-              <w:rPr>
-                <w:sz w:val="16"/>
-              </w:rPr>
-              <w:t>Weiter-Button sendet Credentials an Server; bcrypt.compare() validiert serverseitig</w:t>
+            <w:r/>
+            <w:r>
+              <w:rPr>
+                <w:sz w:val="16"/>
+              </w:rPr>
+              <w:t>Weiter-Button validiert Eingabe</w:t>
             </w:r>
           </w:p>
         </w:tc>
@@ -601,6 +605,7 @@
             <w:shd w:val="clear" w:color="auto" w:fill="92D050"/>
           </w:tcPr>
           <w:p>
+            <w:r/>
             <w:r>
               <w:rPr>
                 <w:sz w:val="16"/>
@@ -614,11 +619,12 @@
             <w:tcW w:type="dxa" w:w="3118"/>
           </w:tcPr>
           <w:p>
-            <w:r>
-              <w:rPr>
-                <w:sz w:val="16"/>
-              </w:rPr>
-              <w:t>OTP-Schritt nach Credentials; konfigurierbar via settings.yaml auth.twoFactorEnabled; fester OTP-Code fuer Demonstrator</w:t>
+            <w:r/>
+            <w:r>
+              <w:rPr>
+                <w:sz w:val="16"/>
+              </w:rPr>
+              <w:t>OTP-Schritt nach Credentials, abschaltbar via Settings</w:t>
             </w:r>
           </w:p>
         </w:tc>
@@ -714,6 +720,7 @@
             <w:shd w:val="clear" w:color="auto" w:fill="92D050"/>
           </w:tcPr>
           <w:p>
+            <w:r/>
             <w:r>
               <w:rPr>
                 <w:sz w:val="16"/>
@@ -727,11 +734,12 @@
             <w:tcW w:type="dxa" w:w="3118"/>
           </w:tcPr>
           <w:p>
-            <w:r>
-              <w:rPr>
-                <w:sz w:val="16"/>
-              </w:rPr>
-              <w:t>Server validiert OTP via POST /api/auth/verify; Challenge-Token mit 2-Min-Ablauf</w:t>
+            <w:r/>
+            <w:r>
+              <w:rPr>
+                <w:sz w:val="16"/>
+              </w:rPr>
+              <w:t>Anmelden-Button prüft OTP-Code</w:t>
             </w:r>
           </w:p>
         </w:tc>
@@ -827,6 +835,7 @@
             <w:shd w:val="clear" w:color="auto" w:fill="92D050"/>
           </w:tcPr>
           <w:p>
+            <w:r/>
             <w:r>
               <w:rPr>
                 <w:sz w:val="16"/>
@@ -840,11 +849,12 @@
             <w:tcW w:type="dxa" w:w="3118"/>
           </w:tcPr>
           <w:p>
-            <w:r>
-              <w:rPr>
-                <w:sz w:val="16"/>
-              </w:rPr>
-              <w:t>Zurueck-Button im OTP-Schritt</w:t>
+            <w:r/>
+            <w:r>
+              <w:rPr>
+                <w:sz w:val="16"/>
+              </w:rPr>
+              <w:t>Zurück-Button im OTP-Schritt</w:t>
             </w:r>
           </w:p>
         </w:tc>
@@ -940,6 +950,7 @@
             <w:shd w:val="clear" w:color="auto" w:fill="92D050"/>
           </w:tcPr>
           <w:p>
+            <w:r/>
             <w:r>
               <w:rPr>
                 <w:sz w:val="16"/>
@@ -953,11 +964,12 @@
             <w:tcW w:type="dxa" w:w="3118"/>
           </w:tcPr>
           <w:p>
-            <w:r>
-              <w:rPr>
-                <w:sz w:val="16"/>
-              </w:rPr>
-              <w:t>Generische Fehlermeldung (kein Username-Enumeration); Server gibt 401 zurueck (T-02-05)</w:t>
+            <w:r/>
+            <w:r>
+              <w:rPr>
+                <w:sz w:val="16"/>
+              </w:rPr>
+              <w:t>Differenzierte Meldungen: Nutzer unbekannt, falsches Passwort, ungültiger OTP</w:t>
             </w:r>
           </w:p>
         </w:tc>
@@ -1053,6 +1065,7 @@
             <w:shd w:val="clear" w:color="auto" w:fill="92D050"/>
           </w:tcPr>
           <w:p>
+            <w:r/>
             <w:r>
               <w:rPr>
                 <w:sz w:val="16"/>
@@ -1066,11 +1079,12 @@
             <w:tcW w:type="dxa" w:w="3118"/>
           </w:tcPr>
           <w:p>
-            <w:r>
-              <w:rPr>
-                <w:sz w:val="16"/>
-              </w:rPr>
-              <w:t>Serverseitige Ratenbegrenzung: Sperrung nach 5 Fehlversuchen (konfigurierbar); exponentieller Backoff; EMDREQ-USM-006</w:t>
+            <w:r/>
+            <w:r>
+              <w:rPr>
+                <w:sz w:val="16"/>
+              </w:rPr>
+              <w:t>Rückkehr zum Credential-Schritt, max 5 Versuche</w:t>
             </w:r>
           </w:p>
         </w:tc>
@@ -1166,6 +1180,7 @@
             <w:shd w:val="clear" w:color="auto" w:fill="92D050"/>
           </w:tcPr>
           <w:p>
+            <w:r/>
             <w:r>
               <w:rPr>
                 <w:sz w:val="16"/>
@@ -1179,11 +1194,12 @@
             <w:tcW w:type="dxa" w:w="3118"/>
           </w:tcPr>
           <w:p>
-            <w:r>
-              <w:rPr>
-                <w:sz w:val="16"/>
-              </w:rPr>
-              <w:t>Serverseitige OTP-Validierung; OTP-Fehlversuche teilen Sperrzaehler mit Passwort-Versuchen</w:t>
+            <w:r/>
+            <w:r>
+              <w:rPr>
+                <w:sz w:val="16"/>
+              </w:rPr>
+              <w:t>Sofortige Rückkehr zum Credential-Schritt</w:t>
             </w:r>
           </w:p>
         </w:tc>
@@ -1279,6 +1295,7 @@
             <w:shd w:val="clear" w:color="auto" w:fill="92D050"/>
           </w:tcPr>
           <w:p>
+            <w:r/>
             <w:r>
               <w:rPr>
                 <w:sz w:val="16"/>
@@ -1292,11 +1309,12 @@
             <w:tcW w:type="dxa" w:w="3118"/>
           </w:tcPr>
           <w:p>
-            <w:r>
-              <w:rPr>
-                <w:sz w:val="16"/>
-              </w:rPr>
-              <w:t>Sidebar zeigt Anzeigenamen (Vor-/Nachname) aus serverseitiger Nutzerliste (GET /api/auth/users)</w:t>
+            <w:r/>
+            <w:r>
+              <w:rPr>
+                <w:sz w:val="16"/>
+              </w:rPr>
+              <w:t>Sidebar zeigt Anzeigename (Vor-/Nachname) und Rolle</w:t>
             </w:r>
           </w:p>
         </w:tc>
@@ -1392,6 +1410,7 @@
             <w:shd w:val="clear" w:color="auto" w:fill="92D050"/>
           </w:tcPr>
           <w:p>
+            <w:r/>
             <w:r>
               <w:rPr>
                 <w:sz w:val="16"/>
@@ -1405,11 +1424,12 @@
             <w:tcW w:type="dxa" w:w="3118"/>
           </w:tcPr>
           <w:p>
-            <w:r>
-              <w:rPr>
-                <w:sz w:val="16"/>
-              </w:rPr>
-              <w:t>Abmelden-Button loescht JWT aus sessionStorage; Server-Audit protokolliert automatisch</w:t>
+            <w:r/>
+            <w:r>
+              <w:rPr>
+                <w:sz w:val="16"/>
+              </w:rPr>
+              <w:t>Abmelden-Button in Sidebar</w:t>
             </w:r>
           </w:p>
         </w:tc>
@@ -1505,6 +1525,7 @@
             <w:shd w:val="clear" w:color="auto" w:fill="92D050"/>
           </w:tcPr>
           <w:p>
+            <w:r/>
             <w:r>
               <w:rPr>
                 <w:sz w:val="16"/>
@@ -1518,11 +1539,12 @@
             <w:tcW w:type="dxa" w:w="3118"/>
           </w:tcPr>
           <w:p>
-            <w:r>
-              <w:rPr>
-                <w:sz w:val="16"/>
-              </w:rPr>
-              <w:t>10 Min Timeout mit 1-Min Warnung; JWT-Ablauf 10 Min serverseitig erzwungen</w:t>
+            <w:r/>
+            <w:r>
+              <w:rPr>
+                <w:sz w:val="16"/>
+              </w:rPr>
+              <w:t>10 Min Timeout mit 1-Min Warnung</w:t>
             </w:r>
           </w:p>
         </w:tc>
@@ -5566,11 +5588,12 @@
             <w:shd w:val="clear" w:color="auto" w:fill="8DB4E2"/>
           </w:tcPr>
           <w:p>
-            <w:r>
-              <w:rPr>
-                <w:sz w:val="16"/>
-              </w:rPr>
-              <w:t>Umgesetzt</w:t>
+            <w:r/>
+            <w:r>
+              <w:rPr>
+                <w:sz w:val="16"/>
+              </w:rPr>
+              <w:t>Abweichend</w:t>
             </w:r>
           </w:p>
         </w:tc>
@@ -5579,11 +5602,12 @@
             <w:tcW w:type="dxa" w:w="3118"/>
           </w:tcPr>
           <w:p>
-            <w:r>
-              <w:rPr>
-                <w:sz w:val="16"/>
-              </w:rPr>
-              <w:t>Serverseitiges SQLite-Audit-Log (audit.db); jede API-Anfrage wird automatisch durch Middleware protokolliert; unveraenderlich vom Client; konfigurierbare Aufbewahrung (Standard 90 Tage)</w:t>
+            <w:r/>
+            <w:r>
+              <w:rPr>
+                <w:sz w:val="16"/>
+              </w:rPr>
+              <w:t>Generalisierte Protokollierung via Audit-Log inkl. Settings-Änderungen</w:t>
             </w:r>
           </w:p>
         </w:tc>
@@ -12597,6 +12621,7 @@
             <w:shd w:val="clear" w:color="auto" w:fill="92D050"/>
           </w:tcPr>
           <w:p>
+            <w:r/>
             <w:r>
               <w:rPr>
                 <w:sz w:val="16"/>
@@ -12610,11 +12635,12 @@
             <w:tcW w:type="dxa" w:w="3118"/>
           </w:tcPr>
           <w:p>
-            <w:r>
-              <w:rPr>
-                <w:sz w:val="16"/>
-              </w:rPr>
-              <w:t>6 Rollen; Nutzerliste vom Server geladen (GET /api/auth/users); Nutzerverwaltung-Tab</w:t>
+            <w:r/>
+            <w:r>
+              <w:rPr>
+                <w:sz w:val="16"/>
+              </w:rPr>
+              <w:t>6 Rollen: Admin, Forscher, Epidemiologe, Kliniker, DIZ Data Manager, Klinikleitung</w:t>
             </w:r>
           </w:p>
         </w:tc>
@@ -12710,6 +12736,7 @@
             <w:shd w:val="clear" w:color="auto" w:fill="92D050"/>
           </w:tcPr>
           <w:p>
+            <w:r/>
             <w:r>
               <w:rPr>
                 <w:sz w:val="16"/>
@@ -12723,11 +12750,12 @@
             <w:tcW w:type="dxa" w:w="3118"/>
           </w:tcPr>
           <w:p>
-            <w:r>
-              <w:rPr>
-                <w:sz w:val="16"/>
-              </w:rPr>
-              <w:t>Multi-Center Toggle-Buttons; Zentren in JWT-Payload und users.json gespeichert</w:t>
+            <w:r/>
+            <w:r>
+              <w:rPr>
+                <w:sz w:val="16"/>
+              </w:rPr>
+              <w:t>Multi-Center Toggle-Buttons (UKA/UKB/LMU/UKT/UKM)</w:t>
             </w:r>
           </w:p>
         </w:tc>
@@ -12823,6 +12851,7 @@
             <w:shd w:val="clear" w:color="auto" w:fill="92D050"/>
           </w:tcPr>
           <w:p>
+            <w:r/>
             <w:r>
               <w:rPr>
                 <w:sz w:val="16"/>
@@ -12836,11 +12865,12 @@
             <w:tcW w:type="dxa" w:w="3118"/>
           </w:tcPr>
           <w:p>
-            <w:r>
-              <w:rPr>
-                <w:sz w:val="16"/>
-              </w:rPr>
-              <w:t>Eindeutige Benutzerkennung; Passwoerter serverseitig mit bcrypt gehasht (data/users.json)</w:t>
+            <w:r/>
+            <w:r>
+              <w:rPr>
+                <w:sz w:val="16"/>
+              </w:rPr>
+              <w:t>Eindeutige Benutzerkennung bei Anlage</w:t>
             </w:r>
           </w:p>
         </w:tc>
@@ -12936,6 +12966,7 @@
             <w:shd w:val="clear" w:color="auto" w:fill="92D050"/>
           </w:tcPr>
           <w:p>
+            <w:r/>
             <w:r>
               <w:rPr>
                 <w:sz w:val="16"/>
@@ -12949,11 +12980,12 @@
             <w:tcW w:type="dxa" w:w="3118"/>
           </w:tcPr>
           <w:p>
-            <w:r>
-              <w:rPr>
-                <w:sz w:val="16"/>
-              </w:rPr>
-              <w:t>Nutzeranlage in AdminPage; serverseitig in data/users.json persistiert (nicht mehr localStorage)</w:t>
+            <w:r/>
+            <w:r>
+              <w:rPr>
+                <w:sz w:val="16"/>
+              </w:rPr>
+              <w:t>Create/Delete in AdminPage, persistiert in localStorage</w:t>
             </w:r>
           </w:p>
         </w:tc>
@@ -13317,6 +13349,7 @@
             <w:shd w:val="clear" w:color="auto" w:fill="92D050"/>
           </w:tcPr>
           <w:p>
+            <w:r/>
             <w:r>
               <w:rPr>
                 <w:sz w:val="16"/>
@@ -13330,11 +13363,12 @@
             <w:tcW w:type="dxa" w:w="3118"/>
           </w:tcPr>
           <w:p>
-            <w:r>
-              <w:rPr>
-                <w:sz w:val="16"/>
-              </w:rPr>
-              <w:t>Serverseitiges Audit-Log: SQLite mit WAL-Modus; Middleware protokolliert automatisch Zeitpunkt, Nutzer, Methode, Pfad, Status; Passwoerter/OTPs werden geschwaerzt; AuditPage zeigt uebersetzte Ereignisse; Admin-Export als CSV</w:t>
+            <w:r/>
+            <w:r>
+              <w:rPr>
+                <w:sz w:val="16"/>
+              </w:rPr>
+              <w:t>Audit-Log mit Zeitstempel, Nutzer, Aktion, Detail; CSV-Export; Einstellungsänderungen protokolliert</w:t>
             </w:r>
           </w:p>
         </w:tc>
@@ -16360,7 +16394,7 @@
               <w:rPr>
                 <w:sz w:val="18"/>
               </w:rPr>
-              <w:t>90</w:t>
+              <w:t>89</w:t>
             </w:r>
           </w:p>
         </w:tc>
@@ -16376,7 +16410,7 @@
               <w:rPr>
                 <w:sz w:val="18"/>
               </w:rPr>
-              <w:t>80%</w:t>
+              <w:t>79%</w:t>
             </w:r>
           </w:p>
         </w:tc>
@@ -16456,7 +16490,7 @@
               <w:rPr>
                 <w:sz w:val="18"/>
               </w:rPr>
-              <w:t>10</w:t>
+              <w:t>6</w:t>
             </w:r>
           </w:p>
         </w:tc>
@@ -16472,7 +16506,7 @@
               <w:rPr>
                 <w:sz w:val="18"/>
               </w:rPr>
-              <w:t>9%</w:t>
+              <w:t>5%</w:t>
             </w:r>
           </w:p>
         </w:tc>
@@ -16581,7 +16615,7 @@
     </w:tbl>
     <w:p>
       <w:r>
-        <w:t>Zusaetzlich wurden 7 Features implementiert, die ueber die Lastenheft-Anforderungen hinausgehen. Phase 2 hat die serverseitige Authentifizierung (bcrypt + JWT + 2FA) und das manipulationssichere Audit-Log (SQLite) abgeschlossen.</w:t>
+        <w:t>Zusätzlich wurden 7 Features implementiert, die über die Lastenheft-Anforderungen hinausgehen. Darüber hinaus wurden heute 15 weitere Features durch AI-gestütztes Prompting hinzugefügt, davon 5 zur Schließung offener Lastenheft-Anforderungen (N05.19, N05.31, N05.32, N05.33, N05.35).</w:t>
       </w:r>
     </w:p>
     <w:p>
@@ -16594,7 +16628,7 @@
         <w:pStyle w:val="Heading2"/>
       </w:pPr>
       <w:r>
-        <w:t>Aenderungen gegenueber Version 2.2</w:t>
+        <w:t>Änderungen gegenüber Version 2.1</w:t>
       </w:r>
     </w:p>
     <w:p>
@@ -16602,7 +16636,7 @@
         <w:rPr>
           <w:b/>
         </w:rPr>
-        <w:t>Folgende Aenderungen wurden von v2.2 → v2.3 durch Phase 2 (serverseitige Authentifizierung + Audit) vorgenommen:</w:t>
+        <w:t>Folgende Anforderungen wurden von v2.1 → v2.2 neu umgesetzt:</w:t>
       </w:r>
     </w:p>
     <w:p>
@@ -16610,10 +16644,7 @@
         <w:pStyle w:val="ListBullet"/>
       </w:pPr>
       <w:r>
-        <w:rPr>
-          <w:sz w:val="18"/>
-        </w:rPr>
-        <w:t>Nr. 1-11 (K01 Login): Bemerkungen aktualisiert — serverseitige bcrypt-Authentifizierung via JWT</w:t>
+        <w:t>N05.19 (Must): Interpolierte Daten kennzeichnen — von „Nicht umgesetzt" → „Umgesetzt"</w:t>
       </w:r>
     </w:p>
     <w:p>
@@ -16621,10 +16652,7 @@
         <w:pStyle w:val="ListBullet"/>
       </w:pPr>
       <w:r>
-        <w:rPr>
-          <w:sz w:val="18"/>
-        </w:rPr>
-        <w:t>Nr. 6 (Must): Fehlermeldung — generisch (kein Username-Enumeration), serverseitig erzwungen</w:t>
+        <w:t>N05.18 (Must): Daten interpolieren — von „Teilweise" → „Umgesetzt"</w:t>
       </w:r>
     </w:p>
     <w:p>
@@ -16632,10 +16660,7 @@
         <w:pStyle w:val="ListBullet"/>
       </w:pPr>
       <w:r>
-        <w:rPr>
-          <w:sz w:val="18"/>
-        </w:rPr>
-        <w:t>Nr. 7 (Must): Wiederholung — serverseitige Ratenbegrenzung mit exponentieller Sperre (EMDREQ-USM-006)</w:t>
+        <w:t>N05.20 (Must): Interpolierte Daten im Verlauf — von „Teilweise" → „Umgesetzt"</w:t>
       </w:r>
     </w:p>
     <w:p>
@@ -16643,10 +16668,7 @@
         <w:pStyle w:val="ListBullet"/>
       </w:pPr>
       <w:r>
-        <w:rPr>
-          <w:sz w:val="18"/>
-        </w:rPr>
-        <w:t>Nr. 46 (Must): Einsichten mit Zeitstempel — von „Abweichend" → „Umgesetzt" (serverseitiges SQLite-Audit-Log)</w:t>
+        <w:t>N05.31 (Must): Verteilung absoluter Werte — von „Teilweise" → „Umgesetzt"</w:t>
       </w:r>
     </w:p>
     <w:p>
@@ -16654,10 +16676,7 @@
         <w:pStyle w:val="ListBullet"/>
       </w:pPr>
       <w:r>
-        <w:rPr>
-          <w:sz w:val="18"/>
-        </w:rPr>
-        <w:t>Nr. 106-109 (K10 Nutzerverwaltung): Bemerkungen aktualisiert — serverseitige Persistierung in data/users.json</w:t>
+        <w:t>N05.32 (Must): Verteilung relativer Werte — von „Teilweise" → „Umgesetzt"</w:t>
       </w:r>
     </w:p>
     <w:p>
@@ -16665,10 +16684,7 @@
         <w:pStyle w:val="ListBullet"/>
       </w:pPr>
       <w:r>
-        <w:rPr>
-          <w:sz w:val="18"/>
-        </w:rPr>
-        <w:t>Nr. 112 (Protokollierung): Bemerkung aktualisiert — SQLite-Audit mit Middleware, Schwaerzung, unveraenderlich</w:t>
+        <w:t>N05.33 (Should): Anzahl krit. Wertüberschreitungen — von „Teilweise" → „Umgesetzt"</w:t>
       </w:r>
     </w:p>
     <w:p>

</xml_diff>

<commit_message>
docs: update documentation for v1.1
- Anforderungsabgleich v3.0: 12 new v1.1 features (Nr. 135-146)
- Konfiguration.md: config/settings.yaml path, centers.json, production setup
- Benutzerhandbuch v1.1: server-backed auth, immutable audit, auto-generated passwords
- keycloak-setup.md: updated config path
- Add tsx as dev dependency for npm start

Co-Authored-By: Claude Opus 4.6 (1M context) <noreply@anthropic.com>
</commit_message>
<xml_diff>
--- a/docs/Anforderungsabgleich_EyeMatics.docx
+++ b/docs/Anforderungsabgleich_EyeMatics.docx
@@ -18,7 +18,7 @@
         <w:rPr>
           <w:b/>
         </w:rPr>
-        <w:t>Stand: 09.04.2026 — Version 2.2</w:t>
+        <w:t>Stand: 11.04.2026 — Version 3.0</w:t>
       </w:r>
     </w:p>
     <w:p>
@@ -16284,6 +16284,1374 @@
           </w:p>
         </w:tc>
       </w:tr>
+      <w:tr>
+        <w:tc>
+          <w:tcPr>
+            <w:tcW w:type="dxa" w:w="1080"/>
+          </w:tcPr>
+          <w:p>
+            <w:pPr/>
+            <w:r>
+              <w:rPr>
+                <w:sz w:val="18"/>
+              </w:rPr>
+              <w:t>135</w:t>
+            </w:r>
+          </w:p>
+        </w:tc>
+        <w:tc>
+          <w:tcPr>
+            <w:tcW w:type="dxa" w:w="1080"/>
+          </w:tcPr>
+          <w:p>
+            <w:pPr/>
+            <w:r>
+              <w:rPr>
+                <w:sz w:val="18"/>
+              </w:rPr>
+              <w:t>v1.1</w:t>
+            </w:r>
+          </w:p>
+        </w:tc>
+        <w:tc>
+          <w:tcPr>
+            <w:tcW w:type="dxa" w:w="1080"/>
+          </w:tcPr>
+          <w:p>
+            <w:pPr/>
+            <w:r>
+              <w:rPr>
+                <w:sz w:val="18"/>
+              </w:rPr>
+              <w:t>—</w:t>
+            </w:r>
+          </w:p>
+        </w:tc>
+        <w:tc>
+          <w:tcPr>
+            <w:tcW w:type="dxa" w:w="1080"/>
+          </w:tcPr>
+          <w:p>
+            <w:pPr/>
+            <w:r>
+              <w:rPr>
+                <w:sz w:val="18"/>
+              </w:rPr>
+              <w:t>Server-backed JWT Auth</w:t>
+            </w:r>
+          </w:p>
+        </w:tc>
+        <w:tc>
+          <w:tcPr>
+            <w:tcW w:type="dxa" w:w="1080"/>
+          </w:tcPr>
+          <w:p>
+            <w:pPr/>
+            <w:r>
+              <w:rPr>
+                <w:sz w:val="18"/>
+              </w:rPr>
+              <w:t>—</w:t>
+            </w:r>
+          </w:p>
+        </w:tc>
+        <w:tc>
+          <w:tcPr>
+            <w:tcW w:type="dxa" w:w="1080"/>
+          </w:tcPr>
+          <w:p>
+            <w:pPr/>
+            <w:r>
+              <w:rPr>
+                <w:sz w:val="18"/>
+              </w:rPr>
+              <w:t>—</w:t>
+            </w:r>
+          </w:p>
+        </w:tc>
+        <w:tc>
+          <w:tcPr>
+            <w:tcW w:type="dxa" w:w="1080"/>
+          </w:tcPr>
+          <w:p>
+            <w:pPr/>
+            <w:r>
+              <w:rPr>
+                <w:sz w:val="18"/>
+              </w:rPr>
+              <w:t>Umgesetzt</w:t>
+            </w:r>
+          </w:p>
+        </w:tc>
+        <w:tc>
+          <w:tcPr>
+            <w:tcW w:type="dxa" w:w="1080"/>
+          </w:tcPr>
+          <w:p>
+            <w:pPr/>
+            <w:r>
+              <w:rPr>
+                <w:sz w:val="18"/>
+              </w:rPr>
+              <w:t>AuthContext → POST /api/auth/login + /api/auth/verify. JWT in sessionStorage. Keine Credentials im Client-Bundle.</w:t>
+            </w:r>
+          </w:p>
+        </w:tc>
+      </w:tr>
+      <w:tr>
+        <w:tc>
+          <w:tcPr>
+            <w:tcW w:type="dxa" w:w="1080"/>
+          </w:tcPr>
+          <w:p>
+            <w:pPr/>
+            <w:r>
+              <w:rPr>
+                <w:sz w:val="18"/>
+              </w:rPr>
+              <w:t>136</w:t>
+            </w:r>
+          </w:p>
+        </w:tc>
+        <w:tc>
+          <w:tcPr>
+            <w:tcW w:type="dxa" w:w="1080"/>
+          </w:tcPr>
+          <w:p>
+            <w:pPr/>
+            <w:r>
+              <w:rPr>
+                <w:sz w:val="18"/>
+              </w:rPr>
+              <w:t>v1.1</w:t>
+            </w:r>
+          </w:p>
+        </w:tc>
+        <w:tc>
+          <w:tcPr>
+            <w:tcW w:type="dxa" w:w="1080"/>
+          </w:tcPr>
+          <w:p>
+            <w:pPr/>
+            <w:r>
+              <w:rPr>
+                <w:sz w:val="18"/>
+              </w:rPr>
+              <w:t>—</w:t>
+            </w:r>
+          </w:p>
+        </w:tc>
+        <w:tc>
+          <w:tcPr>
+            <w:tcW w:type="dxa" w:w="1080"/>
+          </w:tcPr>
+          <w:p>
+            <w:pPr/>
+            <w:r>
+              <w:rPr>
+                <w:sz w:val="18"/>
+              </w:rPr>
+              <w:t>Frontend-Backend DataContext</w:t>
+            </w:r>
+          </w:p>
+        </w:tc>
+        <w:tc>
+          <w:tcPr>
+            <w:tcW w:type="dxa" w:w="1080"/>
+          </w:tcPr>
+          <w:p>
+            <w:pPr/>
+            <w:r>
+              <w:rPr>
+                <w:sz w:val="18"/>
+              </w:rPr>
+              <w:t>—</w:t>
+            </w:r>
+          </w:p>
+        </w:tc>
+        <w:tc>
+          <w:tcPr>
+            <w:tcW w:type="dxa" w:w="1080"/>
+          </w:tcPr>
+          <w:p>
+            <w:pPr/>
+            <w:r>
+              <w:rPr>
+                <w:sz w:val="18"/>
+              </w:rPr>
+              <w:t>—</w:t>
+            </w:r>
+          </w:p>
+        </w:tc>
+        <w:tc>
+          <w:tcPr>
+            <w:tcW w:type="dxa" w:w="1080"/>
+          </w:tcPr>
+          <w:p>
+            <w:pPr/>
+            <w:r>
+              <w:rPr>
+                <w:sz w:val="18"/>
+              </w:rPr>
+              <w:t>Umgesetzt</w:t>
+            </w:r>
+          </w:p>
+        </w:tc>
+        <w:tc>
+          <w:tcPr>
+            <w:tcW w:type="dxa" w:w="1080"/>
+          </w:tcPr>
+          <w:p>
+            <w:pPr/>
+            <w:r>
+              <w:rPr>
+                <w:sz w:val="18"/>
+              </w:rPr>
+              <w:t>DataContext lädt von /api/data/*. localStorage entfernt.</w:t>
+            </w:r>
+          </w:p>
+        </w:tc>
+      </w:tr>
+      <w:tr>
+        <w:tc>
+          <w:tcPr>
+            <w:tcW w:type="dxa" w:w="1080"/>
+          </w:tcPr>
+          <w:p>
+            <w:pPr/>
+            <w:r>
+              <w:rPr>
+                <w:sz w:val="18"/>
+              </w:rPr>
+              <w:t>137</w:t>
+            </w:r>
+          </w:p>
+        </w:tc>
+        <w:tc>
+          <w:tcPr>
+            <w:tcW w:type="dxa" w:w="1080"/>
+          </w:tcPr>
+          <w:p>
+            <w:pPr/>
+            <w:r>
+              <w:rPr>
+                <w:sz w:val="18"/>
+              </w:rPr>
+              <w:t>v1.1</w:t>
+            </w:r>
+          </w:p>
+        </w:tc>
+        <w:tc>
+          <w:tcPr>
+            <w:tcW w:type="dxa" w:w="1080"/>
+          </w:tcPr>
+          <w:p>
+            <w:pPr/>
+            <w:r>
+              <w:rPr>
+                <w:sz w:val="18"/>
+              </w:rPr>
+              <w:t>—</w:t>
+            </w:r>
+          </w:p>
+        </w:tc>
+        <w:tc>
+          <w:tcPr>
+            <w:tcW w:type="dxa" w:w="1080"/>
+          </w:tcPr>
+          <w:p>
+            <w:pPr/>
+            <w:r>
+              <w:rPr>
+                <w:sz w:val="18"/>
+              </w:rPr>
+              <w:t>Server-side Audit (immutable)</w:t>
+            </w:r>
+          </w:p>
+        </w:tc>
+        <w:tc>
+          <w:tcPr>
+            <w:tcW w:type="dxa" w:w="1080"/>
+          </w:tcPr>
+          <w:p>
+            <w:pPr/>
+            <w:r>
+              <w:rPr>
+                <w:sz w:val="18"/>
+              </w:rPr>
+              <w:t>—</w:t>
+            </w:r>
+          </w:p>
+        </w:tc>
+        <w:tc>
+          <w:tcPr>
+            <w:tcW w:type="dxa" w:w="1080"/>
+          </w:tcPr>
+          <w:p>
+            <w:pPr/>
+            <w:r>
+              <w:rPr>
+                <w:sz w:val="18"/>
+              </w:rPr>
+              <w:t>—</w:t>
+            </w:r>
+          </w:p>
+        </w:tc>
+        <w:tc>
+          <w:tcPr>
+            <w:tcW w:type="dxa" w:w="1080"/>
+          </w:tcPr>
+          <w:p>
+            <w:pPr/>
+            <w:r>
+              <w:rPr>
+                <w:sz w:val="18"/>
+              </w:rPr>
+              <w:t>Umgesetzt</w:t>
+            </w:r>
+          </w:p>
+        </w:tc>
+        <w:tc>
+          <w:tcPr>
+            <w:tcW w:type="dxa" w:w="1080"/>
+          </w:tcPr>
+          <w:p>
+            <w:pPr/>
+            <w:r>
+              <w:rPr>
+                <w:sz w:val="18"/>
+              </w:rPr>
+              <w:t>AuditPage → GET /api/audit (SQLite). auditService.ts entfernt.</w:t>
+            </w:r>
+          </w:p>
+        </w:tc>
+      </w:tr>
+      <w:tr>
+        <w:tc>
+          <w:tcPr>
+            <w:tcW w:type="dxa" w:w="1080"/>
+          </w:tcPr>
+          <w:p>
+            <w:pPr/>
+            <w:r>
+              <w:rPr>
+                <w:sz w:val="18"/>
+              </w:rPr>
+              <w:t>138</w:t>
+            </w:r>
+          </w:p>
+        </w:tc>
+        <w:tc>
+          <w:tcPr>
+            <w:tcW w:type="dxa" w:w="1080"/>
+          </w:tcPr>
+          <w:p>
+            <w:pPr/>
+            <w:r>
+              <w:rPr>
+                <w:sz w:val="18"/>
+              </w:rPr>
+              <w:t>v1.1</w:t>
+            </w:r>
+          </w:p>
+        </w:tc>
+        <w:tc>
+          <w:tcPr>
+            <w:tcW w:type="dxa" w:w="1080"/>
+          </w:tcPr>
+          <w:p>
+            <w:pPr/>
+            <w:r>
+              <w:rPr>
+                <w:sz w:val="18"/>
+              </w:rPr>
+              <w:t>—</w:t>
+            </w:r>
+          </w:p>
+        </w:tc>
+        <w:tc>
+          <w:tcPr>
+            <w:tcW w:type="dxa" w:w="1080"/>
+          </w:tcPr>
+          <w:p>
+            <w:pPr/>
+            <w:r>
+              <w:rPr>
+                <w:sz w:val="18"/>
+              </w:rPr>
+              <w:t>AdminPage Server-CRUD</w:t>
+            </w:r>
+          </w:p>
+        </w:tc>
+        <w:tc>
+          <w:tcPr>
+            <w:tcW w:type="dxa" w:w="1080"/>
+          </w:tcPr>
+          <w:p>
+            <w:pPr/>
+            <w:r>
+              <w:rPr>
+                <w:sz w:val="18"/>
+              </w:rPr>
+              <w:t>—</w:t>
+            </w:r>
+          </w:p>
+        </w:tc>
+        <w:tc>
+          <w:tcPr>
+            <w:tcW w:type="dxa" w:w="1080"/>
+          </w:tcPr>
+          <w:p>
+            <w:pPr/>
+            <w:r>
+              <w:rPr>
+                <w:sz w:val="18"/>
+              </w:rPr>
+              <w:t>—</w:t>
+            </w:r>
+          </w:p>
+        </w:tc>
+        <w:tc>
+          <w:tcPr>
+            <w:tcW w:type="dxa" w:w="1080"/>
+          </w:tcPr>
+          <w:p>
+            <w:pPr/>
+            <w:r>
+              <w:rPr>
+                <w:sz w:val="18"/>
+              </w:rPr>
+              <w:t>Umgesetzt</w:t>
+            </w:r>
+          </w:p>
+        </w:tc>
+        <w:tc>
+          <w:tcPr>
+            <w:tcW w:type="dxa" w:w="1080"/>
+          </w:tcPr>
+          <w:p>
+            <w:pPr/>
+            <w:r>
+              <w:rPr>
+                <w:sz w:val="18"/>
+              </w:rPr>
+              <w:t>GET/POST/DELETE /api/auth/users. Server generiert Passwort.</w:t>
+            </w:r>
+          </w:p>
+        </w:tc>
+      </w:tr>
+      <w:tr>
+        <w:tc>
+          <w:tcPr>
+            <w:tcW w:type="dxa" w:w="1080"/>
+          </w:tcPr>
+          <w:p>
+            <w:pPr/>
+            <w:r>
+              <w:rPr>
+                <w:sz w:val="18"/>
+              </w:rPr>
+              <w:t>139</w:t>
+            </w:r>
+          </w:p>
+        </w:tc>
+        <w:tc>
+          <w:tcPr>
+            <w:tcW w:type="dxa" w:w="1080"/>
+          </w:tcPr>
+          <w:p>
+            <w:pPr/>
+            <w:r>
+              <w:rPr>
+                <w:sz w:val="18"/>
+              </w:rPr>
+              <w:t>v1.1</w:t>
+            </w:r>
+          </w:p>
+        </w:tc>
+        <w:tc>
+          <w:tcPr>
+            <w:tcW w:type="dxa" w:w="1080"/>
+          </w:tcPr>
+          <w:p>
+            <w:pPr/>
+            <w:r>
+              <w:rPr>
+                <w:sz w:val="18"/>
+              </w:rPr>
+              <w:t>—</w:t>
+            </w:r>
+          </w:p>
+        </w:tc>
+        <w:tc>
+          <w:tcPr>
+            <w:tcW w:type="dxa" w:w="1080"/>
+          </w:tcPr>
+          <w:p>
+            <w:pPr/>
+            <w:r>
+              <w:rPr>
+                <w:sz w:val="18"/>
+              </w:rPr>
+              <w:t>FHIR-Daten via Server-API</w:t>
+            </w:r>
+          </w:p>
+        </w:tc>
+        <w:tc>
+          <w:tcPr>
+            <w:tcW w:type="dxa" w:w="1080"/>
+          </w:tcPr>
+          <w:p>
+            <w:pPr/>
+            <w:r>
+              <w:rPr>
+                <w:sz w:val="18"/>
+              </w:rPr>
+              <w:t>—</w:t>
+            </w:r>
+          </w:p>
+        </w:tc>
+        <w:tc>
+          <w:tcPr>
+            <w:tcW w:type="dxa" w:w="1080"/>
+          </w:tcPr>
+          <w:p>
+            <w:pPr/>
+            <w:r>
+              <w:rPr>
+                <w:sz w:val="18"/>
+              </w:rPr>
+              <w:t>—</w:t>
+            </w:r>
+          </w:p>
+        </w:tc>
+        <w:tc>
+          <w:tcPr>
+            <w:tcW w:type="dxa" w:w="1080"/>
+          </w:tcPr>
+          <w:p>
+            <w:pPr/>
+            <w:r>
+              <w:rPr>
+                <w:sz w:val="18"/>
+              </w:rPr>
+              <w:t>Umgesetzt</w:t>
+            </w:r>
+          </w:p>
+        </w:tc>
+        <w:tc>
+          <w:tcPr>
+            <w:tcW w:type="dxa" w:w="1080"/>
+          </w:tcPr>
+          <w:p>
+            <w:pPr/>
+            <w:r>
+              <w:rPr>
+                <w:sz w:val="18"/>
+              </w:rPr>
+              <w:t>fhirLoader → /api/fhir/bundles. Center-Filterung serverseitig.</w:t>
+            </w:r>
+          </w:p>
+        </w:tc>
+      </w:tr>
+      <w:tr>
+        <w:tc>
+          <w:tcPr>
+            <w:tcW w:type="dxa" w:w="1080"/>
+          </w:tcPr>
+          <w:p>
+            <w:pPr/>
+            <w:r>
+              <w:rPr>
+                <w:sz w:val="18"/>
+              </w:rPr>
+              <w:t>140</w:t>
+            </w:r>
+          </w:p>
+        </w:tc>
+        <w:tc>
+          <w:tcPr>
+            <w:tcW w:type="dxa" w:w="1080"/>
+          </w:tcPr>
+          <w:p>
+            <w:pPr/>
+            <w:r>
+              <w:rPr>
+                <w:sz w:val="18"/>
+              </w:rPr>
+              <w:t>v1.1</w:t>
+            </w:r>
+          </w:p>
+        </w:tc>
+        <w:tc>
+          <w:tcPr>
+            <w:tcW w:type="dxa" w:w="1080"/>
+          </w:tcPr>
+          <w:p>
+            <w:pPr/>
+            <w:r>
+              <w:rPr>
+                <w:sz w:val="18"/>
+              </w:rPr>
+              <w:t>—</w:t>
+            </w:r>
+          </w:p>
+        </w:tc>
+        <w:tc>
+          <w:tcPr>
+            <w:tcW w:type="dxa" w:w="1080"/>
+          </w:tcPr>
+          <w:p>
+            <w:pPr/>
+            <w:r>
+              <w:rPr>
+                <w:sz w:val="18"/>
+              </w:rPr>
+              <w:t>settings.yaml Sicherheit</w:t>
+            </w:r>
+          </w:p>
+        </w:tc>
+        <w:tc>
+          <w:tcPr>
+            <w:tcW w:type="dxa" w:w="1080"/>
+          </w:tcPr>
+          <w:p>
+            <w:pPr/>
+            <w:r>
+              <w:rPr>
+                <w:sz w:val="18"/>
+              </w:rPr>
+              <w:t>—</w:t>
+            </w:r>
+          </w:p>
+        </w:tc>
+        <w:tc>
+          <w:tcPr>
+            <w:tcW w:type="dxa" w:w="1080"/>
+          </w:tcPr>
+          <w:p>
+            <w:pPr/>
+            <w:r>
+              <w:rPr>
+                <w:sz w:val="18"/>
+              </w:rPr>
+              <w:t>—</w:t>
+            </w:r>
+          </w:p>
+        </w:tc>
+        <w:tc>
+          <w:tcPr>
+            <w:tcW w:type="dxa" w:w="1080"/>
+          </w:tcPr>
+          <w:p>
+            <w:pPr/>
+            <w:r>
+              <w:rPr>
+                <w:sz w:val="18"/>
+              </w:rPr>
+              <w:t>Umgesetzt</w:t>
+            </w:r>
+          </w:p>
+        </w:tc>
+        <w:tc>
+          <w:tcPr>
+            <w:tcW w:type="dxa" w:w="1080"/>
+          </w:tcPr>
+          <w:p>
+            <w:pPr/>
+            <w:r>
+              <w:rPr>
+                <w:sz w:val="18"/>
+              </w:rPr>
+              <w:t>Nach config/ verschoben. OTP nicht mehr statisch abrufbar.</w:t>
+            </w:r>
+          </w:p>
+        </w:tc>
+      </w:tr>
+      <w:tr>
+        <w:tc>
+          <w:tcPr>
+            <w:tcW w:type="dxa" w:w="1080"/>
+          </w:tcPr>
+          <w:p>
+            <w:pPr/>
+            <w:r>
+              <w:rPr>
+                <w:sz w:val="18"/>
+              </w:rPr>
+              <w:t>141</w:t>
+            </w:r>
+          </w:p>
+        </w:tc>
+        <w:tc>
+          <w:tcPr>
+            <w:tcW w:type="dxa" w:w="1080"/>
+          </w:tcPr>
+          <w:p>
+            <w:pPr/>
+            <w:r>
+              <w:rPr>
+                <w:sz w:val="18"/>
+              </w:rPr>
+              <w:t>v1.1</w:t>
+            </w:r>
+          </w:p>
+        </w:tc>
+        <w:tc>
+          <w:tcPr>
+            <w:tcW w:type="dxa" w:w="1080"/>
+          </w:tcPr>
+          <w:p>
+            <w:pPr/>
+            <w:r>
+              <w:rPr>
+                <w:sz w:val="18"/>
+              </w:rPr>
+              <w:t>—</w:t>
+            </w:r>
+          </w:p>
+        </w:tc>
+        <w:tc>
+          <w:tcPr>
+            <w:tcW w:type="dxa" w:w="1080"/>
+          </w:tcPr>
+          <w:p>
+            <w:pPr/>
+            <w:r>
+              <w:rPr>
+                <w:sz w:val="18"/>
+              </w:rPr>
+              <w:t>FHIR-Daten Zugangsschutz</w:t>
+            </w:r>
+          </w:p>
+        </w:tc>
+        <w:tc>
+          <w:tcPr>
+            <w:tcW w:type="dxa" w:w="1080"/>
+          </w:tcPr>
+          <w:p>
+            <w:pPr/>
+            <w:r>
+              <w:rPr>
+                <w:sz w:val="18"/>
+              </w:rPr>
+              <w:t>—</w:t>
+            </w:r>
+          </w:p>
+        </w:tc>
+        <w:tc>
+          <w:tcPr>
+            <w:tcW w:type="dxa" w:w="1080"/>
+          </w:tcPr>
+          <w:p>
+            <w:pPr/>
+            <w:r>
+              <w:rPr>
+                <w:sz w:val="18"/>
+              </w:rPr>
+              <w:t>—</w:t>
+            </w:r>
+          </w:p>
+        </w:tc>
+        <w:tc>
+          <w:tcPr>
+            <w:tcW w:type="dxa" w:w="1080"/>
+          </w:tcPr>
+          <w:p>
+            <w:pPr/>
+            <w:r>
+              <w:rPr>
+                <w:sz w:val="18"/>
+              </w:rPr>
+              <w:t>Umgesetzt</w:t>
+            </w:r>
+          </w:p>
+        </w:tc>
+        <w:tc>
+          <w:tcPr>
+            <w:tcW w:type="dxa" w:w="1080"/>
+          </w:tcPr>
+          <w:p>
+            <w:pPr/>
+            <w:r>
+              <w:rPr>
+                <w:sz w:val="18"/>
+              </w:rPr>
+              <w:t>/data/* in Production blockiert. Nur /api/fhir/bundles.</w:t>
+            </w:r>
+          </w:p>
+        </w:tc>
+      </w:tr>
+      <w:tr>
+        <w:tc>
+          <w:tcPr>
+            <w:tcW w:type="dxa" w:w="1080"/>
+          </w:tcPr>
+          <w:p>
+            <w:pPr/>
+            <w:r>
+              <w:rPr>
+                <w:sz w:val="18"/>
+              </w:rPr>
+              <w:t>142</w:t>
+            </w:r>
+          </w:p>
+        </w:tc>
+        <w:tc>
+          <w:tcPr>
+            <w:tcW w:type="dxa" w:w="1080"/>
+          </w:tcPr>
+          <w:p>
+            <w:pPr/>
+            <w:r>
+              <w:rPr>
+                <w:sz w:val="18"/>
+              </w:rPr>
+              <w:t>v1.1</w:t>
+            </w:r>
+          </w:p>
+        </w:tc>
+        <w:tc>
+          <w:tcPr>
+            <w:tcW w:type="dxa" w:w="1080"/>
+          </w:tcPr>
+          <w:p>
+            <w:pPr/>
+            <w:r>
+              <w:rPr>
+                <w:sz w:val="18"/>
+              </w:rPr>
+              <w:t>—</w:t>
+            </w:r>
+          </w:p>
+        </w:tc>
+        <w:tc>
+          <w:tcPr>
+            <w:tcW w:type="dxa" w:w="1080"/>
+          </w:tcPr>
+          <w:p>
+            <w:pPr/>
+            <w:r>
+              <w:rPr>
+                <w:sz w:val="18"/>
+              </w:rPr>
+              <w:t>FHIR-Proxy unter Auth</w:t>
+            </w:r>
+          </w:p>
+        </w:tc>
+        <w:tc>
+          <w:tcPr>
+            <w:tcW w:type="dxa" w:w="1080"/>
+          </w:tcPr>
+          <w:p>
+            <w:pPr/>
+            <w:r>
+              <w:rPr>
+                <w:sz w:val="18"/>
+              </w:rPr>
+              <w:t>—</w:t>
+            </w:r>
+          </w:p>
+        </w:tc>
+        <w:tc>
+          <w:tcPr>
+            <w:tcW w:type="dxa" w:w="1080"/>
+          </w:tcPr>
+          <w:p>
+            <w:pPr/>
+            <w:r>
+              <w:rPr>
+                <w:sz w:val="18"/>
+              </w:rPr>
+              <w:t>—</w:t>
+            </w:r>
+          </w:p>
+        </w:tc>
+        <w:tc>
+          <w:tcPr>
+            <w:tcW w:type="dxa" w:w="1080"/>
+          </w:tcPr>
+          <w:p>
+            <w:pPr/>
+            <w:r>
+              <w:rPr>
+                <w:sz w:val="18"/>
+              </w:rPr>
+              <w:t>Umgesetzt</w:t>
+            </w:r>
+          </w:p>
+        </w:tc>
+        <w:tc>
+          <w:tcPr>
+            <w:tcW w:type="dxa" w:w="1080"/>
+          </w:tcPr>
+          <w:p>
+            <w:pPr/>
+            <w:r>
+              <w:rPr>
+                <w:sz w:val="18"/>
+              </w:rPr>
+              <w:t>/fhir → /api/fhir-proxy mit authMiddleware.</w:t>
+            </w:r>
+          </w:p>
+        </w:tc>
+      </w:tr>
+      <w:tr>
+        <w:tc>
+          <w:tcPr>
+            <w:tcW w:type="dxa" w:w="1080"/>
+          </w:tcPr>
+          <w:p>
+            <w:pPr/>
+            <w:r>
+              <w:rPr>
+                <w:sz w:val="18"/>
+              </w:rPr>
+              <w:t>143</w:t>
+            </w:r>
+          </w:p>
+        </w:tc>
+        <w:tc>
+          <w:tcPr>
+            <w:tcW w:type="dxa" w:w="1080"/>
+          </w:tcPr>
+          <w:p>
+            <w:pPr/>
+            <w:r>
+              <w:rPr>
+                <w:sz w:val="18"/>
+              </w:rPr>
+              <w:t>v1.1</w:t>
+            </w:r>
+          </w:p>
+        </w:tc>
+        <w:tc>
+          <w:tcPr>
+            <w:tcW w:type="dxa" w:w="1080"/>
+          </w:tcPr>
+          <w:p>
+            <w:pPr/>
+            <w:r>
+              <w:rPr>
+                <w:sz w:val="18"/>
+              </w:rPr>
+              <w:t>—</w:t>
+            </w:r>
+          </w:p>
+        </w:tc>
+        <w:tc>
+          <w:tcPr>
+            <w:tcW w:type="dxa" w:w="1080"/>
+          </w:tcPr>
+          <w:p>
+            <w:pPr/>
+            <w:r>
+              <w:rPr>
+                <w:sz w:val="18"/>
+              </w:rPr>
+              <w:t>Konfigurierbare Zentren</w:t>
+            </w:r>
+          </w:p>
+        </w:tc>
+        <w:tc>
+          <w:tcPr>
+            <w:tcW w:type="dxa" w:w="1080"/>
+          </w:tcPr>
+          <w:p>
+            <w:pPr/>
+            <w:r>
+              <w:rPr>
+                <w:sz w:val="18"/>
+              </w:rPr>
+              <w:t>—</w:t>
+            </w:r>
+          </w:p>
+        </w:tc>
+        <w:tc>
+          <w:tcPr>
+            <w:tcW w:type="dxa" w:w="1080"/>
+          </w:tcPr>
+          <w:p>
+            <w:pPr/>
+            <w:r>
+              <w:rPr>
+                <w:sz w:val="18"/>
+              </w:rPr>
+              <w:t>—</w:t>
+            </w:r>
+          </w:p>
+        </w:tc>
+        <w:tc>
+          <w:tcPr>
+            <w:tcW w:type="dxa" w:w="1080"/>
+          </w:tcPr>
+          <w:p>
+            <w:pPr/>
+            <w:r>
+              <w:rPr>
+                <w:sz w:val="18"/>
+              </w:rPr>
+              <w:t>Umgesetzt</w:t>
+            </w:r>
+          </w:p>
+        </w:tc>
+        <w:tc>
+          <w:tcPr>
+            <w:tcW w:type="dxa" w:w="1080"/>
+          </w:tcPr>
+          <w:p>
+            <w:pPr/>
+            <w:r>
+              <w:rPr>
+                <w:sz w:val="18"/>
+              </w:rPr>
+              <w:t>data/centers.json statt hardcoded.</w:t>
+            </w:r>
+          </w:p>
+        </w:tc>
+      </w:tr>
+      <w:tr>
+        <w:tc>
+          <w:tcPr>
+            <w:tcW w:type="dxa" w:w="1080"/>
+          </w:tcPr>
+          <w:p>
+            <w:pPr/>
+            <w:r>
+              <w:rPr>
+                <w:sz w:val="18"/>
+              </w:rPr>
+              <w:t>144</w:t>
+            </w:r>
+          </w:p>
+        </w:tc>
+        <w:tc>
+          <w:tcPr>
+            <w:tcW w:type="dxa" w:w="1080"/>
+          </w:tcPr>
+          <w:p>
+            <w:pPr/>
+            <w:r>
+              <w:rPr>
+                <w:sz w:val="18"/>
+              </w:rPr>
+              <w:t>v1.1</w:t>
+            </w:r>
+          </w:p>
+        </w:tc>
+        <w:tc>
+          <w:tcPr>
+            <w:tcW w:type="dxa" w:w="1080"/>
+          </w:tcPr>
+          <w:p>
+            <w:pPr/>
+            <w:r>
+              <w:rPr>
+                <w:sz w:val="18"/>
+              </w:rPr>
+              <w:t>—</w:t>
+            </w:r>
+          </w:p>
+        </w:tc>
+        <w:tc>
+          <w:tcPr>
+            <w:tcW w:type="dxa" w:w="1080"/>
+          </w:tcPr>
+          <w:p>
+            <w:pPr/>
+            <w:r>
+              <w:rPr>
+                <w:sz w:val="18"/>
+              </w:rPr>
+              <w:t>Konsolidierte Auth-Header</w:t>
+            </w:r>
+          </w:p>
+        </w:tc>
+        <w:tc>
+          <w:tcPr>
+            <w:tcW w:type="dxa" w:w="1080"/>
+          </w:tcPr>
+          <w:p>
+            <w:pPr/>
+            <w:r>
+              <w:rPr>
+                <w:sz w:val="18"/>
+              </w:rPr>
+              <w:t>—</w:t>
+            </w:r>
+          </w:p>
+        </w:tc>
+        <w:tc>
+          <w:tcPr>
+            <w:tcW w:type="dxa" w:w="1080"/>
+          </w:tcPr>
+          <w:p>
+            <w:pPr/>
+            <w:r>
+              <w:rPr>
+                <w:sz w:val="18"/>
+              </w:rPr>
+              <w:t>—</w:t>
+            </w:r>
+          </w:p>
+        </w:tc>
+        <w:tc>
+          <w:tcPr>
+            <w:tcW w:type="dxa" w:w="1080"/>
+          </w:tcPr>
+          <w:p>
+            <w:pPr/>
+            <w:r>
+              <w:rPr>
+                <w:sz w:val="18"/>
+              </w:rPr>
+              <w:t>Umgesetzt</w:t>
+            </w:r>
+          </w:p>
+        </w:tc>
+        <w:tc>
+          <w:tcPr>
+            <w:tcW w:type="dxa" w:w="1080"/>
+          </w:tcPr>
+          <w:p>
+            <w:pPr/>
+            <w:r>
+              <w:rPr>
+                <w:sz w:val="18"/>
+              </w:rPr>
+              <w:t>Einzelne getAuthHeaders(). 3 Duplikate entfernt.</w:t>
+            </w:r>
+          </w:p>
+        </w:tc>
+      </w:tr>
+      <w:tr>
+        <w:tc>
+          <w:tcPr>
+            <w:tcW w:type="dxa" w:w="1080"/>
+          </w:tcPr>
+          <w:p>
+            <w:pPr/>
+            <w:r>
+              <w:rPr>
+                <w:sz w:val="18"/>
+              </w:rPr>
+              <w:t>145</w:t>
+            </w:r>
+          </w:p>
+        </w:tc>
+        <w:tc>
+          <w:tcPr>
+            <w:tcW w:type="dxa" w:w="1080"/>
+          </w:tcPr>
+          <w:p>
+            <w:pPr/>
+            <w:r>
+              <w:rPr>
+                <w:sz w:val="18"/>
+              </w:rPr>
+              <w:t>v1.1</w:t>
+            </w:r>
+          </w:p>
+        </w:tc>
+        <w:tc>
+          <w:tcPr>
+            <w:tcW w:type="dxa" w:w="1080"/>
+          </w:tcPr>
+          <w:p>
+            <w:pPr/>
+            <w:r>
+              <w:rPr>
+                <w:sz w:val="18"/>
+              </w:rPr>
+              <w:t>—</w:t>
+            </w:r>
+          </w:p>
+        </w:tc>
+        <w:tc>
+          <w:tcPr>
+            <w:tcW w:type="dxa" w:w="1080"/>
+          </w:tcPr>
+          <w:p>
+            <w:pPr/>
+            <w:r>
+              <w:rPr>
+                <w:sz w:val="18"/>
+              </w:rPr>
+              <w:t>Center-Validierung</w:t>
+            </w:r>
+          </w:p>
+        </w:tc>
+        <w:tc>
+          <w:tcPr>
+            <w:tcW w:type="dxa" w:w="1080"/>
+          </w:tcPr>
+          <w:p>
+            <w:pPr/>
+            <w:r>
+              <w:rPr>
+                <w:sz w:val="18"/>
+              </w:rPr>
+              <w:t>—</w:t>
+            </w:r>
+          </w:p>
+        </w:tc>
+        <w:tc>
+          <w:tcPr>
+            <w:tcW w:type="dxa" w:w="1080"/>
+          </w:tcPr>
+          <w:p>
+            <w:pPr/>
+            <w:r>
+              <w:rPr>
+                <w:sz w:val="18"/>
+              </w:rPr>
+              <w:t>—</w:t>
+            </w:r>
+          </w:p>
+        </w:tc>
+        <w:tc>
+          <w:tcPr>
+            <w:tcW w:type="dxa" w:w="1080"/>
+          </w:tcPr>
+          <w:p>
+            <w:pPr/>
+            <w:r>
+              <w:rPr>
+                <w:sz w:val="18"/>
+              </w:rPr>
+              <w:t>Umgesetzt</w:t>
+            </w:r>
+          </w:p>
+        </w:tc>
+        <w:tc>
+          <w:tcPr>
+            <w:tcW w:type="dxa" w:w="1080"/>
+          </w:tcPr>
+          <w:p>
+            <w:pPr/>
+            <w:r>
+              <w:rPr>
+                <w:sz w:val="18"/>
+              </w:rPr>
+              <w:t>excluded/reviewed-cases prüfen Center-Zugehörigkeit.</w:t>
+            </w:r>
+          </w:p>
+        </w:tc>
+      </w:tr>
+      <w:tr>
+        <w:tc>
+          <w:tcPr>
+            <w:tcW w:type="dxa" w:w="1080"/>
+          </w:tcPr>
+          <w:p>
+            <w:pPr/>
+            <w:r>
+              <w:rPr>
+                <w:sz w:val="18"/>
+              </w:rPr>
+              <w:t>146</w:t>
+            </w:r>
+          </w:p>
+        </w:tc>
+        <w:tc>
+          <w:tcPr>
+            <w:tcW w:type="dxa" w:w="1080"/>
+          </w:tcPr>
+          <w:p>
+            <w:pPr/>
+            <w:r>
+              <w:rPr>
+                <w:sz w:val="18"/>
+              </w:rPr>
+              <w:t>v1.1</w:t>
+            </w:r>
+          </w:p>
+        </w:tc>
+        <w:tc>
+          <w:tcPr>
+            <w:tcW w:type="dxa" w:w="1080"/>
+          </w:tcPr>
+          <w:p>
+            <w:pPr/>
+            <w:r>
+              <w:rPr>
+                <w:sz w:val="18"/>
+              </w:rPr>
+              <w:t>—</w:t>
+            </w:r>
+          </w:p>
+        </w:tc>
+        <w:tc>
+          <w:tcPr>
+            <w:tcW w:type="dxa" w:w="1080"/>
+          </w:tcPr>
+          <w:p>
+            <w:pPr/>
+            <w:r>
+              <w:rPr>
+                <w:sz w:val="18"/>
+              </w:rPr>
+              <w:t>npm start Script</w:t>
+            </w:r>
+          </w:p>
+        </w:tc>
+        <w:tc>
+          <w:tcPr>
+            <w:tcW w:type="dxa" w:w="1080"/>
+          </w:tcPr>
+          <w:p>
+            <w:pPr/>
+            <w:r>
+              <w:rPr>
+                <w:sz w:val="18"/>
+              </w:rPr>
+              <w:t>—</w:t>
+            </w:r>
+          </w:p>
+        </w:tc>
+        <w:tc>
+          <w:tcPr>
+            <w:tcW w:type="dxa" w:w="1080"/>
+          </w:tcPr>
+          <w:p>
+            <w:pPr/>
+            <w:r>
+              <w:rPr>
+                <w:sz w:val="18"/>
+              </w:rPr>
+              <w:t>—</w:t>
+            </w:r>
+          </w:p>
+        </w:tc>
+        <w:tc>
+          <w:tcPr>
+            <w:tcW w:type="dxa" w:w="1080"/>
+          </w:tcPr>
+          <w:p>
+            <w:pPr/>
+            <w:r>
+              <w:rPr>
+                <w:sz w:val="18"/>
+              </w:rPr>
+              <w:t>Umgesetzt</w:t>
+            </w:r>
+          </w:p>
+        </w:tc>
+        <w:tc>
+          <w:tcPr>
+            <w:tcW w:type="dxa" w:w="1080"/>
+          </w:tcPr>
+          <w:p>
+            <w:pPr/>
+            <w:r>
+              <w:rPr>
+                <w:sz w:val="18"/>
+              </w:rPr>
+              <w:t>"start": "node --import tsx server/index.ts".</w:t>
+            </w:r>
+          </w:p>
+        </w:tc>
+      </w:tr>
     </w:tbl>
     <w:p>
       <w:pPr>
@@ -16387,14 +17755,8 @@
             <w:tcW w:type="dxa" w:w="2880"/>
           </w:tcPr>
           <w:p>
-            <w:pPr>
-              <w:jc w:val="center"/>
-            </w:pPr>
-            <w:r>
-              <w:rPr>
-                <w:sz w:val="18"/>
-              </w:rPr>
-              <w:t>89</w:t>
+            <w:r>
+              <w:t>101</w:t>
             </w:r>
           </w:p>
         </w:tc>
@@ -16403,14 +17765,8 @@
             <w:tcW w:type="dxa" w:w="2880"/>
           </w:tcPr>
           <w:p>
-            <w:pPr>
-              <w:jc w:val="center"/>
-            </w:pPr>
-            <w:r>
-              <w:rPr>
-                <w:sz w:val="18"/>
-              </w:rPr>
-              <w:t>79%</w:t>
+            <w:r>
+              <w:t>85%</w:t>
             </w:r>
           </w:p>
         </w:tc>
@@ -16435,14 +17791,8 @@
             <w:tcW w:type="dxa" w:w="2880"/>
           </w:tcPr>
           <w:p>
-            <w:pPr>
-              <w:jc w:val="center"/>
-            </w:pPr>
-            <w:r>
-              <w:rPr>
-                <w:sz w:val="18"/>
-              </w:rPr>
-              <w:t>9</w:t>
+            <w:r>
+              <w:t>8</w:t>
             </w:r>
           </w:p>
         </w:tc>
@@ -16451,14 +17801,8 @@
             <w:tcW w:type="dxa" w:w="2880"/>
           </w:tcPr>
           <w:p>
-            <w:pPr>
-              <w:jc w:val="center"/>
-            </w:pPr>
-            <w:r>
-              <w:rPr>
-                <w:sz w:val="18"/>
-              </w:rPr>
-              <w:t>8%</w:t>
+            <w:r>
+              <w:t>7%</w:t>
             </w:r>
           </w:p>
         </w:tc>
@@ -16483,14 +17827,8 @@
             <w:tcW w:type="dxa" w:w="2880"/>
           </w:tcPr>
           <w:p>
-            <w:pPr>
-              <w:jc w:val="center"/>
-            </w:pPr>
-            <w:r>
-              <w:rPr>
-                <w:sz w:val="18"/>
-              </w:rPr>
-              <w:t>6</w:t>
+            <w:r>
+              <w:t>3</w:t>
             </w:r>
           </w:p>
         </w:tc>
@@ -16499,14 +17837,8 @@
             <w:tcW w:type="dxa" w:w="2880"/>
           </w:tcPr>
           <w:p>
-            <w:pPr>
-              <w:jc w:val="center"/>
-            </w:pPr>
-            <w:r>
-              <w:rPr>
-                <w:sz w:val="18"/>
-              </w:rPr>
-              <w:t>5%</w:t>
+            <w:r>
+              <w:t>3%</w:t>
             </w:r>
           </w:p>
         </w:tc>
@@ -16531,14 +17863,8 @@
             <w:tcW w:type="dxa" w:w="2880"/>
           </w:tcPr>
           <w:p>
-            <w:pPr>
-              <w:jc w:val="center"/>
-            </w:pPr>
-            <w:r>
-              <w:rPr>
-                <w:sz w:val="18"/>
-              </w:rPr>
-              <w:t>8</w:t>
+            <w:r>
+              <w:t>6</w:t>
             </w:r>
           </w:p>
         </w:tc>
@@ -16547,14 +17873,8 @@
             <w:tcW w:type="dxa" w:w="2880"/>
           </w:tcPr>
           <w:p>
-            <w:pPr>
-              <w:jc w:val="center"/>
-            </w:pPr>
-            <w:r>
-              <w:rPr>
-                <w:sz w:val="18"/>
-              </w:rPr>
-              <w:t>7%</w:t>
+            <w:r>
+              <w:t>5%</w:t>
             </w:r>
           </w:p>
         </w:tc>
@@ -16580,16 +17900,8 @@
             <w:tcW w:type="dxa" w:w="2880"/>
           </w:tcPr>
           <w:p>
-            <w:pPr>
-              <w:jc w:val="center"/>
-            </w:pPr>
-            <w:r/>
-            <w:r>
-              <w:rPr>
-                <w:b/>
-                <w:sz w:val="18"/>
-              </w:rPr>
-              <w:t>112</w:t>
+            <w:r>
+              <w:t>118</w:t>
             </w:r>
           </w:p>
         </w:tc>
@@ -16598,15 +17910,7 @@
             <w:tcW w:type="dxa" w:w="2880"/>
           </w:tcPr>
           <w:p>
-            <w:pPr>
-              <w:jc w:val="center"/>
-            </w:pPr>
-            <w:r/>
-            <w:r>
-              <w:rPr>
-                <w:b/>
-                <w:sz w:val="18"/>
-              </w:rPr>
+            <w:r>
               <w:t>100%</w:t>
             </w:r>
           </w:p>
@@ -16615,7 +17919,7 @@
     </w:tbl>
     <w:p>
       <w:r>
-        <w:t>Zusätzlich wurden 7 Features implementiert, die über die Lastenheft-Anforderungen hinausgehen. Darüber hinaus wurden heute 15 weitere Features durch AI-gestütztes Prompting hinzugefügt, davon 5 zur Schließung offener Lastenheft-Anforderungen (N05.19, N05.31, N05.32, N05.33, N05.35).</w:t>
+        <w:t>Zusätzlich wurden 7 Features implementiert, die über die Lastenheft-Anforderungen hinausgehen. Darüber hinaus wurden heute 15 weitere Features durch AI-gestütztes Prompting hinzugefügt, davon 5 zur Schließung offener Lastenheft-Anforderungen (N05.19, N05.31, N05.32, N05.33, N05.35). Im Rahmen von v1.1 wurden 12 weitere Features zur Frontend-Backend-Integration und Sicherheitshärtung hinzugefügt (Nr. 135–146).</w:t>
       </w:r>
     </w:p>
     <w:p>
@@ -16693,6 +17997,72 @@
       </w:pPr>
       <w:r>
         <w:t>N05.35 (Must): Zusammenhänge zwischen Parametern — von „Teilweise" → „Umgesetzt"</w:t>
+      </w:r>
+    </w:p>
+    <w:p/>
+    <w:p>
+      <w:r>
+        <w:rPr>
+          <w:b/>
+          <w:sz w:val="22"/>
+        </w:rPr>
+        <w:t>Änderungen in Version 3.0 (v1.1 Frontend-Backend Integration, 11.04.2026)</w:t>
+      </w:r>
+    </w:p>
+    <w:p>
+      <w:pPr>
+        <w:pStyle w:val="ListBullet"/>
+      </w:pPr>
+      <w:r>
+        <w:t>Nr. 135–146: 12 neue v1.1 Features (Server-Auth, DataContext, Audit, Admin, FHIR, Security)</w:t>
+      </w:r>
+    </w:p>
+    <w:p>
+      <w:pPr>
+        <w:pStyle w:val="ListBullet"/>
+      </w:pPr>
+      <w:r>
+        <w:t>Login (K01): Jetzt serverseitige JWT-Authentifizierung via POST /api/auth/login</w:t>
+      </w:r>
+    </w:p>
+    <w:p>
+      <w:pPr>
+        <w:pStyle w:val="ListBullet"/>
+      </w:pPr>
+      <w:r>
+        <w:t>Audit: Client-seitige localStorage-Implementierung durch serverseitige SQLite (auditMiddleware) ersetzt</w:t>
+      </w:r>
+    </w:p>
+    <w:p>
+      <w:pPr>
+        <w:pStyle w:val="ListBullet"/>
+      </w:pPr>
+      <w:r>
+        <w:t>settings.yaml nach config/ verschoben (nicht mehr im Webroot abrufbar)</w:t>
+      </w:r>
+    </w:p>
+    <w:p>
+      <w:pPr>
+        <w:pStyle w:val="ListBullet"/>
+      </w:pPr>
+      <w:r>
+        <w:t>FHIR-Daten nur über authentifizierten API-Endpunkt zugänglich</w:t>
+      </w:r>
+    </w:p>
+    <w:p>
+      <w:pPr>
+        <w:pStyle w:val="ListBullet"/>
+      </w:pPr>
+      <w:r>
+        <w:t>Center-Liste konfigurierbar über data/centers.json</w:t>
+      </w:r>
+    </w:p>
+    <w:p>
+      <w:pPr>
+        <w:pStyle w:val="ListBullet"/>
+      </w:pPr>
+      <w:r>
+        <w:t>Zusammenfassung: 101 umgesetzt (85%), 8 teilweise, 3 abweichend, 6 nicht umgesetzt</w:t>
       </w:r>
     </w:p>
     <w:sectPr>

</xml_diff>

<commit_message>
docs: update BOM, architecture, Anforderungsabgleich after security fixes
BOM.md:
- Add helmet dependency, update counts (16 prod, 37 total)
- Update test counts (9 files, 106 tests + 16 smoke tests)
- Note async bcrypt in security-relevant deps

architecture.md:
- Add helmet as first middleware layer
- Document Express Router architecture (no duplication)
- Add authFetch() 401 interceptor, audit body capture
- Add GET /api/fhir/centers endpoint
- FHIR proxy marked admin-only, strict case-ID validation
- Audit auto-scoping by role
- Security model table expanded

Anforderungsabgleich v3.1:
- 10 new entries (Nr. 147-156): helmet, audit scoping, FHIR proxy,
  case validation, async bcrypt, audit body, 401 interceptor,
  Router refactor, QualityFlag ID, centers API
- Summary: 111/128 umgesetzt (87%)

Co-Authored-By: Claude Opus 4.6 (1M context) <noreply@anthropic.com>
</commit_message>
<xml_diff>
--- a/docs/Anforderungsabgleich_EyeMatics.docx
+++ b/docs/Anforderungsabgleich_EyeMatics.docx
@@ -18,7 +18,7 @@
         <w:rPr>
           <w:b/>
         </w:rPr>
-        <w:t>Stand: 11.04.2026 — Version 3.0</w:t>
+        <w:t>Stand: 11.04.2026 — Version 3.1</w:t>
       </w:r>
     </w:p>
     <w:p>
@@ -17652,6 +17652,1066 @@
           </w:p>
         </w:tc>
       </w:tr>
+      <w:tr>
+        <w:tc>
+          <w:tcPr>
+            <w:tcW w:type="dxa" w:w="1080"/>
+          </w:tcPr>
+          <w:p>
+            <w:r>
+              <w:rPr>
+                <w:sz w:val="18"/>
+              </w:rPr>
+              <w:t>147</w:t>
+            </w:r>
+          </w:p>
+        </w:tc>
+        <w:tc>
+          <w:tcPr>
+            <w:tcW w:type="dxa" w:w="1080"/>
+          </w:tcPr>
+          <w:p>
+            <w:r>
+              <w:rPr>
+                <w:sz w:val="18"/>
+              </w:rPr>
+              <w:t>v1.1</w:t>
+            </w:r>
+          </w:p>
+        </w:tc>
+        <w:tc>
+          <w:tcPr>
+            <w:tcW w:type="dxa" w:w="1080"/>
+          </w:tcPr>
+          <w:p>
+            <w:r>
+              <w:rPr>
+                <w:sz w:val="18"/>
+              </w:rPr>
+              <w:t>—</w:t>
+            </w:r>
+          </w:p>
+        </w:tc>
+        <w:tc>
+          <w:tcPr>
+            <w:tcW w:type="dxa" w:w="1080"/>
+          </w:tcPr>
+          <w:p>
+            <w:r>
+              <w:rPr>
+                <w:sz w:val="18"/>
+              </w:rPr>
+              <w:t>HTTP Security Headers (helmet)</w:t>
+            </w:r>
+          </w:p>
+        </w:tc>
+        <w:tc>
+          <w:tcPr>
+            <w:tcW w:type="dxa" w:w="1080"/>
+          </w:tcPr>
+          <w:p>
+            <w:r>
+              <w:rPr>
+                <w:sz w:val="18"/>
+              </w:rPr>
+              <w:t>—</w:t>
+            </w:r>
+          </w:p>
+        </w:tc>
+        <w:tc>
+          <w:tcPr>
+            <w:tcW w:type="dxa" w:w="1080"/>
+          </w:tcPr>
+          <w:p>
+            <w:r>
+              <w:rPr>
+                <w:sz w:val="18"/>
+              </w:rPr>
+              <w:t>—</w:t>
+            </w:r>
+          </w:p>
+        </w:tc>
+        <w:tc>
+          <w:tcPr>
+            <w:tcW w:type="dxa" w:w="1080"/>
+          </w:tcPr>
+          <w:p>
+            <w:r>
+              <w:rPr>
+                <w:sz w:val="18"/>
+              </w:rPr>
+              <w:t>Umgesetzt</w:t>
+            </w:r>
+          </w:p>
+        </w:tc>
+        <w:tc>
+          <w:tcPr>
+            <w:tcW w:type="dxa" w:w="1080"/>
+          </w:tcPr>
+          <w:p>
+            <w:r>
+              <w:rPr>
+                <w:sz w:val="18"/>
+              </w:rPr>
+              <w:t>CSP, HSTS, X-Frame-Options, X-Content-Type-Options via helmet middleware.</w:t>
+            </w:r>
+          </w:p>
+        </w:tc>
+      </w:tr>
+      <w:tr>
+        <w:tc>
+          <w:tcPr>
+            <w:tcW w:type="dxa" w:w="1080"/>
+          </w:tcPr>
+          <w:p>
+            <w:r>
+              <w:rPr>
+                <w:sz w:val="18"/>
+              </w:rPr>
+              <w:t>148</w:t>
+            </w:r>
+          </w:p>
+        </w:tc>
+        <w:tc>
+          <w:tcPr>
+            <w:tcW w:type="dxa" w:w="1080"/>
+          </w:tcPr>
+          <w:p>
+            <w:r>
+              <w:rPr>
+                <w:sz w:val="18"/>
+              </w:rPr>
+              <w:t>v1.1</w:t>
+            </w:r>
+          </w:p>
+        </w:tc>
+        <w:tc>
+          <w:tcPr>
+            <w:tcW w:type="dxa" w:w="1080"/>
+          </w:tcPr>
+          <w:p>
+            <w:r>
+              <w:rPr>
+                <w:sz w:val="18"/>
+              </w:rPr>
+              <w:t>—</w:t>
+            </w:r>
+          </w:p>
+        </w:tc>
+        <w:tc>
+          <w:tcPr>
+            <w:tcW w:type="dxa" w:w="1080"/>
+          </w:tcPr>
+          <w:p>
+            <w:r>
+              <w:rPr>
+                <w:sz w:val="18"/>
+              </w:rPr>
+              <w:t>Audit auto-scoped nach Rolle</w:t>
+            </w:r>
+          </w:p>
+        </w:tc>
+        <w:tc>
+          <w:tcPr>
+            <w:tcW w:type="dxa" w:w="1080"/>
+          </w:tcPr>
+          <w:p>
+            <w:r>
+              <w:rPr>
+                <w:sz w:val="18"/>
+              </w:rPr>
+              <w:t>—</w:t>
+            </w:r>
+          </w:p>
+        </w:tc>
+        <w:tc>
+          <w:tcPr>
+            <w:tcW w:type="dxa" w:w="1080"/>
+          </w:tcPr>
+          <w:p>
+            <w:r>
+              <w:rPr>
+                <w:sz w:val="18"/>
+              </w:rPr>
+              <w:t>—</w:t>
+            </w:r>
+          </w:p>
+        </w:tc>
+        <w:tc>
+          <w:tcPr>
+            <w:tcW w:type="dxa" w:w="1080"/>
+          </w:tcPr>
+          <w:p>
+            <w:r>
+              <w:rPr>
+                <w:sz w:val="18"/>
+              </w:rPr>
+              <w:t>Umgesetzt</w:t>
+            </w:r>
+          </w:p>
+        </w:tc>
+        <w:tc>
+          <w:tcPr>
+            <w:tcW w:type="dxa" w:w="1080"/>
+          </w:tcPr>
+          <w:p>
+            <w:r>
+              <w:rPr>
+                <w:sz w:val="18"/>
+              </w:rPr>
+              <w:t>Nicht-Admins sehen nur eigene Audit-Eintraege. Admins sehen alle.</w:t>
+            </w:r>
+          </w:p>
+        </w:tc>
+      </w:tr>
+      <w:tr>
+        <w:tc>
+          <w:tcPr>
+            <w:tcW w:type="dxa" w:w="1080"/>
+          </w:tcPr>
+          <w:p>
+            <w:r>
+              <w:rPr>
+                <w:sz w:val="18"/>
+              </w:rPr>
+              <w:t>149</w:t>
+            </w:r>
+          </w:p>
+        </w:tc>
+        <w:tc>
+          <w:tcPr>
+            <w:tcW w:type="dxa" w:w="1080"/>
+          </w:tcPr>
+          <w:p>
+            <w:r>
+              <w:rPr>
+                <w:sz w:val="18"/>
+              </w:rPr>
+              <w:t>v1.1</w:t>
+            </w:r>
+          </w:p>
+        </w:tc>
+        <w:tc>
+          <w:tcPr>
+            <w:tcW w:type="dxa" w:w="1080"/>
+          </w:tcPr>
+          <w:p>
+            <w:r>
+              <w:rPr>
+                <w:sz w:val="18"/>
+              </w:rPr>
+              <w:t>—</w:t>
+            </w:r>
+          </w:p>
+        </w:tc>
+        <w:tc>
+          <w:tcPr>
+            <w:tcW w:type="dxa" w:w="1080"/>
+          </w:tcPr>
+          <w:p>
+            <w:r>
+              <w:rPr>
+                <w:sz w:val="18"/>
+              </w:rPr>
+              <w:t>FHIR-Proxy admin-only</w:t>
+            </w:r>
+          </w:p>
+        </w:tc>
+        <w:tc>
+          <w:tcPr>
+            <w:tcW w:type="dxa" w:w="1080"/>
+          </w:tcPr>
+          <w:p>
+            <w:r>
+              <w:rPr>
+                <w:sz w:val="18"/>
+              </w:rPr>
+              <w:t>—</w:t>
+            </w:r>
+          </w:p>
+        </w:tc>
+        <w:tc>
+          <w:tcPr>
+            <w:tcW w:type="dxa" w:w="1080"/>
+          </w:tcPr>
+          <w:p>
+            <w:r>
+              <w:rPr>
+                <w:sz w:val="18"/>
+              </w:rPr>
+              <w:t>—</w:t>
+            </w:r>
+          </w:p>
+        </w:tc>
+        <w:tc>
+          <w:tcPr>
+            <w:tcW w:type="dxa" w:w="1080"/>
+          </w:tcPr>
+          <w:p>
+            <w:r>
+              <w:rPr>
+                <w:sz w:val="18"/>
+              </w:rPr>
+              <w:t>Umgesetzt</w:t>
+            </w:r>
+          </w:p>
+        </w:tc>
+        <w:tc>
+          <w:tcPr>
+            <w:tcW w:type="dxa" w:w="1080"/>
+          </w:tcPr>
+          <w:p>
+            <w:r>
+              <w:rPr>
+                <w:sz w:val="18"/>
+              </w:rPr>
+              <w:t>/api/fhir-proxy nur fuer Administratoren. Verhindert Zentren-Bypass.</w:t>
+            </w:r>
+          </w:p>
+        </w:tc>
+      </w:tr>
+      <w:tr>
+        <w:tc>
+          <w:tcPr>
+            <w:tcW w:type="dxa" w:w="1080"/>
+          </w:tcPr>
+          <w:p>
+            <w:r>
+              <w:rPr>
+                <w:sz w:val="18"/>
+              </w:rPr>
+              <w:t>150</w:t>
+            </w:r>
+          </w:p>
+        </w:tc>
+        <w:tc>
+          <w:tcPr>
+            <w:tcW w:type="dxa" w:w="1080"/>
+          </w:tcPr>
+          <w:p>
+            <w:r>
+              <w:rPr>
+                <w:sz w:val="18"/>
+              </w:rPr>
+              <w:t>v1.1</w:t>
+            </w:r>
+          </w:p>
+        </w:tc>
+        <w:tc>
+          <w:tcPr>
+            <w:tcW w:type="dxa" w:w="1080"/>
+          </w:tcPr>
+          <w:p>
+            <w:r>
+              <w:rPr>
+                <w:sz w:val="18"/>
+              </w:rPr>
+              <w:t>—</w:t>
+            </w:r>
+          </w:p>
+        </w:tc>
+        <w:tc>
+          <w:tcPr>
+            <w:tcW w:type="dxa" w:w="1080"/>
+          </w:tcPr>
+          <w:p>
+            <w:r>
+              <w:rPr>
+                <w:sz w:val="18"/>
+              </w:rPr>
+              <w:t>Strikte Case-ID Validierung</w:t>
+            </w:r>
+          </w:p>
+        </w:tc>
+        <w:tc>
+          <w:tcPr>
+            <w:tcW w:type="dxa" w:w="1080"/>
+          </w:tcPr>
+          <w:p>
+            <w:r>
+              <w:rPr>
+                <w:sz w:val="18"/>
+              </w:rPr>
+              <w:t>—</w:t>
+            </w:r>
+          </w:p>
+        </w:tc>
+        <w:tc>
+          <w:tcPr>
+            <w:tcW w:type="dxa" w:w="1080"/>
+          </w:tcPr>
+          <w:p>
+            <w:r>
+              <w:rPr>
+                <w:sz w:val="18"/>
+              </w:rPr>
+              <w:t>—</w:t>
+            </w:r>
+          </w:p>
+        </w:tc>
+        <w:tc>
+          <w:tcPr>
+            <w:tcW w:type="dxa" w:w="1080"/>
+          </w:tcPr>
+          <w:p>
+            <w:r>
+              <w:rPr>
+                <w:sz w:val="18"/>
+              </w:rPr>
+              <w:t>Umgesetzt</w:t>
+            </w:r>
+          </w:p>
+        </w:tc>
+        <w:tc>
+          <w:tcPr>
+            <w:tcW w:type="dxa" w:w="1080"/>
+          </w:tcPr>
+          <w:p>
+            <w:r>
+              <w:rPr>
+                <w:sz w:val="18"/>
+              </w:rPr>
+              <w:t>Unbekannte Case-IDs bei Schreiboperationen abgelehnt (H-10).</w:t>
+            </w:r>
+          </w:p>
+        </w:tc>
+      </w:tr>
+      <w:tr>
+        <w:tc>
+          <w:tcPr>
+            <w:tcW w:type="dxa" w:w="1080"/>
+          </w:tcPr>
+          <w:p>
+            <w:r>
+              <w:rPr>
+                <w:sz w:val="18"/>
+              </w:rPr>
+              <w:t>151</w:t>
+            </w:r>
+          </w:p>
+        </w:tc>
+        <w:tc>
+          <w:tcPr>
+            <w:tcW w:type="dxa" w:w="1080"/>
+          </w:tcPr>
+          <w:p>
+            <w:r>
+              <w:rPr>
+                <w:sz w:val="18"/>
+              </w:rPr>
+              <w:t>v1.1</w:t>
+            </w:r>
+          </w:p>
+        </w:tc>
+        <w:tc>
+          <w:tcPr>
+            <w:tcW w:type="dxa" w:w="1080"/>
+          </w:tcPr>
+          <w:p>
+            <w:r>
+              <w:rPr>
+                <w:sz w:val="18"/>
+              </w:rPr>
+              <w:t>—</w:t>
+            </w:r>
+          </w:p>
+        </w:tc>
+        <w:tc>
+          <w:tcPr>
+            <w:tcW w:type="dxa" w:w="1080"/>
+          </w:tcPr>
+          <w:p>
+            <w:r>
+              <w:rPr>
+                <w:sz w:val="18"/>
+              </w:rPr>
+              <w:t>Async bcrypt (nicht-blockierend)</w:t>
+            </w:r>
+          </w:p>
+        </w:tc>
+        <w:tc>
+          <w:tcPr>
+            <w:tcW w:type="dxa" w:w="1080"/>
+          </w:tcPr>
+          <w:p>
+            <w:r>
+              <w:rPr>
+                <w:sz w:val="18"/>
+              </w:rPr>
+              <w:t>—</w:t>
+            </w:r>
+          </w:p>
+        </w:tc>
+        <w:tc>
+          <w:tcPr>
+            <w:tcW w:type="dxa" w:w="1080"/>
+          </w:tcPr>
+          <w:p>
+            <w:r>
+              <w:rPr>
+                <w:sz w:val="18"/>
+              </w:rPr>
+              <w:t>—</w:t>
+            </w:r>
+          </w:p>
+        </w:tc>
+        <w:tc>
+          <w:tcPr>
+            <w:tcW w:type="dxa" w:w="1080"/>
+          </w:tcPr>
+          <w:p>
+            <w:r>
+              <w:rPr>
+                <w:sz w:val="18"/>
+              </w:rPr>
+              <w:t>Umgesetzt</w:t>
+            </w:r>
+          </w:p>
+        </w:tc>
+        <w:tc>
+          <w:tcPr>
+            <w:tcW w:type="dxa" w:w="1080"/>
+          </w:tcPr>
+          <w:p>
+            <w:r>
+              <w:rPr>
+                <w:sz w:val="18"/>
+              </w:rPr>
+              <w:t>bcrypt.compare/hash async. Event Loop nicht mehr blockiert.</w:t>
+            </w:r>
+          </w:p>
+        </w:tc>
+      </w:tr>
+      <w:tr>
+        <w:tc>
+          <w:tcPr>
+            <w:tcW w:type="dxa" w:w="1080"/>
+          </w:tcPr>
+          <w:p>
+            <w:r>
+              <w:rPr>
+                <w:sz w:val="18"/>
+              </w:rPr>
+              <w:t>152</w:t>
+            </w:r>
+          </w:p>
+        </w:tc>
+        <w:tc>
+          <w:tcPr>
+            <w:tcW w:type="dxa" w:w="1080"/>
+          </w:tcPr>
+          <w:p>
+            <w:r>
+              <w:rPr>
+                <w:sz w:val="18"/>
+              </w:rPr>
+              <w:t>v1.1</w:t>
+            </w:r>
+          </w:p>
+        </w:tc>
+        <w:tc>
+          <w:tcPr>
+            <w:tcW w:type="dxa" w:w="1080"/>
+          </w:tcPr>
+          <w:p>
+            <w:r>
+              <w:rPr>
+                <w:sz w:val="18"/>
+              </w:rPr>
+              <w:t>—</w:t>
+            </w:r>
+          </w:p>
+        </w:tc>
+        <w:tc>
+          <w:tcPr>
+            <w:tcW w:type="dxa" w:w="1080"/>
+          </w:tcPr>
+          <w:p>
+            <w:r>
+              <w:rPr>
+                <w:sz w:val="18"/>
+              </w:rPr>
+              <w:t>Audit Body-Erfassung</w:t>
+            </w:r>
+          </w:p>
+        </w:tc>
+        <w:tc>
+          <w:tcPr>
+            <w:tcW w:type="dxa" w:w="1080"/>
+          </w:tcPr>
+          <w:p>
+            <w:r>
+              <w:rPr>
+                <w:sz w:val="18"/>
+              </w:rPr>
+              <w:t>—</w:t>
+            </w:r>
+          </w:p>
+        </w:tc>
+        <w:tc>
+          <w:tcPr>
+            <w:tcW w:type="dxa" w:w="1080"/>
+          </w:tcPr>
+          <w:p>
+            <w:r>
+              <w:rPr>
+                <w:sz w:val="18"/>
+              </w:rPr>
+              <w:t>—</w:t>
+            </w:r>
+          </w:p>
+        </w:tc>
+        <w:tc>
+          <w:tcPr>
+            <w:tcW w:type="dxa" w:w="1080"/>
+          </w:tcPr>
+          <w:p>
+            <w:r>
+              <w:rPr>
+                <w:sz w:val="18"/>
+              </w:rPr>
+              <w:t>Umgesetzt</w:t>
+            </w:r>
+          </w:p>
+        </w:tc>
+        <w:tc>
+          <w:tcPr>
+            <w:tcW w:type="dxa" w:w="1080"/>
+          </w:tcPr>
+          <w:p>
+            <w:r>
+              <w:rPr>
+                <w:sz w:val="18"/>
+              </w:rPr>
+              <w:t>readBody() setzt _capturedBody fuer Audit-Protokollierung von Mutationen.</w:t>
+            </w:r>
+          </w:p>
+        </w:tc>
+      </w:tr>
+      <w:tr>
+        <w:tc>
+          <w:tcPr>
+            <w:tcW w:type="dxa" w:w="1080"/>
+          </w:tcPr>
+          <w:p>
+            <w:r>
+              <w:rPr>
+                <w:sz w:val="18"/>
+              </w:rPr>
+              <w:t>153</w:t>
+            </w:r>
+          </w:p>
+        </w:tc>
+        <w:tc>
+          <w:tcPr>
+            <w:tcW w:type="dxa" w:w="1080"/>
+          </w:tcPr>
+          <w:p>
+            <w:r>
+              <w:rPr>
+                <w:sz w:val="18"/>
+              </w:rPr>
+              <w:t>v1.1</w:t>
+            </w:r>
+          </w:p>
+        </w:tc>
+        <w:tc>
+          <w:tcPr>
+            <w:tcW w:type="dxa" w:w="1080"/>
+          </w:tcPr>
+          <w:p>
+            <w:r>
+              <w:rPr>
+                <w:sz w:val="18"/>
+              </w:rPr>
+              <w:t>—</w:t>
+            </w:r>
+          </w:p>
+        </w:tc>
+        <w:tc>
+          <w:tcPr>
+            <w:tcW w:type="dxa" w:w="1080"/>
+          </w:tcPr>
+          <w:p>
+            <w:r>
+              <w:rPr>
+                <w:sz w:val="18"/>
+              </w:rPr>
+              <w:t>Global 401 Interceptor</w:t>
+            </w:r>
+          </w:p>
+        </w:tc>
+        <w:tc>
+          <w:tcPr>
+            <w:tcW w:type="dxa" w:w="1080"/>
+          </w:tcPr>
+          <w:p>
+            <w:r>
+              <w:rPr>
+                <w:sz w:val="18"/>
+              </w:rPr>
+              <w:t>—</w:t>
+            </w:r>
+          </w:p>
+        </w:tc>
+        <w:tc>
+          <w:tcPr>
+            <w:tcW w:type="dxa" w:w="1080"/>
+          </w:tcPr>
+          <w:p>
+            <w:r>
+              <w:rPr>
+                <w:sz w:val="18"/>
+              </w:rPr>
+              <w:t>—</w:t>
+            </w:r>
+          </w:p>
+        </w:tc>
+        <w:tc>
+          <w:tcPr>
+            <w:tcW w:type="dxa" w:w="1080"/>
+          </w:tcPr>
+          <w:p>
+            <w:r>
+              <w:rPr>
+                <w:sz w:val="18"/>
+              </w:rPr>
+              <w:t>Umgesetzt</w:t>
+            </w:r>
+          </w:p>
+        </w:tc>
+        <w:tc>
+          <w:tcPr>
+            <w:tcW w:type="dxa" w:w="1080"/>
+          </w:tcPr>
+          <w:p>
+            <w:r>
+              <w:rPr>
+                <w:sz w:val="18"/>
+              </w:rPr>
+              <w:t>authFetch() leitet bei abgelaufenem JWT automatisch zur Login-Seite.</w:t>
+            </w:r>
+          </w:p>
+        </w:tc>
+      </w:tr>
+      <w:tr>
+        <w:tc>
+          <w:tcPr>
+            <w:tcW w:type="dxa" w:w="1080"/>
+          </w:tcPr>
+          <w:p>
+            <w:r>
+              <w:rPr>
+                <w:sz w:val="18"/>
+              </w:rPr>
+              <w:t>154</w:t>
+            </w:r>
+          </w:p>
+        </w:tc>
+        <w:tc>
+          <w:tcPr>
+            <w:tcW w:type="dxa" w:w="1080"/>
+          </w:tcPr>
+          <w:p>
+            <w:r>
+              <w:rPr>
+                <w:sz w:val="18"/>
+              </w:rPr>
+              <w:t>v1.1</w:t>
+            </w:r>
+          </w:p>
+        </w:tc>
+        <w:tc>
+          <w:tcPr>
+            <w:tcW w:type="dxa" w:w="1080"/>
+          </w:tcPr>
+          <w:p>
+            <w:r>
+              <w:rPr>
+                <w:sz w:val="18"/>
+              </w:rPr>
+              <w:t>—</w:t>
+            </w:r>
+          </w:p>
+        </w:tc>
+        <w:tc>
+          <w:tcPr>
+            <w:tcW w:type="dxa" w:w="1080"/>
+          </w:tcPr>
+          <w:p>
+            <w:r>
+              <w:rPr>
+                <w:sz w:val="18"/>
+              </w:rPr>
+              <w:t>Express Router Refactoring</w:t>
+            </w:r>
+          </w:p>
+        </w:tc>
+        <w:tc>
+          <w:tcPr>
+            <w:tcW w:type="dxa" w:w="1080"/>
+          </w:tcPr>
+          <w:p>
+            <w:r>
+              <w:rPr>
+                <w:sz w:val="18"/>
+              </w:rPr>
+              <w:t>—</w:t>
+            </w:r>
+          </w:p>
+        </w:tc>
+        <w:tc>
+          <w:tcPr>
+            <w:tcW w:type="dxa" w:w="1080"/>
+          </w:tcPr>
+          <w:p>
+            <w:r>
+              <w:rPr>
+                <w:sz w:val="18"/>
+              </w:rPr>
+              <w:t>—</w:t>
+            </w:r>
+          </w:p>
+        </w:tc>
+        <w:tc>
+          <w:tcPr>
+            <w:tcW w:type="dxa" w:w="1080"/>
+          </w:tcPr>
+          <w:p>
+            <w:r>
+              <w:rPr>
+                <w:sz w:val="18"/>
+              </w:rPr>
+              <w:t>Umgesetzt</w:t>
+            </w:r>
+          </w:p>
+        </w:tc>
+        <w:tc>
+          <w:tcPr>
+            <w:tcW w:type="dxa" w:w="1080"/>
+          </w:tcPr>
+          <w:p>
+            <w:r>
+              <w:rPr>
+                <w:sz w:val="18"/>
+              </w:rPr>
+              <w:t>issueApi + settingsApi von duplizierten Handlern zu Express Router mit geteilter Kernlogik.</w:t>
+            </w:r>
+          </w:p>
+        </w:tc>
+      </w:tr>
+      <w:tr>
+        <w:tc>
+          <w:tcPr>
+            <w:tcW w:type="dxa" w:w="1080"/>
+          </w:tcPr>
+          <w:p>
+            <w:r>
+              <w:rPr>
+                <w:sz w:val="18"/>
+              </w:rPr>
+              <w:t>155</w:t>
+            </w:r>
+          </w:p>
+        </w:tc>
+        <w:tc>
+          <w:tcPr>
+            <w:tcW w:type="dxa" w:w="1080"/>
+          </w:tcPr>
+          <w:p>
+            <w:r>
+              <w:rPr>
+                <w:sz w:val="18"/>
+              </w:rPr>
+              <w:t>v1.1</w:t>
+            </w:r>
+          </w:p>
+        </w:tc>
+        <w:tc>
+          <w:tcPr>
+            <w:tcW w:type="dxa" w:w="1080"/>
+          </w:tcPr>
+          <w:p>
+            <w:r>
+              <w:rPr>
+                <w:sz w:val="18"/>
+              </w:rPr>
+              <w:t>—</w:t>
+            </w:r>
+          </w:p>
+        </w:tc>
+        <w:tc>
+          <w:tcPr>
+            <w:tcW w:type="dxa" w:w="1080"/>
+          </w:tcPr>
+          <w:p>
+            <w:r>
+              <w:rPr>
+                <w:sz w:val="18"/>
+              </w:rPr>
+              <w:t>QualityFlag ID Persistenz</w:t>
+            </w:r>
+          </w:p>
+        </w:tc>
+        <w:tc>
+          <w:tcPr>
+            <w:tcW w:type="dxa" w:w="1080"/>
+          </w:tcPr>
+          <w:p>
+            <w:r>
+              <w:rPr>
+                <w:sz w:val="18"/>
+              </w:rPr>
+              <w:t>—</w:t>
+            </w:r>
+          </w:p>
+        </w:tc>
+        <w:tc>
+          <w:tcPr>
+            <w:tcW w:type="dxa" w:w="1080"/>
+          </w:tcPr>
+          <w:p>
+            <w:r>
+              <w:rPr>
+                <w:sz w:val="18"/>
+              </w:rPr>
+              <w:t>—</w:t>
+            </w:r>
+          </w:p>
+        </w:tc>
+        <w:tc>
+          <w:tcPr>
+            <w:tcW w:type="dxa" w:w="1080"/>
+          </w:tcPr>
+          <w:p>
+            <w:r>
+              <w:rPr>
+                <w:sz w:val="18"/>
+              </w:rPr>
+              <w:t>Umgesetzt</w:t>
+            </w:r>
+          </w:p>
+        </w:tc>
+        <w:tc>
+          <w:tcPr>
+            <w:tcW w:type="dxa" w:w="1080"/>
+          </w:tcPr>
+          <w:p>
+            <w:r>
+              <w:rPr>
+                <w:sz w:val="18"/>
+              </w:rPr>
+              <w:t>QualityFlag-Typ mit optionalem id-Feld. Server-UUIDs bleiben erhalten.</w:t>
+            </w:r>
+          </w:p>
+        </w:tc>
+      </w:tr>
+      <w:tr>
+        <w:tc>
+          <w:tcPr>
+            <w:tcW w:type="dxa" w:w="1080"/>
+          </w:tcPr>
+          <w:p>
+            <w:r>
+              <w:rPr>
+                <w:sz w:val="18"/>
+              </w:rPr>
+              <w:t>156</w:t>
+            </w:r>
+          </w:p>
+        </w:tc>
+        <w:tc>
+          <w:tcPr>
+            <w:tcW w:type="dxa" w:w="1080"/>
+          </w:tcPr>
+          <w:p>
+            <w:r>
+              <w:rPr>
+                <w:sz w:val="18"/>
+              </w:rPr>
+              <w:t>v1.1</w:t>
+            </w:r>
+          </w:p>
+        </w:tc>
+        <w:tc>
+          <w:tcPr>
+            <w:tcW w:type="dxa" w:w="1080"/>
+          </w:tcPr>
+          <w:p>
+            <w:r>
+              <w:rPr>
+                <w:sz w:val="18"/>
+              </w:rPr>
+              <w:t>—</w:t>
+            </w:r>
+          </w:p>
+        </w:tc>
+        <w:tc>
+          <w:tcPr>
+            <w:tcW w:type="dxa" w:w="1080"/>
+          </w:tcPr>
+          <w:p>
+            <w:r>
+              <w:rPr>
+                <w:sz w:val="18"/>
+              </w:rPr>
+              <w:t>Zentren-API</w:t>
+            </w:r>
+          </w:p>
+        </w:tc>
+        <w:tc>
+          <w:tcPr>
+            <w:tcW w:type="dxa" w:w="1080"/>
+          </w:tcPr>
+          <w:p>
+            <w:r>
+              <w:rPr>
+                <w:sz w:val="18"/>
+              </w:rPr>
+              <w:t>—</w:t>
+            </w:r>
+          </w:p>
+        </w:tc>
+        <w:tc>
+          <w:tcPr>
+            <w:tcW w:type="dxa" w:w="1080"/>
+          </w:tcPr>
+          <w:p>
+            <w:r>
+              <w:rPr>
+                <w:sz w:val="18"/>
+              </w:rPr>
+              <w:t>—</w:t>
+            </w:r>
+          </w:p>
+        </w:tc>
+        <w:tc>
+          <w:tcPr>
+            <w:tcW w:type="dxa" w:w="1080"/>
+          </w:tcPr>
+          <w:p>
+            <w:r>
+              <w:rPr>
+                <w:sz w:val="18"/>
+              </w:rPr>
+              <w:t>Umgesetzt</w:t>
+            </w:r>
+          </w:p>
+        </w:tc>
+        <w:tc>
+          <w:tcPr>
+            <w:tcW w:type="dxa" w:w="1080"/>
+          </w:tcPr>
+          <w:p>
+            <w:r>
+              <w:rPr>
+                <w:sz w:val="18"/>
+              </w:rPr>
+              <w:t>GET /api/fhir/centers liefert Zentrenliste. Client laedt Kurzbezeichnungen vom Server.</w:t>
+            </w:r>
+          </w:p>
+        </w:tc>
+      </w:tr>
     </w:tbl>
     <w:p>
       <w:pPr>
@@ -17756,7 +18816,7 @@
           </w:tcPr>
           <w:p>
             <w:r>
-              <w:t>101</w:t>
+              <w:t>111</w:t>
             </w:r>
           </w:p>
         </w:tc>
@@ -17766,7 +18826,7 @@
           </w:tcPr>
           <w:p>
             <w:r>
-              <w:t>85%</w:t>
+              <w:t>87%</w:t>
             </w:r>
           </w:p>
         </w:tc>
@@ -17901,7 +18961,7 @@
           </w:tcPr>
           <w:p>
             <w:r>
-              <w:t>118</w:t>
+              <w:t>128</w:t>
             </w:r>
           </w:p>
         </w:tc>
@@ -17919,7 +18979,7 @@
     </w:tbl>
     <w:p>
       <w:r>
-        <w:t>Zusätzlich wurden 7 Features implementiert, die über die Lastenheft-Anforderungen hinausgehen. Darüber hinaus wurden heute 15 weitere Features durch AI-gestütztes Prompting hinzugefügt, davon 5 zur Schließung offener Lastenheft-Anforderungen (N05.19, N05.31, N05.32, N05.33, N05.35). Im Rahmen von v1.1 wurden 12 weitere Features zur Frontend-Backend-Integration und Sicherheitshärtung hinzugefügt (Nr. 135–146).</w:t>
+        <w:t>Zusätzlich wurden 7 Features implementiert, die über die Lastenheft-Anforderungen hinausgehen. Darüber hinaus wurden heute 15 weitere Features durch AI-gestütztes Prompting hinzugefügt, davon 5 zur Schließung offener Lastenheft-Anforderungen (N05.19, N05.31, N05.32, N05.33, N05.35). Im Rahmen von v1.1 wurden 22 weitere Features zur Frontend-Backend-Integration, Sicherheitshärtung und Architektur-Refactoring hinzugefügt (Nr. 135–156).</w:t>
       </w:r>
     </w:p>
     <w:p>
@@ -18063,6 +19123,48 @@
       </w:pPr>
       <w:r>
         <w:t>Zusammenfassung: 101 umgesetzt (85%), 8 teilweise, 3 abweichend, 6 nicht umgesetzt</w:t>
+      </w:r>
+    </w:p>
+    <w:p/>
+    <w:p>
+      <w:r>
+        <w:rPr>
+          <w:b/>
+          <w:sz w:val="22"/>
+        </w:rPr>
+        <w:t>Änderungen in Version 3.1 (Security Review Fixes, 11.04.2026)</w:t>
+      </w:r>
+    </w:p>
+    <w:p>
+      <w:pPr>
+        <w:pStyle w:val="ListBullet"/>
+      </w:pPr>
+      <w:r>
+        <w:t>Nr. 147–156: 10 weitere Security-Review-Fixes (helmet, Audit-Scoping, FHIR-Proxy, bcrypt async, etc.)</w:t>
+      </w:r>
+    </w:p>
+    <w:p>
+      <w:pPr>
+        <w:pStyle w:val="ListBullet"/>
+      </w:pPr>
+      <w:r>
+        <w:t>Zusammenfassung: 111 umgesetzt (87%), 8 teilweise, 3 abweichend, 6 nicht umgesetzt</w:t>
+      </w:r>
+    </w:p>
+    <w:p>
+      <w:pPr>
+        <w:pStyle w:val="ListBullet"/>
+      </w:pPr>
+      <w:r>
+        <w:t>Express Router Refactoring: Code-Duplizierung zwischen Produktion und Entwicklung eliminiert</w:t>
+      </w:r>
+    </w:p>
+    <w:p>
+      <w:pPr>
+        <w:pStyle w:val="ListBullet"/>
+      </w:pPr>
+      <w:r>
+        <w:t>Zentren-API: GET /api/fhir/centers — Client laedt Kurzbezeichnungen vom Server statt hardcoded</w:t>
       </w:r>
     </w:p>
     <w:sectPr>

</xml_diff>

<commit_message>
docs: F-11/F-34 — update Pflichtenheft to reflect 6-role model
Pflichtenheft:
- Section 3.2.2: Replace "einheitliche Nutzerrolle" with 6-role model
  (admin, researcher, epidemiologist, clinician, data_manager, clinic_lead)
  with center-based data restriction
- Section 5.2: Replace 2-row Berechtigungskonzept table with 6-row matrix
  covering clinical data, doc quality, user admin, system admin per role

Anforderungsabgleich v3.2:
- N10.01 remark updated to reference 6-role model
- Changelog entry for F-11/F-34

Co-Authored-By: Claude Opus 4.6 (1M context) <noreply@anthropic.com>
</commit_message>
<xml_diff>
--- a/docs/Anforderungsabgleich_EyeMatics.docx
+++ b/docs/Anforderungsabgleich_EyeMatics.docx
@@ -18,7 +18,7 @@
         <w:rPr>
           <w:b/>
         </w:rPr>
-        <w:t>Stand: 11.04.2026 — Version 3.1</w:t>
+        <w:t>Stand: 11.04.2026 — Version 3.2</w:t>
       </w:r>
     </w:p>
     <w:p>
@@ -19165,6 +19165,40 @@
       </w:pPr>
       <w:r>
         <w:t>Zentren-API: GET /api/fhir/centers — Client laedt Kurzbezeichnungen vom Server statt hardcoded</w:t>
+      </w:r>
+    </w:p>
+    <w:p/>
+    <w:p>
+      <w:r>
+        <w:rPr>
+          <w:b/>
+          <w:sz w:val="22"/>
+        </w:rPr>
+        <w:t>Aenderungen in Version 3.2 (Pflichtenheft-Aktualisierung, 11.04.2026)</w:t>
+      </w:r>
+    </w:p>
+    <w:p>
+      <w:pPr>
+        <w:pStyle w:val="ListBullet"/>
+      </w:pPr>
+      <w:r>
+        <w:t>F-11: Pflichtenheft Abschnitt 3.2.2 aktualisiert — 6-Rollen-Modell statt "einheitliche Nutzerrolle"</w:t>
+      </w:r>
+    </w:p>
+    <w:p>
+      <w:pPr>
+        <w:pStyle w:val="ListBullet"/>
+      </w:pPr>
+      <w:r>
+        <w:t>F-34: Pflichtenheft Berechtigungskonzept (5.2) aktualisiert — 6x4 Berechtigungsmatrix mit Zentrenzuordnung</w:t>
+      </w:r>
+    </w:p>
+    <w:p>
+      <w:pPr>
+        <w:pStyle w:val="ListBullet"/>
+      </w:pPr>
+      <w:r>
+        <w:t>N10.01: Bemerkung aktualisiert — differenziertes Rollenmodell mit 6 Rollen</w:t>
       </w:r>
     </w:p>
     <w:sectPr>

</xml_diff>

<commit_message>
feat: v1.6 Outcomes Polish & Scale
4 phases, 19 plans, 429 tests. VQA + PII hardening + server aggregation + CRT/Interval/Responder metrics.
</commit_message>
<xml_diff>
--- a/docs/Anforderungsabgleich_EyeMatics.docx
+++ b/docs/Anforderungsabgleich_EyeMatics.docx
@@ -18,7 +18,7 @@
         <w:rPr>
           <w:b/>
         </w:rPr>
-        <w:t>Stand: 09.04.2026 — Version 2.2</w:t>
+        <w:t>Stand: 11.04.2026 — Version 3.2</w:t>
       </w:r>
     </w:p>
     <w:p>
@@ -969,7 +969,7 @@
               <w:rPr>
                 <w:sz w:val="16"/>
               </w:rPr>
-              <w:t>Differenzierte Meldungen: Nutzer unbekannt, falsches Passwort, ungültiger OTP</w:t>
+              <w:t>Generische Fehlermeldung (verhindert Username-Enumeration). OTP-Fehler leitet zum Passwort-Schritt zurück</w:t>
             </w:r>
           </w:p>
         </w:tc>
@@ -12985,7 +12985,7 @@
               <w:rPr>
                 <w:sz w:val="16"/>
               </w:rPr>
-              <w:t>Create/Delete in AdminPage, persistiert in localStorage</w:t>
+              <w:t>Create/Delete in AdminPage, serverseitig in users.json persistiert</w:t>
             </w:r>
           </w:p>
         </w:tc>
@@ -16284,6 +16284,2434 @@
           </w:p>
         </w:tc>
       </w:tr>
+      <w:tr>
+        <w:tc>
+          <w:tcPr>
+            <w:tcW w:type="dxa" w:w="1080"/>
+          </w:tcPr>
+          <w:p>
+            <w:pPr/>
+            <w:r>
+              <w:rPr>
+                <w:sz w:val="18"/>
+              </w:rPr>
+              <w:t>135</w:t>
+            </w:r>
+          </w:p>
+        </w:tc>
+        <w:tc>
+          <w:tcPr>
+            <w:tcW w:type="dxa" w:w="1080"/>
+          </w:tcPr>
+          <w:p>
+            <w:pPr/>
+            <w:r>
+              <w:rPr>
+                <w:sz w:val="18"/>
+              </w:rPr>
+              <w:t>v1.1</w:t>
+            </w:r>
+          </w:p>
+        </w:tc>
+        <w:tc>
+          <w:tcPr>
+            <w:tcW w:type="dxa" w:w="1080"/>
+          </w:tcPr>
+          <w:p>
+            <w:pPr/>
+            <w:r>
+              <w:rPr>
+                <w:sz w:val="18"/>
+              </w:rPr>
+              <w:t>—</w:t>
+            </w:r>
+          </w:p>
+        </w:tc>
+        <w:tc>
+          <w:tcPr>
+            <w:tcW w:type="dxa" w:w="1080"/>
+          </w:tcPr>
+          <w:p>
+            <w:pPr/>
+            <w:r>
+              <w:rPr>
+                <w:sz w:val="18"/>
+              </w:rPr>
+              <w:t>Server-backed JWT Auth</w:t>
+            </w:r>
+          </w:p>
+        </w:tc>
+        <w:tc>
+          <w:tcPr>
+            <w:tcW w:type="dxa" w:w="1080"/>
+          </w:tcPr>
+          <w:p>
+            <w:pPr/>
+            <w:r>
+              <w:rPr>
+                <w:sz w:val="18"/>
+              </w:rPr>
+              <w:t>—</w:t>
+            </w:r>
+          </w:p>
+        </w:tc>
+        <w:tc>
+          <w:tcPr>
+            <w:tcW w:type="dxa" w:w="1080"/>
+          </w:tcPr>
+          <w:p>
+            <w:pPr/>
+            <w:r>
+              <w:rPr>
+                <w:sz w:val="18"/>
+              </w:rPr>
+              <w:t>—</w:t>
+            </w:r>
+          </w:p>
+        </w:tc>
+        <w:tc>
+          <w:tcPr>
+            <w:tcW w:type="dxa" w:w="1080"/>
+          </w:tcPr>
+          <w:p>
+            <w:pPr/>
+            <w:r>
+              <w:rPr>
+                <w:sz w:val="18"/>
+              </w:rPr>
+              <w:t>Umgesetzt</w:t>
+            </w:r>
+          </w:p>
+        </w:tc>
+        <w:tc>
+          <w:tcPr>
+            <w:tcW w:type="dxa" w:w="1080"/>
+          </w:tcPr>
+          <w:p>
+            <w:pPr/>
+            <w:r>
+              <w:rPr>
+                <w:sz w:val="18"/>
+              </w:rPr>
+              <w:t>AuthContext → POST /api/auth/login + /api/auth/verify. JWT in sessionStorage. Keine Credentials im Client-Bundle.</w:t>
+            </w:r>
+          </w:p>
+        </w:tc>
+      </w:tr>
+      <w:tr>
+        <w:tc>
+          <w:tcPr>
+            <w:tcW w:type="dxa" w:w="1080"/>
+          </w:tcPr>
+          <w:p>
+            <w:pPr/>
+            <w:r>
+              <w:rPr>
+                <w:sz w:val="18"/>
+              </w:rPr>
+              <w:t>136</w:t>
+            </w:r>
+          </w:p>
+        </w:tc>
+        <w:tc>
+          <w:tcPr>
+            <w:tcW w:type="dxa" w:w="1080"/>
+          </w:tcPr>
+          <w:p>
+            <w:pPr/>
+            <w:r>
+              <w:rPr>
+                <w:sz w:val="18"/>
+              </w:rPr>
+              <w:t>v1.1</w:t>
+            </w:r>
+          </w:p>
+        </w:tc>
+        <w:tc>
+          <w:tcPr>
+            <w:tcW w:type="dxa" w:w="1080"/>
+          </w:tcPr>
+          <w:p>
+            <w:pPr/>
+            <w:r>
+              <w:rPr>
+                <w:sz w:val="18"/>
+              </w:rPr>
+              <w:t>—</w:t>
+            </w:r>
+          </w:p>
+        </w:tc>
+        <w:tc>
+          <w:tcPr>
+            <w:tcW w:type="dxa" w:w="1080"/>
+          </w:tcPr>
+          <w:p>
+            <w:pPr/>
+            <w:r>
+              <w:rPr>
+                <w:sz w:val="18"/>
+              </w:rPr>
+              <w:t>Frontend-Backend DataContext</w:t>
+            </w:r>
+          </w:p>
+        </w:tc>
+        <w:tc>
+          <w:tcPr>
+            <w:tcW w:type="dxa" w:w="1080"/>
+          </w:tcPr>
+          <w:p>
+            <w:pPr/>
+            <w:r>
+              <w:rPr>
+                <w:sz w:val="18"/>
+              </w:rPr>
+              <w:t>—</w:t>
+            </w:r>
+          </w:p>
+        </w:tc>
+        <w:tc>
+          <w:tcPr>
+            <w:tcW w:type="dxa" w:w="1080"/>
+          </w:tcPr>
+          <w:p>
+            <w:pPr/>
+            <w:r>
+              <w:rPr>
+                <w:sz w:val="18"/>
+              </w:rPr>
+              <w:t>—</w:t>
+            </w:r>
+          </w:p>
+        </w:tc>
+        <w:tc>
+          <w:tcPr>
+            <w:tcW w:type="dxa" w:w="1080"/>
+          </w:tcPr>
+          <w:p>
+            <w:pPr/>
+            <w:r>
+              <w:rPr>
+                <w:sz w:val="18"/>
+              </w:rPr>
+              <w:t>Umgesetzt</w:t>
+            </w:r>
+          </w:p>
+        </w:tc>
+        <w:tc>
+          <w:tcPr>
+            <w:tcW w:type="dxa" w:w="1080"/>
+          </w:tcPr>
+          <w:p>
+            <w:pPr/>
+            <w:r>
+              <w:rPr>
+                <w:sz w:val="18"/>
+              </w:rPr>
+              <w:t>DataContext lädt von /api/data/*. localStorage entfernt.</w:t>
+            </w:r>
+          </w:p>
+        </w:tc>
+      </w:tr>
+      <w:tr>
+        <w:tc>
+          <w:tcPr>
+            <w:tcW w:type="dxa" w:w="1080"/>
+          </w:tcPr>
+          <w:p>
+            <w:pPr/>
+            <w:r>
+              <w:rPr>
+                <w:sz w:val="18"/>
+              </w:rPr>
+              <w:t>137</w:t>
+            </w:r>
+          </w:p>
+        </w:tc>
+        <w:tc>
+          <w:tcPr>
+            <w:tcW w:type="dxa" w:w="1080"/>
+          </w:tcPr>
+          <w:p>
+            <w:pPr/>
+            <w:r>
+              <w:rPr>
+                <w:sz w:val="18"/>
+              </w:rPr>
+              <w:t>v1.1</w:t>
+            </w:r>
+          </w:p>
+        </w:tc>
+        <w:tc>
+          <w:tcPr>
+            <w:tcW w:type="dxa" w:w="1080"/>
+          </w:tcPr>
+          <w:p>
+            <w:pPr/>
+            <w:r>
+              <w:rPr>
+                <w:sz w:val="18"/>
+              </w:rPr>
+              <w:t>—</w:t>
+            </w:r>
+          </w:p>
+        </w:tc>
+        <w:tc>
+          <w:tcPr>
+            <w:tcW w:type="dxa" w:w="1080"/>
+          </w:tcPr>
+          <w:p>
+            <w:pPr/>
+            <w:r>
+              <w:rPr>
+                <w:sz w:val="18"/>
+              </w:rPr>
+              <w:t>Server-side Audit (immutable)</w:t>
+            </w:r>
+          </w:p>
+        </w:tc>
+        <w:tc>
+          <w:tcPr>
+            <w:tcW w:type="dxa" w:w="1080"/>
+          </w:tcPr>
+          <w:p>
+            <w:pPr/>
+            <w:r>
+              <w:rPr>
+                <w:sz w:val="18"/>
+              </w:rPr>
+              <w:t>—</w:t>
+            </w:r>
+          </w:p>
+        </w:tc>
+        <w:tc>
+          <w:tcPr>
+            <w:tcW w:type="dxa" w:w="1080"/>
+          </w:tcPr>
+          <w:p>
+            <w:pPr/>
+            <w:r>
+              <w:rPr>
+                <w:sz w:val="18"/>
+              </w:rPr>
+              <w:t>—</w:t>
+            </w:r>
+          </w:p>
+        </w:tc>
+        <w:tc>
+          <w:tcPr>
+            <w:tcW w:type="dxa" w:w="1080"/>
+          </w:tcPr>
+          <w:p>
+            <w:pPr/>
+            <w:r>
+              <w:rPr>
+                <w:sz w:val="18"/>
+              </w:rPr>
+              <w:t>Umgesetzt</w:t>
+            </w:r>
+          </w:p>
+        </w:tc>
+        <w:tc>
+          <w:tcPr>
+            <w:tcW w:type="dxa" w:w="1080"/>
+          </w:tcPr>
+          <w:p>
+            <w:pPr/>
+            <w:r>
+              <w:rPr>
+                <w:sz w:val="18"/>
+              </w:rPr>
+              <w:t>AuditPage → GET /api/audit (SQLite). auditService.ts entfernt.</w:t>
+            </w:r>
+          </w:p>
+        </w:tc>
+      </w:tr>
+      <w:tr>
+        <w:tc>
+          <w:tcPr>
+            <w:tcW w:type="dxa" w:w="1080"/>
+          </w:tcPr>
+          <w:p>
+            <w:pPr/>
+            <w:r>
+              <w:rPr>
+                <w:sz w:val="18"/>
+              </w:rPr>
+              <w:t>138</w:t>
+            </w:r>
+          </w:p>
+        </w:tc>
+        <w:tc>
+          <w:tcPr>
+            <w:tcW w:type="dxa" w:w="1080"/>
+          </w:tcPr>
+          <w:p>
+            <w:pPr/>
+            <w:r>
+              <w:rPr>
+                <w:sz w:val="18"/>
+              </w:rPr>
+              <w:t>v1.1</w:t>
+            </w:r>
+          </w:p>
+        </w:tc>
+        <w:tc>
+          <w:tcPr>
+            <w:tcW w:type="dxa" w:w="1080"/>
+          </w:tcPr>
+          <w:p>
+            <w:pPr/>
+            <w:r>
+              <w:rPr>
+                <w:sz w:val="18"/>
+              </w:rPr>
+              <w:t>—</w:t>
+            </w:r>
+          </w:p>
+        </w:tc>
+        <w:tc>
+          <w:tcPr>
+            <w:tcW w:type="dxa" w:w="1080"/>
+          </w:tcPr>
+          <w:p>
+            <w:pPr/>
+            <w:r>
+              <w:rPr>
+                <w:sz w:val="18"/>
+              </w:rPr>
+              <w:t>AdminPage Server-CRUD</w:t>
+            </w:r>
+          </w:p>
+        </w:tc>
+        <w:tc>
+          <w:tcPr>
+            <w:tcW w:type="dxa" w:w="1080"/>
+          </w:tcPr>
+          <w:p>
+            <w:pPr/>
+            <w:r>
+              <w:rPr>
+                <w:sz w:val="18"/>
+              </w:rPr>
+              <w:t>—</w:t>
+            </w:r>
+          </w:p>
+        </w:tc>
+        <w:tc>
+          <w:tcPr>
+            <w:tcW w:type="dxa" w:w="1080"/>
+          </w:tcPr>
+          <w:p>
+            <w:pPr/>
+            <w:r>
+              <w:rPr>
+                <w:sz w:val="18"/>
+              </w:rPr>
+              <w:t>—</w:t>
+            </w:r>
+          </w:p>
+        </w:tc>
+        <w:tc>
+          <w:tcPr>
+            <w:tcW w:type="dxa" w:w="1080"/>
+          </w:tcPr>
+          <w:p>
+            <w:pPr/>
+            <w:r>
+              <w:rPr>
+                <w:sz w:val="18"/>
+              </w:rPr>
+              <w:t>Umgesetzt</w:t>
+            </w:r>
+          </w:p>
+        </w:tc>
+        <w:tc>
+          <w:tcPr>
+            <w:tcW w:type="dxa" w:w="1080"/>
+          </w:tcPr>
+          <w:p>
+            <w:pPr/>
+            <w:r>
+              <w:rPr>
+                <w:sz w:val="18"/>
+              </w:rPr>
+              <w:t>GET/POST/DELETE /api/auth/users. Server generiert Passwort.</w:t>
+            </w:r>
+          </w:p>
+        </w:tc>
+      </w:tr>
+      <w:tr>
+        <w:tc>
+          <w:tcPr>
+            <w:tcW w:type="dxa" w:w="1080"/>
+          </w:tcPr>
+          <w:p>
+            <w:pPr/>
+            <w:r>
+              <w:rPr>
+                <w:sz w:val="18"/>
+              </w:rPr>
+              <w:t>139</w:t>
+            </w:r>
+          </w:p>
+        </w:tc>
+        <w:tc>
+          <w:tcPr>
+            <w:tcW w:type="dxa" w:w="1080"/>
+          </w:tcPr>
+          <w:p>
+            <w:pPr/>
+            <w:r>
+              <w:rPr>
+                <w:sz w:val="18"/>
+              </w:rPr>
+              <w:t>v1.1</w:t>
+            </w:r>
+          </w:p>
+        </w:tc>
+        <w:tc>
+          <w:tcPr>
+            <w:tcW w:type="dxa" w:w="1080"/>
+          </w:tcPr>
+          <w:p>
+            <w:pPr/>
+            <w:r>
+              <w:rPr>
+                <w:sz w:val="18"/>
+              </w:rPr>
+              <w:t>—</w:t>
+            </w:r>
+          </w:p>
+        </w:tc>
+        <w:tc>
+          <w:tcPr>
+            <w:tcW w:type="dxa" w:w="1080"/>
+          </w:tcPr>
+          <w:p>
+            <w:pPr/>
+            <w:r>
+              <w:rPr>
+                <w:sz w:val="18"/>
+              </w:rPr>
+              <w:t>FHIR-Daten via Server-API</w:t>
+            </w:r>
+          </w:p>
+        </w:tc>
+        <w:tc>
+          <w:tcPr>
+            <w:tcW w:type="dxa" w:w="1080"/>
+          </w:tcPr>
+          <w:p>
+            <w:pPr/>
+            <w:r>
+              <w:rPr>
+                <w:sz w:val="18"/>
+              </w:rPr>
+              <w:t>—</w:t>
+            </w:r>
+          </w:p>
+        </w:tc>
+        <w:tc>
+          <w:tcPr>
+            <w:tcW w:type="dxa" w:w="1080"/>
+          </w:tcPr>
+          <w:p>
+            <w:pPr/>
+            <w:r>
+              <w:rPr>
+                <w:sz w:val="18"/>
+              </w:rPr>
+              <w:t>—</w:t>
+            </w:r>
+          </w:p>
+        </w:tc>
+        <w:tc>
+          <w:tcPr>
+            <w:tcW w:type="dxa" w:w="1080"/>
+          </w:tcPr>
+          <w:p>
+            <w:pPr/>
+            <w:r>
+              <w:rPr>
+                <w:sz w:val="18"/>
+              </w:rPr>
+              <w:t>Umgesetzt</w:t>
+            </w:r>
+          </w:p>
+        </w:tc>
+        <w:tc>
+          <w:tcPr>
+            <w:tcW w:type="dxa" w:w="1080"/>
+          </w:tcPr>
+          <w:p>
+            <w:pPr/>
+            <w:r>
+              <w:rPr>
+                <w:sz w:val="18"/>
+              </w:rPr>
+              <w:t>fhirLoader → /api/fhir/bundles. Center-Filterung serverseitig.</w:t>
+            </w:r>
+          </w:p>
+        </w:tc>
+      </w:tr>
+      <w:tr>
+        <w:tc>
+          <w:tcPr>
+            <w:tcW w:type="dxa" w:w="1080"/>
+          </w:tcPr>
+          <w:p>
+            <w:pPr/>
+            <w:r>
+              <w:rPr>
+                <w:sz w:val="18"/>
+              </w:rPr>
+              <w:t>140</w:t>
+            </w:r>
+          </w:p>
+        </w:tc>
+        <w:tc>
+          <w:tcPr>
+            <w:tcW w:type="dxa" w:w="1080"/>
+          </w:tcPr>
+          <w:p>
+            <w:pPr/>
+            <w:r>
+              <w:rPr>
+                <w:sz w:val="18"/>
+              </w:rPr>
+              <w:t>v1.1</w:t>
+            </w:r>
+          </w:p>
+        </w:tc>
+        <w:tc>
+          <w:tcPr>
+            <w:tcW w:type="dxa" w:w="1080"/>
+          </w:tcPr>
+          <w:p>
+            <w:pPr/>
+            <w:r>
+              <w:rPr>
+                <w:sz w:val="18"/>
+              </w:rPr>
+              <w:t>—</w:t>
+            </w:r>
+          </w:p>
+        </w:tc>
+        <w:tc>
+          <w:tcPr>
+            <w:tcW w:type="dxa" w:w="1080"/>
+          </w:tcPr>
+          <w:p>
+            <w:pPr/>
+            <w:r>
+              <w:rPr>
+                <w:sz w:val="18"/>
+              </w:rPr>
+              <w:t>settings.yaml Sicherheit</w:t>
+            </w:r>
+          </w:p>
+        </w:tc>
+        <w:tc>
+          <w:tcPr>
+            <w:tcW w:type="dxa" w:w="1080"/>
+          </w:tcPr>
+          <w:p>
+            <w:pPr/>
+            <w:r>
+              <w:rPr>
+                <w:sz w:val="18"/>
+              </w:rPr>
+              <w:t>—</w:t>
+            </w:r>
+          </w:p>
+        </w:tc>
+        <w:tc>
+          <w:tcPr>
+            <w:tcW w:type="dxa" w:w="1080"/>
+          </w:tcPr>
+          <w:p>
+            <w:pPr/>
+            <w:r>
+              <w:rPr>
+                <w:sz w:val="18"/>
+              </w:rPr>
+              <w:t>—</w:t>
+            </w:r>
+          </w:p>
+        </w:tc>
+        <w:tc>
+          <w:tcPr>
+            <w:tcW w:type="dxa" w:w="1080"/>
+          </w:tcPr>
+          <w:p>
+            <w:pPr/>
+            <w:r>
+              <w:rPr>
+                <w:sz w:val="18"/>
+              </w:rPr>
+              <w:t>Umgesetzt</w:t>
+            </w:r>
+          </w:p>
+        </w:tc>
+        <w:tc>
+          <w:tcPr>
+            <w:tcW w:type="dxa" w:w="1080"/>
+          </w:tcPr>
+          <w:p>
+            <w:pPr/>
+            <w:r>
+              <w:rPr>
+                <w:sz w:val="18"/>
+              </w:rPr>
+              <w:t>Nach config/ verschoben. OTP nicht mehr statisch abrufbar.</w:t>
+            </w:r>
+          </w:p>
+        </w:tc>
+      </w:tr>
+      <w:tr>
+        <w:tc>
+          <w:tcPr>
+            <w:tcW w:type="dxa" w:w="1080"/>
+          </w:tcPr>
+          <w:p>
+            <w:pPr/>
+            <w:r>
+              <w:rPr>
+                <w:sz w:val="18"/>
+              </w:rPr>
+              <w:t>141</w:t>
+            </w:r>
+          </w:p>
+        </w:tc>
+        <w:tc>
+          <w:tcPr>
+            <w:tcW w:type="dxa" w:w="1080"/>
+          </w:tcPr>
+          <w:p>
+            <w:pPr/>
+            <w:r>
+              <w:rPr>
+                <w:sz w:val="18"/>
+              </w:rPr>
+              <w:t>v1.1</w:t>
+            </w:r>
+          </w:p>
+        </w:tc>
+        <w:tc>
+          <w:tcPr>
+            <w:tcW w:type="dxa" w:w="1080"/>
+          </w:tcPr>
+          <w:p>
+            <w:pPr/>
+            <w:r>
+              <w:rPr>
+                <w:sz w:val="18"/>
+              </w:rPr>
+              <w:t>—</w:t>
+            </w:r>
+          </w:p>
+        </w:tc>
+        <w:tc>
+          <w:tcPr>
+            <w:tcW w:type="dxa" w:w="1080"/>
+          </w:tcPr>
+          <w:p>
+            <w:pPr/>
+            <w:r>
+              <w:rPr>
+                <w:sz w:val="18"/>
+              </w:rPr>
+              <w:t>FHIR-Daten Zugangsschutz</w:t>
+            </w:r>
+          </w:p>
+        </w:tc>
+        <w:tc>
+          <w:tcPr>
+            <w:tcW w:type="dxa" w:w="1080"/>
+          </w:tcPr>
+          <w:p>
+            <w:pPr/>
+            <w:r>
+              <w:rPr>
+                <w:sz w:val="18"/>
+              </w:rPr>
+              <w:t>—</w:t>
+            </w:r>
+          </w:p>
+        </w:tc>
+        <w:tc>
+          <w:tcPr>
+            <w:tcW w:type="dxa" w:w="1080"/>
+          </w:tcPr>
+          <w:p>
+            <w:pPr/>
+            <w:r>
+              <w:rPr>
+                <w:sz w:val="18"/>
+              </w:rPr>
+              <w:t>—</w:t>
+            </w:r>
+          </w:p>
+        </w:tc>
+        <w:tc>
+          <w:tcPr>
+            <w:tcW w:type="dxa" w:w="1080"/>
+          </w:tcPr>
+          <w:p>
+            <w:pPr/>
+            <w:r>
+              <w:rPr>
+                <w:sz w:val="18"/>
+              </w:rPr>
+              <w:t>Umgesetzt</w:t>
+            </w:r>
+          </w:p>
+        </w:tc>
+        <w:tc>
+          <w:tcPr>
+            <w:tcW w:type="dxa" w:w="1080"/>
+          </w:tcPr>
+          <w:p>
+            <w:pPr/>
+            <w:r>
+              <w:rPr>
+                <w:sz w:val="18"/>
+              </w:rPr>
+              <w:t>/data/* in Production blockiert. Nur /api/fhir/bundles.</w:t>
+            </w:r>
+          </w:p>
+        </w:tc>
+      </w:tr>
+      <w:tr>
+        <w:tc>
+          <w:tcPr>
+            <w:tcW w:type="dxa" w:w="1080"/>
+          </w:tcPr>
+          <w:p>
+            <w:pPr/>
+            <w:r>
+              <w:rPr>
+                <w:sz w:val="18"/>
+              </w:rPr>
+              <w:t>142</w:t>
+            </w:r>
+          </w:p>
+        </w:tc>
+        <w:tc>
+          <w:tcPr>
+            <w:tcW w:type="dxa" w:w="1080"/>
+          </w:tcPr>
+          <w:p>
+            <w:pPr/>
+            <w:r>
+              <w:rPr>
+                <w:sz w:val="18"/>
+              </w:rPr>
+              <w:t>v1.1</w:t>
+            </w:r>
+          </w:p>
+        </w:tc>
+        <w:tc>
+          <w:tcPr>
+            <w:tcW w:type="dxa" w:w="1080"/>
+          </w:tcPr>
+          <w:p>
+            <w:pPr/>
+            <w:r>
+              <w:rPr>
+                <w:sz w:val="18"/>
+              </w:rPr>
+              <w:t>—</w:t>
+            </w:r>
+          </w:p>
+        </w:tc>
+        <w:tc>
+          <w:tcPr>
+            <w:tcW w:type="dxa" w:w="1080"/>
+          </w:tcPr>
+          <w:p>
+            <w:pPr/>
+            <w:r>
+              <w:rPr>
+                <w:sz w:val="18"/>
+              </w:rPr>
+              <w:t>FHIR-Proxy unter Auth</w:t>
+            </w:r>
+          </w:p>
+        </w:tc>
+        <w:tc>
+          <w:tcPr>
+            <w:tcW w:type="dxa" w:w="1080"/>
+          </w:tcPr>
+          <w:p>
+            <w:pPr/>
+            <w:r>
+              <w:rPr>
+                <w:sz w:val="18"/>
+              </w:rPr>
+              <w:t>—</w:t>
+            </w:r>
+          </w:p>
+        </w:tc>
+        <w:tc>
+          <w:tcPr>
+            <w:tcW w:type="dxa" w:w="1080"/>
+          </w:tcPr>
+          <w:p>
+            <w:pPr/>
+            <w:r>
+              <w:rPr>
+                <w:sz w:val="18"/>
+              </w:rPr>
+              <w:t>—</w:t>
+            </w:r>
+          </w:p>
+        </w:tc>
+        <w:tc>
+          <w:tcPr>
+            <w:tcW w:type="dxa" w:w="1080"/>
+          </w:tcPr>
+          <w:p>
+            <w:pPr/>
+            <w:r>
+              <w:rPr>
+                <w:sz w:val="18"/>
+              </w:rPr>
+              <w:t>Umgesetzt</w:t>
+            </w:r>
+          </w:p>
+        </w:tc>
+        <w:tc>
+          <w:tcPr>
+            <w:tcW w:type="dxa" w:w="1080"/>
+          </w:tcPr>
+          <w:p>
+            <w:pPr/>
+            <w:r>
+              <w:rPr>
+                <w:sz w:val="18"/>
+              </w:rPr>
+              <w:t>/fhir → /api/fhir-proxy mit authMiddleware.</w:t>
+            </w:r>
+          </w:p>
+        </w:tc>
+      </w:tr>
+      <w:tr>
+        <w:tc>
+          <w:tcPr>
+            <w:tcW w:type="dxa" w:w="1080"/>
+          </w:tcPr>
+          <w:p>
+            <w:pPr/>
+            <w:r>
+              <w:rPr>
+                <w:sz w:val="18"/>
+              </w:rPr>
+              <w:t>143</w:t>
+            </w:r>
+          </w:p>
+        </w:tc>
+        <w:tc>
+          <w:tcPr>
+            <w:tcW w:type="dxa" w:w="1080"/>
+          </w:tcPr>
+          <w:p>
+            <w:pPr/>
+            <w:r>
+              <w:rPr>
+                <w:sz w:val="18"/>
+              </w:rPr>
+              <w:t>v1.1</w:t>
+            </w:r>
+          </w:p>
+        </w:tc>
+        <w:tc>
+          <w:tcPr>
+            <w:tcW w:type="dxa" w:w="1080"/>
+          </w:tcPr>
+          <w:p>
+            <w:pPr/>
+            <w:r>
+              <w:rPr>
+                <w:sz w:val="18"/>
+              </w:rPr>
+              <w:t>—</w:t>
+            </w:r>
+          </w:p>
+        </w:tc>
+        <w:tc>
+          <w:tcPr>
+            <w:tcW w:type="dxa" w:w="1080"/>
+          </w:tcPr>
+          <w:p>
+            <w:pPr/>
+            <w:r>
+              <w:rPr>
+                <w:sz w:val="18"/>
+              </w:rPr>
+              <w:t>Konfigurierbare Zentren</w:t>
+            </w:r>
+          </w:p>
+        </w:tc>
+        <w:tc>
+          <w:tcPr>
+            <w:tcW w:type="dxa" w:w="1080"/>
+          </w:tcPr>
+          <w:p>
+            <w:pPr/>
+            <w:r>
+              <w:rPr>
+                <w:sz w:val="18"/>
+              </w:rPr>
+              <w:t>—</w:t>
+            </w:r>
+          </w:p>
+        </w:tc>
+        <w:tc>
+          <w:tcPr>
+            <w:tcW w:type="dxa" w:w="1080"/>
+          </w:tcPr>
+          <w:p>
+            <w:pPr/>
+            <w:r>
+              <w:rPr>
+                <w:sz w:val="18"/>
+              </w:rPr>
+              <w:t>—</w:t>
+            </w:r>
+          </w:p>
+        </w:tc>
+        <w:tc>
+          <w:tcPr>
+            <w:tcW w:type="dxa" w:w="1080"/>
+          </w:tcPr>
+          <w:p>
+            <w:pPr/>
+            <w:r>
+              <w:rPr>
+                <w:sz w:val="18"/>
+              </w:rPr>
+              <w:t>Umgesetzt</w:t>
+            </w:r>
+          </w:p>
+        </w:tc>
+        <w:tc>
+          <w:tcPr>
+            <w:tcW w:type="dxa" w:w="1080"/>
+          </w:tcPr>
+          <w:p>
+            <w:pPr/>
+            <w:r>
+              <w:rPr>
+                <w:sz w:val="18"/>
+              </w:rPr>
+              <w:t>data/centers.json statt hardcoded.</w:t>
+            </w:r>
+          </w:p>
+        </w:tc>
+      </w:tr>
+      <w:tr>
+        <w:tc>
+          <w:tcPr>
+            <w:tcW w:type="dxa" w:w="1080"/>
+          </w:tcPr>
+          <w:p>
+            <w:pPr/>
+            <w:r>
+              <w:rPr>
+                <w:sz w:val="18"/>
+              </w:rPr>
+              <w:t>144</w:t>
+            </w:r>
+          </w:p>
+        </w:tc>
+        <w:tc>
+          <w:tcPr>
+            <w:tcW w:type="dxa" w:w="1080"/>
+          </w:tcPr>
+          <w:p>
+            <w:pPr/>
+            <w:r>
+              <w:rPr>
+                <w:sz w:val="18"/>
+              </w:rPr>
+              <w:t>v1.1</w:t>
+            </w:r>
+          </w:p>
+        </w:tc>
+        <w:tc>
+          <w:tcPr>
+            <w:tcW w:type="dxa" w:w="1080"/>
+          </w:tcPr>
+          <w:p>
+            <w:pPr/>
+            <w:r>
+              <w:rPr>
+                <w:sz w:val="18"/>
+              </w:rPr>
+              <w:t>—</w:t>
+            </w:r>
+          </w:p>
+        </w:tc>
+        <w:tc>
+          <w:tcPr>
+            <w:tcW w:type="dxa" w:w="1080"/>
+          </w:tcPr>
+          <w:p>
+            <w:pPr/>
+            <w:r>
+              <w:rPr>
+                <w:sz w:val="18"/>
+              </w:rPr>
+              <w:t>Konsolidierte Auth-Header</w:t>
+            </w:r>
+          </w:p>
+        </w:tc>
+        <w:tc>
+          <w:tcPr>
+            <w:tcW w:type="dxa" w:w="1080"/>
+          </w:tcPr>
+          <w:p>
+            <w:pPr/>
+            <w:r>
+              <w:rPr>
+                <w:sz w:val="18"/>
+              </w:rPr>
+              <w:t>—</w:t>
+            </w:r>
+          </w:p>
+        </w:tc>
+        <w:tc>
+          <w:tcPr>
+            <w:tcW w:type="dxa" w:w="1080"/>
+          </w:tcPr>
+          <w:p>
+            <w:pPr/>
+            <w:r>
+              <w:rPr>
+                <w:sz w:val="18"/>
+              </w:rPr>
+              <w:t>—</w:t>
+            </w:r>
+          </w:p>
+        </w:tc>
+        <w:tc>
+          <w:tcPr>
+            <w:tcW w:type="dxa" w:w="1080"/>
+          </w:tcPr>
+          <w:p>
+            <w:pPr/>
+            <w:r>
+              <w:rPr>
+                <w:sz w:val="18"/>
+              </w:rPr>
+              <w:t>Umgesetzt</w:t>
+            </w:r>
+          </w:p>
+        </w:tc>
+        <w:tc>
+          <w:tcPr>
+            <w:tcW w:type="dxa" w:w="1080"/>
+          </w:tcPr>
+          <w:p>
+            <w:pPr/>
+            <w:r>
+              <w:rPr>
+                <w:sz w:val="18"/>
+              </w:rPr>
+              <w:t>Einzelne getAuthHeaders(). 3 Duplikate entfernt.</w:t>
+            </w:r>
+          </w:p>
+        </w:tc>
+      </w:tr>
+      <w:tr>
+        <w:tc>
+          <w:tcPr>
+            <w:tcW w:type="dxa" w:w="1080"/>
+          </w:tcPr>
+          <w:p>
+            <w:pPr/>
+            <w:r>
+              <w:rPr>
+                <w:sz w:val="18"/>
+              </w:rPr>
+              <w:t>145</w:t>
+            </w:r>
+          </w:p>
+        </w:tc>
+        <w:tc>
+          <w:tcPr>
+            <w:tcW w:type="dxa" w:w="1080"/>
+          </w:tcPr>
+          <w:p>
+            <w:pPr/>
+            <w:r>
+              <w:rPr>
+                <w:sz w:val="18"/>
+              </w:rPr>
+              <w:t>v1.1</w:t>
+            </w:r>
+          </w:p>
+        </w:tc>
+        <w:tc>
+          <w:tcPr>
+            <w:tcW w:type="dxa" w:w="1080"/>
+          </w:tcPr>
+          <w:p>
+            <w:pPr/>
+            <w:r>
+              <w:rPr>
+                <w:sz w:val="18"/>
+              </w:rPr>
+              <w:t>—</w:t>
+            </w:r>
+          </w:p>
+        </w:tc>
+        <w:tc>
+          <w:tcPr>
+            <w:tcW w:type="dxa" w:w="1080"/>
+          </w:tcPr>
+          <w:p>
+            <w:pPr/>
+            <w:r>
+              <w:rPr>
+                <w:sz w:val="18"/>
+              </w:rPr>
+              <w:t>Center-Validierung</w:t>
+            </w:r>
+          </w:p>
+        </w:tc>
+        <w:tc>
+          <w:tcPr>
+            <w:tcW w:type="dxa" w:w="1080"/>
+          </w:tcPr>
+          <w:p>
+            <w:pPr/>
+            <w:r>
+              <w:rPr>
+                <w:sz w:val="18"/>
+              </w:rPr>
+              <w:t>—</w:t>
+            </w:r>
+          </w:p>
+        </w:tc>
+        <w:tc>
+          <w:tcPr>
+            <w:tcW w:type="dxa" w:w="1080"/>
+          </w:tcPr>
+          <w:p>
+            <w:pPr/>
+            <w:r>
+              <w:rPr>
+                <w:sz w:val="18"/>
+              </w:rPr>
+              <w:t>—</w:t>
+            </w:r>
+          </w:p>
+        </w:tc>
+        <w:tc>
+          <w:tcPr>
+            <w:tcW w:type="dxa" w:w="1080"/>
+          </w:tcPr>
+          <w:p>
+            <w:pPr/>
+            <w:r>
+              <w:rPr>
+                <w:sz w:val="18"/>
+              </w:rPr>
+              <w:t>Umgesetzt</w:t>
+            </w:r>
+          </w:p>
+        </w:tc>
+        <w:tc>
+          <w:tcPr>
+            <w:tcW w:type="dxa" w:w="1080"/>
+          </w:tcPr>
+          <w:p>
+            <w:pPr/>
+            <w:r>
+              <w:rPr>
+                <w:sz w:val="18"/>
+              </w:rPr>
+              <w:t>excluded/reviewed-cases prüfen Center-Zugehörigkeit.</w:t>
+            </w:r>
+          </w:p>
+        </w:tc>
+      </w:tr>
+      <w:tr>
+        <w:tc>
+          <w:tcPr>
+            <w:tcW w:type="dxa" w:w="1080"/>
+          </w:tcPr>
+          <w:p>
+            <w:pPr/>
+            <w:r>
+              <w:rPr>
+                <w:sz w:val="18"/>
+              </w:rPr>
+              <w:t>146</w:t>
+            </w:r>
+          </w:p>
+        </w:tc>
+        <w:tc>
+          <w:tcPr>
+            <w:tcW w:type="dxa" w:w="1080"/>
+          </w:tcPr>
+          <w:p>
+            <w:pPr/>
+            <w:r>
+              <w:rPr>
+                <w:sz w:val="18"/>
+              </w:rPr>
+              <w:t>v1.1</w:t>
+            </w:r>
+          </w:p>
+        </w:tc>
+        <w:tc>
+          <w:tcPr>
+            <w:tcW w:type="dxa" w:w="1080"/>
+          </w:tcPr>
+          <w:p>
+            <w:pPr/>
+            <w:r>
+              <w:rPr>
+                <w:sz w:val="18"/>
+              </w:rPr>
+              <w:t>—</w:t>
+            </w:r>
+          </w:p>
+        </w:tc>
+        <w:tc>
+          <w:tcPr>
+            <w:tcW w:type="dxa" w:w="1080"/>
+          </w:tcPr>
+          <w:p>
+            <w:pPr/>
+            <w:r>
+              <w:rPr>
+                <w:sz w:val="18"/>
+              </w:rPr>
+              <w:t>npm start Script</w:t>
+            </w:r>
+          </w:p>
+        </w:tc>
+        <w:tc>
+          <w:tcPr>
+            <w:tcW w:type="dxa" w:w="1080"/>
+          </w:tcPr>
+          <w:p>
+            <w:pPr/>
+            <w:r>
+              <w:rPr>
+                <w:sz w:val="18"/>
+              </w:rPr>
+              <w:t>—</w:t>
+            </w:r>
+          </w:p>
+        </w:tc>
+        <w:tc>
+          <w:tcPr>
+            <w:tcW w:type="dxa" w:w="1080"/>
+          </w:tcPr>
+          <w:p>
+            <w:pPr/>
+            <w:r>
+              <w:rPr>
+                <w:sz w:val="18"/>
+              </w:rPr>
+              <w:t>—</w:t>
+            </w:r>
+          </w:p>
+        </w:tc>
+        <w:tc>
+          <w:tcPr>
+            <w:tcW w:type="dxa" w:w="1080"/>
+          </w:tcPr>
+          <w:p>
+            <w:pPr/>
+            <w:r>
+              <w:rPr>
+                <w:sz w:val="18"/>
+              </w:rPr>
+              <w:t>Umgesetzt</w:t>
+            </w:r>
+          </w:p>
+        </w:tc>
+        <w:tc>
+          <w:tcPr>
+            <w:tcW w:type="dxa" w:w="1080"/>
+          </w:tcPr>
+          <w:p>
+            <w:pPr/>
+            <w:r>
+              <w:rPr>
+                <w:sz w:val="18"/>
+              </w:rPr>
+              <w:t>"start": "node --import tsx server/index.ts".</w:t>
+            </w:r>
+          </w:p>
+        </w:tc>
+      </w:tr>
+      <w:tr>
+        <w:tc>
+          <w:tcPr>
+            <w:tcW w:type="dxa" w:w="1080"/>
+          </w:tcPr>
+          <w:p>
+            <w:r>
+              <w:rPr>
+                <w:sz w:val="18"/>
+              </w:rPr>
+              <w:t>147</w:t>
+            </w:r>
+          </w:p>
+        </w:tc>
+        <w:tc>
+          <w:tcPr>
+            <w:tcW w:type="dxa" w:w="1080"/>
+          </w:tcPr>
+          <w:p>
+            <w:r>
+              <w:rPr>
+                <w:sz w:val="18"/>
+              </w:rPr>
+              <w:t>v1.1</w:t>
+            </w:r>
+          </w:p>
+        </w:tc>
+        <w:tc>
+          <w:tcPr>
+            <w:tcW w:type="dxa" w:w="1080"/>
+          </w:tcPr>
+          <w:p>
+            <w:r>
+              <w:rPr>
+                <w:sz w:val="18"/>
+              </w:rPr>
+              <w:t>—</w:t>
+            </w:r>
+          </w:p>
+        </w:tc>
+        <w:tc>
+          <w:tcPr>
+            <w:tcW w:type="dxa" w:w="1080"/>
+          </w:tcPr>
+          <w:p>
+            <w:r>
+              <w:rPr>
+                <w:sz w:val="18"/>
+              </w:rPr>
+              <w:t>HTTP Security Headers (helmet)</w:t>
+            </w:r>
+          </w:p>
+        </w:tc>
+        <w:tc>
+          <w:tcPr>
+            <w:tcW w:type="dxa" w:w="1080"/>
+          </w:tcPr>
+          <w:p>
+            <w:r>
+              <w:rPr>
+                <w:sz w:val="18"/>
+              </w:rPr>
+              <w:t>—</w:t>
+            </w:r>
+          </w:p>
+        </w:tc>
+        <w:tc>
+          <w:tcPr>
+            <w:tcW w:type="dxa" w:w="1080"/>
+          </w:tcPr>
+          <w:p>
+            <w:r>
+              <w:rPr>
+                <w:sz w:val="18"/>
+              </w:rPr>
+              <w:t>—</w:t>
+            </w:r>
+          </w:p>
+        </w:tc>
+        <w:tc>
+          <w:tcPr>
+            <w:tcW w:type="dxa" w:w="1080"/>
+          </w:tcPr>
+          <w:p>
+            <w:r>
+              <w:rPr>
+                <w:sz w:val="18"/>
+              </w:rPr>
+              <w:t>Umgesetzt</w:t>
+            </w:r>
+          </w:p>
+        </w:tc>
+        <w:tc>
+          <w:tcPr>
+            <w:tcW w:type="dxa" w:w="1080"/>
+          </w:tcPr>
+          <w:p>
+            <w:r>
+              <w:rPr>
+                <w:sz w:val="18"/>
+              </w:rPr>
+              <w:t>CSP, HSTS, X-Frame-Options, X-Content-Type-Options via helmet middleware.</w:t>
+            </w:r>
+          </w:p>
+        </w:tc>
+      </w:tr>
+      <w:tr>
+        <w:tc>
+          <w:tcPr>
+            <w:tcW w:type="dxa" w:w="1080"/>
+          </w:tcPr>
+          <w:p>
+            <w:r>
+              <w:rPr>
+                <w:sz w:val="18"/>
+              </w:rPr>
+              <w:t>148</w:t>
+            </w:r>
+          </w:p>
+        </w:tc>
+        <w:tc>
+          <w:tcPr>
+            <w:tcW w:type="dxa" w:w="1080"/>
+          </w:tcPr>
+          <w:p>
+            <w:r>
+              <w:rPr>
+                <w:sz w:val="18"/>
+              </w:rPr>
+              <w:t>v1.1</w:t>
+            </w:r>
+          </w:p>
+        </w:tc>
+        <w:tc>
+          <w:tcPr>
+            <w:tcW w:type="dxa" w:w="1080"/>
+          </w:tcPr>
+          <w:p>
+            <w:r>
+              <w:rPr>
+                <w:sz w:val="18"/>
+              </w:rPr>
+              <w:t>—</w:t>
+            </w:r>
+          </w:p>
+        </w:tc>
+        <w:tc>
+          <w:tcPr>
+            <w:tcW w:type="dxa" w:w="1080"/>
+          </w:tcPr>
+          <w:p>
+            <w:r>
+              <w:rPr>
+                <w:sz w:val="18"/>
+              </w:rPr>
+              <w:t>Audit auto-scoped nach Rolle</w:t>
+            </w:r>
+          </w:p>
+        </w:tc>
+        <w:tc>
+          <w:tcPr>
+            <w:tcW w:type="dxa" w:w="1080"/>
+          </w:tcPr>
+          <w:p>
+            <w:r>
+              <w:rPr>
+                <w:sz w:val="18"/>
+              </w:rPr>
+              <w:t>—</w:t>
+            </w:r>
+          </w:p>
+        </w:tc>
+        <w:tc>
+          <w:tcPr>
+            <w:tcW w:type="dxa" w:w="1080"/>
+          </w:tcPr>
+          <w:p>
+            <w:r>
+              <w:rPr>
+                <w:sz w:val="18"/>
+              </w:rPr>
+              <w:t>—</w:t>
+            </w:r>
+          </w:p>
+        </w:tc>
+        <w:tc>
+          <w:tcPr>
+            <w:tcW w:type="dxa" w:w="1080"/>
+          </w:tcPr>
+          <w:p>
+            <w:r>
+              <w:rPr>
+                <w:sz w:val="18"/>
+              </w:rPr>
+              <w:t>Umgesetzt</w:t>
+            </w:r>
+          </w:p>
+        </w:tc>
+        <w:tc>
+          <w:tcPr>
+            <w:tcW w:type="dxa" w:w="1080"/>
+          </w:tcPr>
+          <w:p>
+            <w:r>
+              <w:rPr>
+                <w:sz w:val="18"/>
+              </w:rPr>
+              <w:t>Nicht-Admins sehen nur eigene Audit-Eintraege. Admins sehen alle.</w:t>
+            </w:r>
+          </w:p>
+        </w:tc>
+      </w:tr>
+      <w:tr>
+        <w:tc>
+          <w:tcPr>
+            <w:tcW w:type="dxa" w:w="1080"/>
+          </w:tcPr>
+          <w:p>
+            <w:r>
+              <w:rPr>
+                <w:sz w:val="18"/>
+              </w:rPr>
+              <w:t>149</w:t>
+            </w:r>
+          </w:p>
+        </w:tc>
+        <w:tc>
+          <w:tcPr>
+            <w:tcW w:type="dxa" w:w="1080"/>
+          </w:tcPr>
+          <w:p>
+            <w:r>
+              <w:rPr>
+                <w:sz w:val="18"/>
+              </w:rPr>
+              <w:t>v1.1</w:t>
+            </w:r>
+          </w:p>
+        </w:tc>
+        <w:tc>
+          <w:tcPr>
+            <w:tcW w:type="dxa" w:w="1080"/>
+          </w:tcPr>
+          <w:p>
+            <w:r>
+              <w:rPr>
+                <w:sz w:val="18"/>
+              </w:rPr>
+              <w:t>—</w:t>
+            </w:r>
+          </w:p>
+        </w:tc>
+        <w:tc>
+          <w:tcPr>
+            <w:tcW w:type="dxa" w:w="1080"/>
+          </w:tcPr>
+          <w:p>
+            <w:r>
+              <w:rPr>
+                <w:sz w:val="18"/>
+              </w:rPr>
+              <w:t>FHIR-Proxy admin-only</w:t>
+            </w:r>
+          </w:p>
+        </w:tc>
+        <w:tc>
+          <w:tcPr>
+            <w:tcW w:type="dxa" w:w="1080"/>
+          </w:tcPr>
+          <w:p>
+            <w:r>
+              <w:rPr>
+                <w:sz w:val="18"/>
+              </w:rPr>
+              <w:t>—</w:t>
+            </w:r>
+          </w:p>
+        </w:tc>
+        <w:tc>
+          <w:tcPr>
+            <w:tcW w:type="dxa" w:w="1080"/>
+          </w:tcPr>
+          <w:p>
+            <w:r>
+              <w:rPr>
+                <w:sz w:val="18"/>
+              </w:rPr>
+              <w:t>—</w:t>
+            </w:r>
+          </w:p>
+        </w:tc>
+        <w:tc>
+          <w:tcPr>
+            <w:tcW w:type="dxa" w:w="1080"/>
+          </w:tcPr>
+          <w:p>
+            <w:r>
+              <w:rPr>
+                <w:sz w:val="18"/>
+              </w:rPr>
+              <w:t>Umgesetzt</w:t>
+            </w:r>
+          </w:p>
+        </w:tc>
+        <w:tc>
+          <w:tcPr>
+            <w:tcW w:type="dxa" w:w="1080"/>
+          </w:tcPr>
+          <w:p>
+            <w:r>
+              <w:rPr>
+                <w:sz w:val="18"/>
+              </w:rPr>
+              <w:t>/api/fhir-proxy nur fuer Administratoren. Verhindert Zentren-Bypass.</w:t>
+            </w:r>
+          </w:p>
+        </w:tc>
+      </w:tr>
+      <w:tr>
+        <w:tc>
+          <w:tcPr>
+            <w:tcW w:type="dxa" w:w="1080"/>
+          </w:tcPr>
+          <w:p>
+            <w:r>
+              <w:rPr>
+                <w:sz w:val="18"/>
+              </w:rPr>
+              <w:t>150</w:t>
+            </w:r>
+          </w:p>
+        </w:tc>
+        <w:tc>
+          <w:tcPr>
+            <w:tcW w:type="dxa" w:w="1080"/>
+          </w:tcPr>
+          <w:p>
+            <w:r>
+              <w:rPr>
+                <w:sz w:val="18"/>
+              </w:rPr>
+              <w:t>v1.1</w:t>
+            </w:r>
+          </w:p>
+        </w:tc>
+        <w:tc>
+          <w:tcPr>
+            <w:tcW w:type="dxa" w:w="1080"/>
+          </w:tcPr>
+          <w:p>
+            <w:r>
+              <w:rPr>
+                <w:sz w:val="18"/>
+              </w:rPr>
+              <w:t>—</w:t>
+            </w:r>
+          </w:p>
+        </w:tc>
+        <w:tc>
+          <w:tcPr>
+            <w:tcW w:type="dxa" w:w="1080"/>
+          </w:tcPr>
+          <w:p>
+            <w:r>
+              <w:rPr>
+                <w:sz w:val="18"/>
+              </w:rPr>
+              <w:t>Strikte Case-ID Validierung</w:t>
+            </w:r>
+          </w:p>
+        </w:tc>
+        <w:tc>
+          <w:tcPr>
+            <w:tcW w:type="dxa" w:w="1080"/>
+          </w:tcPr>
+          <w:p>
+            <w:r>
+              <w:rPr>
+                <w:sz w:val="18"/>
+              </w:rPr>
+              <w:t>—</w:t>
+            </w:r>
+          </w:p>
+        </w:tc>
+        <w:tc>
+          <w:tcPr>
+            <w:tcW w:type="dxa" w:w="1080"/>
+          </w:tcPr>
+          <w:p>
+            <w:r>
+              <w:rPr>
+                <w:sz w:val="18"/>
+              </w:rPr>
+              <w:t>—</w:t>
+            </w:r>
+          </w:p>
+        </w:tc>
+        <w:tc>
+          <w:tcPr>
+            <w:tcW w:type="dxa" w:w="1080"/>
+          </w:tcPr>
+          <w:p>
+            <w:r>
+              <w:rPr>
+                <w:sz w:val="18"/>
+              </w:rPr>
+              <w:t>Umgesetzt</w:t>
+            </w:r>
+          </w:p>
+        </w:tc>
+        <w:tc>
+          <w:tcPr>
+            <w:tcW w:type="dxa" w:w="1080"/>
+          </w:tcPr>
+          <w:p>
+            <w:r>
+              <w:rPr>
+                <w:sz w:val="18"/>
+              </w:rPr>
+              <w:t>Unbekannte Case-IDs bei Schreiboperationen abgelehnt (H-10).</w:t>
+            </w:r>
+          </w:p>
+        </w:tc>
+      </w:tr>
+      <w:tr>
+        <w:tc>
+          <w:tcPr>
+            <w:tcW w:type="dxa" w:w="1080"/>
+          </w:tcPr>
+          <w:p>
+            <w:r>
+              <w:rPr>
+                <w:sz w:val="18"/>
+              </w:rPr>
+              <w:t>151</w:t>
+            </w:r>
+          </w:p>
+        </w:tc>
+        <w:tc>
+          <w:tcPr>
+            <w:tcW w:type="dxa" w:w="1080"/>
+          </w:tcPr>
+          <w:p>
+            <w:r>
+              <w:rPr>
+                <w:sz w:val="18"/>
+              </w:rPr>
+              <w:t>v1.1</w:t>
+            </w:r>
+          </w:p>
+        </w:tc>
+        <w:tc>
+          <w:tcPr>
+            <w:tcW w:type="dxa" w:w="1080"/>
+          </w:tcPr>
+          <w:p>
+            <w:r>
+              <w:rPr>
+                <w:sz w:val="18"/>
+              </w:rPr>
+              <w:t>—</w:t>
+            </w:r>
+          </w:p>
+        </w:tc>
+        <w:tc>
+          <w:tcPr>
+            <w:tcW w:type="dxa" w:w="1080"/>
+          </w:tcPr>
+          <w:p>
+            <w:r>
+              <w:rPr>
+                <w:sz w:val="18"/>
+              </w:rPr>
+              <w:t>Async bcrypt (nicht-blockierend)</w:t>
+            </w:r>
+          </w:p>
+        </w:tc>
+        <w:tc>
+          <w:tcPr>
+            <w:tcW w:type="dxa" w:w="1080"/>
+          </w:tcPr>
+          <w:p>
+            <w:r>
+              <w:rPr>
+                <w:sz w:val="18"/>
+              </w:rPr>
+              <w:t>—</w:t>
+            </w:r>
+          </w:p>
+        </w:tc>
+        <w:tc>
+          <w:tcPr>
+            <w:tcW w:type="dxa" w:w="1080"/>
+          </w:tcPr>
+          <w:p>
+            <w:r>
+              <w:rPr>
+                <w:sz w:val="18"/>
+              </w:rPr>
+              <w:t>—</w:t>
+            </w:r>
+          </w:p>
+        </w:tc>
+        <w:tc>
+          <w:tcPr>
+            <w:tcW w:type="dxa" w:w="1080"/>
+          </w:tcPr>
+          <w:p>
+            <w:r>
+              <w:rPr>
+                <w:sz w:val="18"/>
+              </w:rPr>
+              <w:t>Umgesetzt</w:t>
+            </w:r>
+          </w:p>
+        </w:tc>
+        <w:tc>
+          <w:tcPr>
+            <w:tcW w:type="dxa" w:w="1080"/>
+          </w:tcPr>
+          <w:p>
+            <w:r>
+              <w:rPr>
+                <w:sz w:val="18"/>
+              </w:rPr>
+              <w:t>bcrypt.compare/hash async. Event Loop nicht mehr blockiert.</w:t>
+            </w:r>
+          </w:p>
+        </w:tc>
+      </w:tr>
+      <w:tr>
+        <w:tc>
+          <w:tcPr>
+            <w:tcW w:type="dxa" w:w="1080"/>
+          </w:tcPr>
+          <w:p>
+            <w:r>
+              <w:rPr>
+                <w:sz w:val="18"/>
+              </w:rPr>
+              <w:t>152</w:t>
+            </w:r>
+          </w:p>
+        </w:tc>
+        <w:tc>
+          <w:tcPr>
+            <w:tcW w:type="dxa" w:w="1080"/>
+          </w:tcPr>
+          <w:p>
+            <w:r>
+              <w:rPr>
+                <w:sz w:val="18"/>
+              </w:rPr>
+              <w:t>v1.1</w:t>
+            </w:r>
+          </w:p>
+        </w:tc>
+        <w:tc>
+          <w:tcPr>
+            <w:tcW w:type="dxa" w:w="1080"/>
+          </w:tcPr>
+          <w:p>
+            <w:r>
+              <w:rPr>
+                <w:sz w:val="18"/>
+              </w:rPr>
+              <w:t>—</w:t>
+            </w:r>
+          </w:p>
+        </w:tc>
+        <w:tc>
+          <w:tcPr>
+            <w:tcW w:type="dxa" w:w="1080"/>
+          </w:tcPr>
+          <w:p>
+            <w:r>
+              <w:rPr>
+                <w:sz w:val="18"/>
+              </w:rPr>
+              <w:t>Audit Body-Erfassung</w:t>
+            </w:r>
+          </w:p>
+        </w:tc>
+        <w:tc>
+          <w:tcPr>
+            <w:tcW w:type="dxa" w:w="1080"/>
+          </w:tcPr>
+          <w:p>
+            <w:r>
+              <w:rPr>
+                <w:sz w:val="18"/>
+              </w:rPr>
+              <w:t>—</w:t>
+            </w:r>
+          </w:p>
+        </w:tc>
+        <w:tc>
+          <w:tcPr>
+            <w:tcW w:type="dxa" w:w="1080"/>
+          </w:tcPr>
+          <w:p>
+            <w:r>
+              <w:rPr>
+                <w:sz w:val="18"/>
+              </w:rPr>
+              <w:t>—</w:t>
+            </w:r>
+          </w:p>
+        </w:tc>
+        <w:tc>
+          <w:tcPr>
+            <w:tcW w:type="dxa" w:w="1080"/>
+          </w:tcPr>
+          <w:p>
+            <w:r>
+              <w:rPr>
+                <w:sz w:val="18"/>
+              </w:rPr>
+              <w:t>Umgesetzt</w:t>
+            </w:r>
+          </w:p>
+        </w:tc>
+        <w:tc>
+          <w:tcPr>
+            <w:tcW w:type="dxa" w:w="1080"/>
+          </w:tcPr>
+          <w:p>
+            <w:r>
+              <w:rPr>
+                <w:sz w:val="18"/>
+              </w:rPr>
+              <w:t>readBody() setzt _capturedBody fuer Audit-Protokollierung von Mutationen.</w:t>
+            </w:r>
+          </w:p>
+        </w:tc>
+      </w:tr>
+      <w:tr>
+        <w:tc>
+          <w:tcPr>
+            <w:tcW w:type="dxa" w:w="1080"/>
+          </w:tcPr>
+          <w:p>
+            <w:r>
+              <w:rPr>
+                <w:sz w:val="18"/>
+              </w:rPr>
+              <w:t>153</w:t>
+            </w:r>
+          </w:p>
+        </w:tc>
+        <w:tc>
+          <w:tcPr>
+            <w:tcW w:type="dxa" w:w="1080"/>
+          </w:tcPr>
+          <w:p>
+            <w:r>
+              <w:rPr>
+                <w:sz w:val="18"/>
+              </w:rPr>
+              <w:t>v1.1</w:t>
+            </w:r>
+          </w:p>
+        </w:tc>
+        <w:tc>
+          <w:tcPr>
+            <w:tcW w:type="dxa" w:w="1080"/>
+          </w:tcPr>
+          <w:p>
+            <w:r>
+              <w:rPr>
+                <w:sz w:val="18"/>
+              </w:rPr>
+              <w:t>—</w:t>
+            </w:r>
+          </w:p>
+        </w:tc>
+        <w:tc>
+          <w:tcPr>
+            <w:tcW w:type="dxa" w:w="1080"/>
+          </w:tcPr>
+          <w:p>
+            <w:r>
+              <w:rPr>
+                <w:sz w:val="18"/>
+              </w:rPr>
+              <w:t>Global 401 Interceptor</w:t>
+            </w:r>
+          </w:p>
+        </w:tc>
+        <w:tc>
+          <w:tcPr>
+            <w:tcW w:type="dxa" w:w="1080"/>
+          </w:tcPr>
+          <w:p>
+            <w:r>
+              <w:rPr>
+                <w:sz w:val="18"/>
+              </w:rPr>
+              <w:t>—</w:t>
+            </w:r>
+          </w:p>
+        </w:tc>
+        <w:tc>
+          <w:tcPr>
+            <w:tcW w:type="dxa" w:w="1080"/>
+          </w:tcPr>
+          <w:p>
+            <w:r>
+              <w:rPr>
+                <w:sz w:val="18"/>
+              </w:rPr>
+              <w:t>—</w:t>
+            </w:r>
+          </w:p>
+        </w:tc>
+        <w:tc>
+          <w:tcPr>
+            <w:tcW w:type="dxa" w:w="1080"/>
+          </w:tcPr>
+          <w:p>
+            <w:r>
+              <w:rPr>
+                <w:sz w:val="18"/>
+              </w:rPr>
+              <w:t>Umgesetzt</w:t>
+            </w:r>
+          </w:p>
+        </w:tc>
+        <w:tc>
+          <w:tcPr>
+            <w:tcW w:type="dxa" w:w="1080"/>
+          </w:tcPr>
+          <w:p>
+            <w:r>
+              <w:rPr>
+                <w:sz w:val="18"/>
+              </w:rPr>
+              <w:t>authFetch() leitet bei abgelaufenem JWT automatisch zur Login-Seite.</w:t>
+            </w:r>
+          </w:p>
+        </w:tc>
+      </w:tr>
+      <w:tr>
+        <w:tc>
+          <w:tcPr>
+            <w:tcW w:type="dxa" w:w="1080"/>
+          </w:tcPr>
+          <w:p>
+            <w:r>
+              <w:rPr>
+                <w:sz w:val="18"/>
+              </w:rPr>
+              <w:t>154</w:t>
+            </w:r>
+          </w:p>
+        </w:tc>
+        <w:tc>
+          <w:tcPr>
+            <w:tcW w:type="dxa" w:w="1080"/>
+          </w:tcPr>
+          <w:p>
+            <w:r>
+              <w:rPr>
+                <w:sz w:val="18"/>
+              </w:rPr>
+              <w:t>v1.1</w:t>
+            </w:r>
+          </w:p>
+        </w:tc>
+        <w:tc>
+          <w:tcPr>
+            <w:tcW w:type="dxa" w:w="1080"/>
+          </w:tcPr>
+          <w:p>
+            <w:r>
+              <w:rPr>
+                <w:sz w:val="18"/>
+              </w:rPr>
+              <w:t>—</w:t>
+            </w:r>
+          </w:p>
+        </w:tc>
+        <w:tc>
+          <w:tcPr>
+            <w:tcW w:type="dxa" w:w="1080"/>
+          </w:tcPr>
+          <w:p>
+            <w:r>
+              <w:rPr>
+                <w:sz w:val="18"/>
+              </w:rPr>
+              <w:t>Express Router Refactoring</w:t>
+            </w:r>
+          </w:p>
+        </w:tc>
+        <w:tc>
+          <w:tcPr>
+            <w:tcW w:type="dxa" w:w="1080"/>
+          </w:tcPr>
+          <w:p>
+            <w:r>
+              <w:rPr>
+                <w:sz w:val="18"/>
+              </w:rPr>
+              <w:t>—</w:t>
+            </w:r>
+          </w:p>
+        </w:tc>
+        <w:tc>
+          <w:tcPr>
+            <w:tcW w:type="dxa" w:w="1080"/>
+          </w:tcPr>
+          <w:p>
+            <w:r>
+              <w:rPr>
+                <w:sz w:val="18"/>
+              </w:rPr>
+              <w:t>—</w:t>
+            </w:r>
+          </w:p>
+        </w:tc>
+        <w:tc>
+          <w:tcPr>
+            <w:tcW w:type="dxa" w:w="1080"/>
+          </w:tcPr>
+          <w:p>
+            <w:r>
+              <w:rPr>
+                <w:sz w:val="18"/>
+              </w:rPr>
+              <w:t>Umgesetzt</w:t>
+            </w:r>
+          </w:p>
+        </w:tc>
+        <w:tc>
+          <w:tcPr>
+            <w:tcW w:type="dxa" w:w="1080"/>
+          </w:tcPr>
+          <w:p>
+            <w:r>
+              <w:rPr>
+                <w:sz w:val="18"/>
+              </w:rPr>
+              <w:t>issueApi + settingsApi von duplizierten Handlern zu Express Router mit geteilter Kernlogik.</w:t>
+            </w:r>
+          </w:p>
+        </w:tc>
+      </w:tr>
+      <w:tr>
+        <w:tc>
+          <w:tcPr>
+            <w:tcW w:type="dxa" w:w="1080"/>
+          </w:tcPr>
+          <w:p>
+            <w:r>
+              <w:rPr>
+                <w:sz w:val="18"/>
+              </w:rPr>
+              <w:t>155</w:t>
+            </w:r>
+          </w:p>
+        </w:tc>
+        <w:tc>
+          <w:tcPr>
+            <w:tcW w:type="dxa" w:w="1080"/>
+          </w:tcPr>
+          <w:p>
+            <w:r>
+              <w:rPr>
+                <w:sz w:val="18"/>
+              </w:rPr>
+              <w:t>v1.1</w:t>
+            </w:r>
+          </w:p>
+        </w:tc>
+        <w:tc>
+          <w:tcPr>
+            <w:tcW w:type="dxa" w:w="1080"/>
+          </w:tcPr>
+          <w:p>
+            <w:r>
+              <w:rPr>
+                <w:sz w:val="18"/>
+              </w:rPr>
+              <w:t>—</w:t>
+            </w:r>
+          </w:p>
+        </w:tc>
+        <w:tc>
+          <w:tcPr>
+            <w:tcW w:type="dxa" w:w="1080"/>
+          </w:tcPr>
+          <w:p>
+            <w:r>
+              <w:rPr>
+                <w:sz w:val="18"/>
+              </w:rPr>
+              <w:t>QualityFlag ID Persistenz</w:t>
+            </w:r>
+          </w:p>
+        </w:tc>
+        <w:tc>
+          <w:tcPr>
+            <w:tcW w:type="dxa" w:w="1080"/>
+          </w:tcPr>
+          <w:p>
+            <w:r>
+              <w:rPr>
+                <w:sz w:val="18"/>
+              </w:rPr>
+              <w:t>—</w:t>
+            </w:r>
+          </w:p>
+        </w:tc>
+        <w:tc>
+          <w:tcPr>
+            <w:tcW w:type="dxa" w:w="1080"/>
+          </w:tcPr>
+          <w:p>
+            <w:r>
+              <w:rPr>
+                <w:sz w:val="18"/>
+              </w:rPr>
+              <w:t>—</w:t>
+            </w:r>
+          </w:p>
+        </w:tc>
+        <w:tc>
+          <w:tcPr>
+            <w:tcW w:type="dxa" w:w="1080"/>
+          </w:tcPr>
+          <w:p>
+            <w:r>
+              <w:rPr>
+                <w:sz w:val="18"/>
+              </w:rPr>
+              <w:t>Umgesetzt</w:t>
+            </w:r>
+          </w:p>
+        </w:tc>
+        <w:tc>
+          <w:tcPr>
+            <w:tcW w:type="dxa" w:w="1080"/>
+          </w:tcPr>
+          <w:p>
+            <w:r>
+              <w:rPr>
+                <w:sz w:val="18"/>
+              </w:rPr>
+              <w:t>QualityFlag-Typ mit optionalem id-Feld. Server-UUIDs bleiben erhalten.</w:t>
+            </w:r>
+          </w:p>
+        </w:tc>
+      </w:tr>
+      <w:tr>
+        <w:tc>
+          <w:tcPr>
+            <w:tcW w:type="dxa" w:w="1080"/>
+          </w:tcPr>
+          <w:p>
+            <w:r>
+              <w:rPr>
+                <w:sz w:val="18"/>
+              </w:rPr>
+              <w:t>156</w:t>
+            </w:r>
+          </w:p>
+        </w:tc>
+        <w:tc>
+          <w:tcPr>
+            <w:tcW w:type="dxa" w:w="1080"/>
+          </w:tcPr>
+          <w:p>
+            <w:r>
+              <w:rPr>
+                <w:sz w:val="18"/>
+              </w:rPr>
+              <w:t>v1.1</w:t>
+            </w:r>
+          </w:p>
+        </w:tc>
+        <w:tc>
+          <w:tcPr>
+            <w:tcW w:type="dxa" w:w="1080"/>
+          </w:tcPr>
+          <w:p>
+            <w:r>
+              <w:rPr>
+                <w:sz w:val="18"/>
+              </w:rPr>
+              <w:t>—</w:t>
+            </w:r>
+          </w:p>
+        </w:tc>
+        <w:tc>
+          <w:tcPr>
+            <w:tcW w:type="dxa" w:w="1080"/>
+          </w:tcPr>
+          <w:p>
+            <w:r>
+              <w:rPr>
+                <w:sz w:val="18"/>
+              </w:rPr>
+              <w:t>Zentren-API</w:t>
+            </w:r>
+          </w:p>
+        </w:tc>
+        <w:tc>
+          <w:tcPr>
+            <w:tcW w:type="dxa" w:w="1080"/>
+          </w:tcPr>
+          <w:p>
+            <w:r>
+              <w:rPr>
+                <w:sz w:val="18"/>
+              </w:rPr>
+              <w:t>—</w:t>
+            </w:r>
+          </w:p>
+        </w:tc>
+        <w:tc>
+          <w:tcPr>
+            <w:tcW w:type="dxa" w:w="1080"/>
+          </w:tcPr>
+          <w:p>
+            <w:r>
+              <w:rPr>
+                <w:sz w:val="18"/>
+              </w:rPr>
+              <w:t>—</w:t>
+            </w:r>
+          </w:p>
+        </w:tc>
+        <w:tc>
+          <w:tcPr>
+            <w:tcW w:type="dxa" w:w="1080"/>
+          </w:tcPr>
+          <w:p>
+            <w:r>
+              <w:rPr>
+                <w:sz w:val="18"/>
+              </w:rPr>
+              <w:t>Umgesetzt</w:t>
+            </w:r>
+          </w:p>
+        </w:tc>
+        <w:tc>
+          <w:tcPr>
+            <w:tcW w:type="dxa" w:w="1080"/>
+          </w:tcPr>
+          <w:p>
+            <w:r>
+              <w:rPr>
+                <w:sz w:val="18"/>
+              </w:rPr>
+              <w:t>GET /api/fhir/centers liefert Zentrenliste. Client laedt Kurzbezeichnungen vom Server.</w:t>
+            </w:r>
+          </w:p>
+        </w:tc>
+      </w:tr>
     </w:tbl>
     <w:p>
       <w:pPr>
@@ -16387,14 +18815,8 @@
             <w:tcW w:type="dxa" w:w="2880"/>
           </w:tcPr>
           <w:p>
-            <w:pPr>
-              <w:jc w:val="center"/>
-            </w:pPr>
-            <w:r>
-              <w:rPr>
-                <w:sz w:val="18"/>
-              </w:rPr>
-              <w:t>89</w:t>
+            <w:r>
+              <w:t>111</w:t>
             </w:r>
           </w:p>
         </w:tc>
@@ -16403,14 +18825,8 @@
             <w:tcW w:type="dxa" w:w="2880"/>
           </w:tcPr>
           <w:p>
-            <w:pPr>
-              <w:jc w:val="center"/>
-            </w:pPr>
-            <w:r>
-              <w:rPr>
-                <w:sz w:val="18"/>
-              </w:rPr>
-              <w:t>79%</w:t>
+            <w:r>
+              <w:t>87%</w:t>
             </w:r>
           </w:p>
         </w:tc>
@@ -16435,14 +18851,8 @@
             <w:tcW w:type="dxa" w:w="2880"/>
           </w:tcPr>
           <w:p>
-            <w:pPr>
-              <w:jc w:val="center"/>
-            </w:pPr>
-            <w:r>
-              <w:rPr>
-                <w:sz w:val="18"/>
-              </w:rPr>
-              <w:t>9</w:t>
+            <w:r>
+              <w:t>8</w:t>
             </w:r>
           </w:p>
         </w:tc>
@@ -16451,14 +18861,8 @@
             <w:tcW w:type="dxa" w:w="2880"/>
           </w:tcPr>
           <w:p>
-            <w:pPr>
-              <w:jc w:val="center"/>
-            </w:pPr>
-            <w:r>
-              <w:rPr>
-                <w:sz w:val="18"/>
-              </w:rPr>
-              <w:t>8%</w:t>
+            <w:r>
+              <w:t>7%</w:t>
             </w:r>
           </w:p>
         </w:tc>
@@ -16483,14 +18887,8 @@
             <w:tcW w:type="dxa" w:w="2880"/>
           </w:tcPr>
           <w:p>
-            <w:pPr>
-              <w:jc w:val="center"/>
-            </w:pPr>
-            <w:r>
-              <w:rPr>
-                <w:sz w:val="18"/>
-              </w:rPr>
-              <w:t>6</w:t>
+            <w:r>
+              <w:t>3</w:t>
             </w:r>
           </w:p>
         </w:tc>
@@ -16499,14 +18897,8 @@
             <w:tcW w:type="dxa" w:w="2880"/>
           </w:tcPr>
           <w:p>
-            <w:pPr>
-              <w:jc w:val="center"/>
-            </w:pPr>
-            <w:r>
-              <w:rPr>
-                <w:sz w:val="18"/>
-              </w:rPr>
-              <w:t>5%</w:t>
+            <w:r>
+              <w:t>3%</w:t>
             </w:r>
           </w:p>
         </w:tc>
@@ -16531,14 +18923,8 @@
             <w:tcW w:type="dxa" w:w="2880"/>
           </w:tcPr>
           <w:p>
-            <w:pPr>
-              <w:jc w:val="center"/>
-            </w:pPr>
-            <w:r>
-              <w:rPr>
-                <w:sz w:val="18"/>
-              </w:rPr>
-              <w:t>8</w:t>
+            <w:r>
+              <w:t>6</w:t>
             </w:r>
           </w:p>
         </w:tc>
@@ -16547,14 +18933,8 @@
             <w:tcW w:type="dxa" w:w="2880"/>
           </w:tcPr>
           <w:p>
-            <w:pPr>
-              <w:jc w:val="center"/>
-            </w:pPr>
-            <w:r>
-              <w:rPr>
-                <w:sz w:val="18"/>
-              </w:rPr>
-              <w:t>7%</w:t>
+            <w:r>
+              <w:t>5%</w:t>
             </w:r>
           </w:p>
         </w:tc>
@@ -16580,16 +18960,8 @@
             <w:tcW w:type="dxa" w:w="2880"/>
           </w:tcPr>
           <w:p>
-            <w:pPr>
-              <w:jc w:val="center"/>
-            </w:pPr>
-            <w:r/>
-            <w:r>
-              <w:rPr>
-                <w:b/>
-                <w:sz w:val="18"/>
-              </w:rPr>
-              <w:t>112</w:t>
+            <w:r>
+              <w:t>128</w:t>
             </w:r>
           </w:p>
         </w:tc>
@@ -16598,15 +18970,7 @@
             <w:tcW w:type="dxa" w:w="2880"/>
           </w:tcPr>
           <w:p>
-            <w:pPr>
-              <w:jc w:val="center"/>
-            </w:pPr>
-            <w:r/>
-            <w:r>
-              <w:rPr>
-                <w:b/>
-                <w:sz w:val="18"/>
-              </w:rPr>
+            <w:r>
               <w:t>100%</w:t>
             </w:r>
           </w:p>
@@ -16615,7 +18979,7 @@
     </w:tbl>
     <w:p>
       <w:r>
-        <w:t>Zusätzlich wurden 7 Features implementiert, die über die Lastenheft-Anforderungen hinausgehen. Darüber hinaus wurden heute 15 weitere Features durch AI-gestütztes Prompting hinzugefügt, davon 5 zur Schließung offener Lastenheft-Anforderungen (N05.19, N05.31, N05.32, N05.33, N05.35).</w:t>
+        <w:t>Zusätzlich wurden 7 Features implementiert, die über die Lastenheft-Anforderungen hinausgehen. Darüber hinaus wurden heute 15 weitere Features durch AI-gestütztes Prompting hinzugefügt, davon 5 zur Schließung offener Lastenheft-Anforderungen (N05.19, N05.31, N05.32, N05.33, N05.35). Im Rahmen von v1.1 wurden 22 weitere Features zur Frontend-Backend-Integration, Sicherheitshärtung und Architektur-Refactoring hinzugefügt (Nr. 135–156).</w:t>
       </w:r>
     </w:p>
     <w:p>
@@ -16693,6 +19057,148 @@
       </w:pPr>
       <w:r>
         <w:t>N05.35 (Must): Zusammenhänge zwischen Parametern — von „Teilweise" → „Umgesetzt"</w:t>
+      </w:r>
+    </w:p>
+    <w:p/>
+    <w:p>
+      <w:r>
+        <w:rPr>
+          <w:b/>
+          <w:sz w:val="22"/>
+        </w:rPr>
+        <w:t>Änderungen in Version 3.0 (v1.1 Frontend-Backend Integration, 11.04.2026)</w:t>
+      </w:r>
+    </w:p>
+    <w:p>
+      <w:pPr>
+        <w:pStyle w:val="ListBullet"/>
+      </w:pPr>
+      <w:r>
+        <w:t>Nr. 135–146: 12 neue v1.1 Features (Server-Auth, DataContext, Audit, Admin, FHIR, Security)</w:t>
+      </w:r>
+    </w:p>
+    <w:p>
+      <w:pPr>
+        <w:pStyle w:val="ListBullet"/>
+      </w:pPr>
+      <w:r>
+        <w:t>Login (K01): Jetzt serverseitige JWT-Authentifizierung via POST /api/auth/login</w:t>
+      </w:r>
+    </w:p>
+    <w:p>
+      <w:pPr>
+        <w:pStyle w:val="ListBullet"/>
+      </w:pPr>
+      <w:r>
+        <w:t>Audit: Client-seitige localStorage-Implementierung durch serverseitige SQLite (auditMiddleware) ersetzt</w:t>
+      </w:r>
+    </w:p>
+    <w:p>
+      <w:pPr>
+        <w:pStyle w:val="ListBullet"/>
+      </w:pPr>
+      <w:r>
+        <w:t>settings.yaml nach config/ verschoben (nicht mehr im Webroot abrufbar)</w:t>
+      </w:r>
+    </w:p>
+    <w:p>
+      <w:pPr>
+        <w:pStyle w:val="ListBullet"/>
+      </w:pPr>
+      <w:r>
+        <w:t>FHIR-Daten nur über authentifizierten API-Endpunkt zugänglich</w:t>
+      </w:r>
+    </w:p>
+    <w:p>
+      <w:pPr>
+        <w:pStyle w:val="ListBullet"/>
+      </w:pPr>
+      <w:r>
+        <w:t>Center-Liste konfigurierbar über data/centers.json</w:t>
+      </w:r>
+    </w:p>
+    <w:p>
+      <w:pPr>
+        <w:pStyle w:val="ListBullet"/>
+      </w:pPr>
+      <w:r>
+        <w:t>Zusammenfassung: 101 umgesetzt (85%), 8 teilweise, 3 abweichend, 6 nicht umgesetzt</w:t>
+      </w:r>
+    </w:p>
+    <w:p/>
+    <w:p>
+      <w:r>
+        <w:rPr>
+          <w:b/>
+          <w:sz w:val="22"/>
+        </w:rPr>
+        <w:t>Änderungen in Version 3.1 (Security Review Fixes, 11.04.2026)</w:t>
+      </w:r>
+    </w:p>
+    <w:p>
+      <w:pPr>
+        <w:pStyle w:val="ListBullet"/>
+      </w:pPr>
+      <w:r>
+        <w:t>Nr. 147–156: 10 weitere Security-Review-Fixes (helmet, Audit-Scoping, FHIR-Proxy, bcrypt async, etc.)</w:t>
+      </w:r>
+    </w:p>
+    <w:p>
+      <w:pPr>
+        <w:pStyle w:val="ListBullet"/>
+      </w:pPr>
+      <w:r>
+        <w:t>Zusammenfassung: 111 umgesetzt (87%), 8 teilweise, 3 abweichend, 6 nicht umgesetzt</w:t>
+      </w:r>
+    </w:p>
+    <w:p>
+      <w:pPr>
+        <w:pStyle w:val="ListBullet"/>
+      </w:pPr>
+      <w:r>
+        <w:t>Express Router Refactoring: Code-Duplizierung zwischen Produktion und Entwicklung eliminiert</w:t>
+      </w:r>
+    </w:p>
+    <w:p>
+      <w:pPr>
+        <w:pStyle w:val="ListBullet"/>
+      </w:pPr>
+      <w:r>
+        <w:t>Zentren-API: GET /api/fhir/centers — Client laedt Kurzbezeichnungen vom Server statt hardcoded</w:t>
+      </w:r>
+    </w:p>
+    <w:p/>
+    <w:p>
+      <w:r>
+        <w:rPr>
+          <w:b/>
+          <w:sz w:val="22"/>
+        </w:rPr>
+        <w:t>Aenderungen in Version 3.2 (Pflichtenheft-Aktualisierung, 11.04.2026)</w:t>
+      </w:r>
+    </w:p>
+    <w:p>
+      <w:pPr>
+        <w:pStyle w:val="ListBullet"/>
+      </w:pPr>
+      <w:r>
+        <w:t>F-11: Pflichtenheft Abschnitt 3.2.2 aktualisiert — 6-Rollen-Modell statt "einheitliche Nutzerrolle"</w:t>
+      </w:r>
+    </w:p>
+    <w:p>
+      <w:pPr>
+        <w:pStyle w:val="ListBullet"/>
+      </w:pPr>
+      <w:r>
+        <w:t>F-34: Pflichtenheft Berechtigungskonzept (5.2) aktualisiert — 6x4 Berechtigungsmatrix mit Zentrenzuordnung</w:t>
+      </w:r>
+    </w:p>
+    <w:p>
+      <w:pPr>
+        <w:pStyle w:val="ListBullet"/>
+      </w:pPr>
+      <w:r>
+        <w:t>N10.01: Bemerkung aktualisiert — differenziertes Rollenmodell mit 6 Rollen</w:t>
       </w:r>
     </w:p>
     <w:sectPr>

</xml_diff>